<commit_message>
changes of connection summary doc and dataset questions
</commit_message>
<xml_diff>
--- a/Documents/Dataset_Question.docx
+++ b/Documents/Dataset_Question.docx
@@ -3,65 +3,634 @@
 <w:document xmlns:wpc="http://schemas.microsoft.com/office/word/2010/wordprocessingCanvas" xmlns:cx="http://schemas.microsoft.com/office/drawing/2014/chartex" xmlns:cx1="http://schemas.microsoft.com/office/drawing/2015/9/8/chartex" xmlns:cx2="http://schemas.microsoft.com/office/drawing/2015/10/21/chartex" xmlns:cx3="http://schemas.microsoft.com/office/drawing/2016/5/9/chartex" xmlns:cx4="http://schemas.microsoft.com/office/drawing/2016/5/10/chartex" xmlns:cx5="http://schemas.microsoft.com/office/drawing/2016/5/11/chartex" xmlns:cx6="http://schemas.microsoft.com/office/drawing/2016/5/12/chartex" xmlns:cx7="http://schemas.microsoft.com/office/drawing/2016/5/13/chartex" xmlns:cx8="http://schemas.microsoft.com/office/drawing/2016/5/14/chartex" xmlns:mc="http://schemas.openxmlformats.org/markup-compatibility/2006" xmlns:aink="http://schemas.microsoft.com/office/drawing/2016/ink" xmlns:am3d="http://schemas.microsoft.com/office/drawing/2017/model3d" xmlns:o="urn:schemas-microsoft-com:office:office" xmlns:oel="http://schemas.microsoft.com/office/2019/extlst" xmlns:r="http://schemas.openxmlformats.org/officeDocument/2006/relationships" xmlns:m="http://schemas.openxmlformats.org/officeDocument/2006/math" xmlns:v="urn:schemas-microsoft-com:vml" xmlns:wp14="http://schemas.microsoft.com/office/word/2010/wordprocessingDrawing" xmlns:wp="http://schemas.openxmlformats.org/drawingml/2006/wordprocessingDrawing" xmlns:w10="urn:schemas-microsoft-com:office:word" xmlns:w="http://schemas.openxmlformats.org/wordprocessingml/2006/main" xmlns:w14="http://schemas.microsoft.com/office/word/2010/wordml" xmlns:w15="http://schemas.microsoft.com/office/word/2012/wordml" xmlns:w16cex="http://schemas.microsoft.com/office/word/2018/wordml/cex" xmlns:w16cid="http://schemas.microsoft.com/office/word/2016/wordml/cid" xmlns:w16="http://schemas.microsoft.com/office/word/2018/wordml" xmlns:w16du="http://schemas.microsoft.com/office/word/2023/wordml/word16du" xmlns:w16sdtdh="http://schemas.microsoft.com/office/word/2020/wordml/sdtdatahash" xmlns:w16sdtfl="http://schemas.microsoft.com/office/word/2024/wordml/sdtformatlock" xmlns:w16se="http://schemas.microsoft.com/office/word/2015/wordml/symex" xmlns:wpg="http://schemas.microsoft.com/office/word/2010/wordprocessingGroup" xmlns:wpi="http://schemas.microsoft.com/office/word/2010/wordprocessingInk" xmlns:wne="http://schemas.microsoft.com/office/word/2006/wordml" xmlns:wps="http://schemas.microsoft.com/office/word/2010/wordprocessingShape" mc:Ignorable="w14 w15 w16se w16cid w16 w16cex w16sdtdh w16sdtfl w16du wp14">
   <w:body>
     <w:p>
-      <w:r>
-        <w:t>Number of stages of paddy?</w:t>
+      <w:pPr>
+        <w:rPr>
+          <w:b/>
+          <w:bCs/>
+        </w:rPr>
+      </w:pPr>
+      <w:r>
+        <w:rPr>
+          <w:b/>
+          <w:bCs/>
+        </w:rPr>
+        <w:t>Section 1: Soil Moisture Requirements</w:t>
       </w:r>
     </w:p>
     <w:p>
       <w:r>
-        <w:t>Minimum and maximum water level for each crop stage?</w:t>
-      </w:r>
-      <w:r>
-        <w:br/>
-      </w:r>
-      <w:r>
-        <w:t>How many days typically does each crop stage last in paddy cultivation?</w:t>
-      </w:r>
-    </w:p>
-    <w:p/>
-    <w:p/>
-    <w:p>
-      <w:r>
-        <w:t>How much time the rainfall should be predicted?</w:t>
-      </w:r>
-    </w:p>
-    <w:p/>
-    <w:p/>
-    <w:p>
-      <w:r>
-        <w:t>On hot, sunny days (high temperature), does the crop need more water than usual? How much more (as a percentage)?</w:t>
+        <w:rPr>
+          <w:b/>
+          <w:bCs/>
+        </w:rPr>
+        <w:t>Questions about soil moisture levels for different crop stages:</w:t>
       </w:r>
     </w:p>
     <w:p>
-      <w:r>
-        <w:t>On cooler, cloudy days, does the crop need less water? How much less (as a percentage)?</w:t>
+      <w:pPr>
+        <w:numPr>
+          <w:ilvl w:val="0"/>
+          <w:numId w:val="16"/>
+        </w:numPr>
+      </w:pPr>
+      <w:r>
+        <w:t>For the </w:t>
+      </w:r>
+      <w:r>
+        <w:rPr>
+          <w:b/>
+          <w:bCs/>
+        </w:rPr>
+        <w:t>seedling stage</w:t>
+      </w:r>
+      <w:r>
+        <w:t> (first 10-20 days after planting), what is the ideal soil moisture level? What is the minimum and maximum acceptable level?</w:t>
       </w:r>
     </w:p>
     <w:p>
-      <w:r>
-        <w:t>During which crop stage does the plant lose the most water through its leaves?</w:t>
+      <w:pPr>
+        <w:numPr>
+          <w:ilvl w:val="0"/>
+          <w:numId w:val="16"/>
+        </w:numPr>
+      </w:pPr>
+      <w:r>
+        <w:t>For the </w:t>
+      </w:r>
+      <w:r>
+        <w:rPr>
+          <w:b/>
+          <w:bCs/>
+        </w:rPr>
+        <w:t>tillering stage</w:t>
+      </w:r>
+      <w:r>
+        <w:t> (when rice plants start forming side shoots), what is the ideal soil moisture level? What are the minimum and maximum acceptable levels?</w:t>
       </w:r>
     </w:p>
     <w:p>
-      <w:r>
-        <w:t>What temperature range is considered "normal" for paddy cultivation in your region? What is "hot" and what is "cold"?</w:t>
-      </w:r>
-    </w:p>
-    <w:p/>
-    <w:p/>
-    <w:p>
-      <w:r>
-        <w:t>If the tank water level is low and soil moisture is decreasing, which crop stage should receive priority for irrigation?</w:t>
+      <w:pPr>
+        <w:numPr>
+          <w:ilvl w:val="0"/>
+          <w:numId w:val="16"/>
+        </w:numPr>
+      </w:pPr>
+      <w:r>
+        <w:t>For the </w:t>
+      </w:r>
+      <w:r>
+        <w:rPr>
+          <w:b/>
+          <w:bCs/>
+        </w:rPr>
+        <w:t>vegetative growth stage</w:t>
+      </w:r>
+      <w:r>
+        <w:t> (active leaf and stem growth), what is the ideal soil moisture level? What are the minimum and maximum acceptable levels?</w:t>
       </w:r>
     </w:p>
     <w:p>
-      <w:r>
-        <w:t>What is the maximum amount of water that should be added in a single irrigation event to avoid flooding?</w:t>
+      <w:pPr>
+        <w:numPr>
+          <w:ilvl w:val="0"/>
+          <w:numId w:val="16"/>
+        </w:numPr>
+      </w:pPr>
+      <w:r>
+        <w:t>For the </w:t>
+      </w:r>
+      <w:r>
+        <w:rPr>
+          <w:b/>
+          <w:bCs/>
+        </w:rPr>
+        <w:t>reproductive stage</w:t>
+      </w:r>
+      <w:r>
+        <w:t> (flowering and grain formation), what is the ideal soil moisture level? What are the minimum and maximum acceptable levels?</w:t>
       </w:r>
     </w:p>
     <w:p>
+      <w:pPr>
+        <w:numPr>
+          <w:ilvl w:val="0"/>
+          <w:numId w:val="16"/>
+        </w:numPr>
+      </w:pPr>
+      <w:r>
+        <w:t>For the </w:t>
+      </w:r>
+      <w:r>
+        <w:rPr>
+          <w:b/>
+          <w:bCs/>
+        </w:rPr>
+        <w:t>ripening stage</w:t>
+      </w:r>
+      <w:r>
+        <w:t> (grain maturation), what is the ideal soil moisture level? What are the minimum and maximum acceptable levels?</w:t>
+      </w:r>
+    </w:p>
+    <w:p>
+      <w:pPr>
+        <w:numPr>
+          <w:ilvl w:val="0"/>
+          <w:numId w:val="16"/>
+        </w:numPr>
+      </w:pPr>
+      <w:r>
+        <w:t>At what soil moisture level should we consider the crop to be under water stress (too dry)?</w:t>
+      </w:r>
+    </w:p>
+    <w:p>
+      <w:pPr>
+        <w:numPr>
+          <w:ilvl w:val="0"/>
+          <w:numId w:val="16"/>
+        </w:numPr>
+      </w:pPr>
+      <w:r>
+        <w:t>At what soil moisture level is there too much water that could harm the crop?</w:t>
+      </w:r>
+    </w:p>
+    <w:p>
+      <w:pPr>
+        <w:rPr>
+          <w:b/>
+          <w:bCs/>
+        </w:rPr>
+      </w:pPr>
+      <w:r>
+        <w:rPr>
+          <w:b/>
+          <w:bCs/>
+        </w:rPr>
+        <w:t>Section 2: Crop Growth Stages</w:t>
+      </w:r>
+    </w:p>
+    <w:p>
+      <w:r>
+        <w:rPr>
+          <w:b/>
+          <w:bCs/>
+        </w:rPr>
+        <w:t>Questions to understand crop development:</w:t>
+      </w:r>
+    </w:p>
+    <w:p>
+      <w:pPr>
+        <w:numPr>
+          <w:ilvl w:val="0"/>
+          <w:numId w:val="17"/>
+        </w:numPr>
+      </w:pPr>
+      <w:r>
+        <w:t>How many days typically does each crop stage last in paddy cultivation?</w:t>
+      </w:r>
+    </w:p>
+    <w:p>
+      <w:pPr>
+        <w:numPr>
+          <w:ilvl w:val="1"/>
+          <w:numId w:val="17"/>
+        </w:numPr>
+      </w:pPr>
+      <w:r>
+        <w:t>Seedling stage: ___ days</w:t>
+      </w:r>
+    </w:p>
+    <w:p>
+      <w:pPr>
+        <w:numPr>
+          <w:ilvl w:val="1"/>
+          <w:numId w:val="17"/>
+        </w:numPr>
+      </w:pPr>
+      <w:r>
+        <w:t>Tillering stage: ___ days</w:t>
+      </w:r>
+    </w:p>
+    <w:p>
+      <w:pPr>
+        <w:numPr>
+          <w:ilvl w:val="1"/>
+          <w:numId w:val="17"/>
+        </w:numPr>
+      </w:pPr>
+      <w:r>
+        <w:t>Vegetative stage: ___ days</w:t>
+      </w:r>
+    </w:p>
+    <w:p>
+      <w:pPr>
+        <w:numPr>
+          <w:ilvl w:val="1"/>
+          <w:numId w:val="17"/>
+        </w:numPr>
+      </w:pPr>
+      <w:r>
+        <w:t>Reproductive stage: ___ days</w:t>
+      </w:r>
+    </w:p>
+    <w:p>
+      <w:pPr>
+        <w:numPr>
+          <w:ilvl w:val="1"/>
+          <w:numId w:val="17"/>
+        </w:numPr>
+      </w:pPr>
+      <w:r>
+        <w:t>Ripening stage: ___ days</w:t>
+      </w:r>
+    </w:p>
+    <w:p>
+      <w:pPr>
+        <w:rPr>
+          <w:b/>
+          <w:bCs/>
+        </w:rPr>
+      </w:pPr>
+      <w:r>
+        <w:rPr>
+          <w:b/>
+          <w:bCs/>
+        </w:rPr>
+        <w:t>Section 3: Water Requirements and Tank Levels</w:t>
+      </w:r>
+    </w:p>
+    <w:p>
+      <w:r>
+        <w:rPr>
+          <w:b/>
+          <w:bCs/>
+        </w:rPr>
+        <w:t>Questions about water availability and usage:</w:t>
+      </w:r>
+    </w:p>
+    <w:p>
+      <w:pPr>
+        <w:pStyle w:val="ListParagraph"/>
+        <w:numPr>
+          <w:ilvl w:val="0"/>
+          <w:numId w:val="17"/>
+        </w:numPr>
+      </w:pPr>
+      <w:r>
+        <w:t>What is the minimum water level required in the tank to safely irrigate the paddy field?</w:t>
+      </w:r>
+    </w:p>
+    <w:p>
+      <w:pPr>
+        <w:numPr>
+          <w:ilvl w:val="0"/>
+          <w:numId w:val="17"/>
+        </w:numPr>
+      </w:pPr>
+      <w:r>
+        <w:lastRenderedPageBreak/>
+        <w:t>How much water (in liters or cubic meters) is typically needed per square meter of paddy field for each crop stage?</w:t>
+      </w:r>
+    </w:p>
+    <w:p>
+      <w:pPr>
+        <w:numPr>
+          <w:ilvl w:val="0"/>
+          <w:numId w:val="17"/>
+        </w:numPr>
+      </w:pPr>
+      <w:r>
+        <w:t>If the tank water level is low, should irrigation be reduced or stopped at certain crop stages? Which stages are most critical?</w:t>
+      </w:r>
+    </w:p>
+    <w:p>
+      <w:pPr>
+        <w:rPr>
+          <w:b/>
+          <w:bCs/>
+        </w:rPr>
+      </w:pPr>
+      <w:r>
+        <w:rPr>
+          <w:b/>
+          <w:bCs/>
+        </w:rPr>
+        <w:t>Section 4: Rainfall Impact</w:t>
+      </w:r>
+    </w:p>
+    <w:p>
+      <w:pPr>
+        <w:rPr>
+          <w:b/>
+          <w:bCs/>
+        </w:rPr>
+      </w:pPr>
+      <w:r>
+        <w:rPr>
+          <w:b/>
+          <w:bCs/>
+        </w:rPr>
+        <w:t>Questions about rainfall and irrigation decisions:</w:t>
+      </w:r>
+    </w:p>
+    <w:p>
+      <w:pPr>
+        <w:pStyle w:val="ListParagraph"/>
+        <w:numPr>
+          <w:ilvl w:val="0"/>
+          <w:numId w:val="17"/>
+        </w:numPr>
+      </w:pPr>
+      <w:r>
+        <w:t>For how long in advance should we predict rainfall to make irrigation decisions? (For example: next 6 hours, next 12 hours, next 24 hours, or next 48 hours)</w:t>
+      </w:r>
+    </w:p>
+    <w:p>
+      <w:pPr>
+        <w:numPr>
+          <w:ilvl w:val="0"/>
+          <w:numId w:val="17"/>
+        </w:numPr>
+      </w:pPr>
+      <w:r>
+        <w:t>If rainfall is predicted for the duration mentioned above, at what rainfall amount (in millimeters) should we reduce or skip irrigation?</w:t>
+      </w:r>
+    </w:p>
+    <w:p>
+      <w:pPr>
+        <w:numPr>
+          <w:ilvl w:val="0"/>
+          <w:numId w:val="17"/>
+        </w:numPr>
+      </w:pPr>
+      <w:r>
+        <w:t>Can too much rainfall harm the crop at certain stages? Which stages are most sensitive?</w:t>
+      </w:r>
+    </w:p>
+    <w:p>
+      <w:pPr>
+        <w:rPr>
+          <w:b/>
+          <w:bCs/>
+        </w:rPr>
+      </w:pPr>
+      <w:r>
+        <w:rPr>
+          <w:b/>
+          <w:bCs/>
+        </w:rPr>
+        <w:t>Section 5: Evapotranspiration (Water Loss)</w:t>
+      </w:r>
+    </w:p>
+    <w:p>
+      <w:r>
+        <w:rPr>
+          <w:b/>
+          <w:bCs/>
+        </w:rPr>
+        <w:t>Questions about water loss from plants and soil:</w:t>
+      </w:r>
+    </w:p>
+    <w:p>
+      <w:pPr>
+        <w:pStyle w:val="ListParagraph"/>
+        <w:numPr>
+          <w:ilvl w:val="0"/>
+          <w:numId w:val="17"/>
+        </w:numPr>
+      </w:pPr>
+      <w:r>
+        <w:t>On hot, sunny days (high temperature), does the crop need more water than usual? How much more (as a percentage)?</w:t>
+      </w:r>
+    </w:p>
+    <w:p>
+      <w:pPr>
+        <w:numPr>
+          <w:ilvl w:val="0"/>
+          <w:numId w:val="17"/>
+        </w:numPr>
+      </w:pPr>
+      <w:r>
+        <w:t>On cooler, cloudy days, does the crop need less water? How much less (as a percentage)?</w:t>
+      </w:r>
+    </w:p>
+    <w:p>
+      <w:pPr>
+        <w:numPr>
+          <w:ilvl w:val="0"/>
+          <w:numId w:val="17"/>
+        </w:numPr>
+      </w:pPr>
+      <w:r>
+        <w:t>During which crop stage does the plant lose the most water through its leaves?</w:t>
+      </w:r>
+    </w:p>
+    <w:p>
+      <w:pPr>
+        <w:numPr>
+          <w:ilvl w:val="0"/>
+          <w:numId w:val="17"/>
+        </w:numPr>
+      </w:pPr>
+      <w:r>
+        <w:t xml:space="preserve">What </w:t>
+      </w:r>
+      <w:r>
+        <w:t>evapotranspiration</w:t>
+      </w:r>
+      <w:r>
+        <w:t xml:space="preserve"> range</w:t>
+      </w:r>
+      <w:r>
+        <w:t>(in mm)</w:t>
+      </w:r>
+      <w:r>
+        <w:t xml:space="preserve"> is considered "normal" for paddy cultivation in your region? What is "hot" and what is "cold"?</w:t>
+      </w:r>
+    </w:p>
+    <w:p>
+      <w:pPr>
+        <w:rPr>
+          <w:b/>
+          <w:bCs/>
+        </w:rPr>
+      </w:pPr>
+      <w:r>
+        <w:rPr>
+          <w:b/>
+          <w:bCs/>
+        </w:rPr>
+        <w:t>Section 6: Decision Rules for Irrigation</w:t>
+      </w:r>
+    </w:p>
+    <w:p>
+      <w:r>
+        <w:rPr>
+          <w:b/>
+          <w:bCs/>
+        </w:rPr>
+        <w:t>Questions about when and how much to irrigate:</w:t>
+      </w:r>
+    </w:p>
+    <w:p>
+      <w:pPr>
+        <w:pStyle w:val="ListParagraph"/>
+        <w:numPr>
+          <w:ilvl w:val="0"/>
+          <w:numId w:val="17"/>
+        </w:numPr>
+      </w:pPr>
+      <w:r>
+        <w:t>If soil moisture is below the ideal level, but rain is expected tomorrow, should we still irrigate today? What factors help make this decision?</w:t>
+      </w:r>
+    </w:p>
+    <w:p>
+      <w:pPr>
+        <w:numPr>
+          <w:ilvl w:val="0"/>
+          <w:numId w:val="17"/>
+        </w:numPr>
+      </w:pPr>
+      <w:r>
+        <w:t>If the tank water level is low and soil moisture is decreasing, which crop stage should receive priority for irrigation?</w:t>
+      </w:r>
+    </w:p>
+    <w:p>
+      <w:pPr>
+        <w:numPr>
+          <w:ilvl w:val="0"/>
+          <w:numId w:val="17"/>
+        </w:numPr>
+      </w:pPr>
+      <w:r>
+        <w:t>If soil moisture is adequate but evapotranspiration is high (hot day), should we add extra water as a precaution?</w:t>
+      </w:r>
+    </w:p>
+    <w:p>
+      <w:pPr>
+        <w:numPr>
+          <w:ilvl w:val="0"/>
+          <w:numId w:val="17"/>
+        </w:numPr>
+      </w:pPr>
+      <w:r>
+        <w:lastRenderedPageBreak/>
+        <w:t>What is the maximum amount of water that should be added in a single irrigation event to avoid flooding?</w:t>
+      </w:r>
+    </w:p>
+    <w:p>
+      <w:pPr>
+        <w:numPr>
+          <w:ilvl w:val="0"/>
+          <w:numId w:val="17"/>
+        </w:numPr>
+      </w:pPr>
       <w:r>
         <w:t>Should irrigation be done at a specific time of day? Does morning vs. evening irrigation make a difference?</w:t>
+      </w:r>
+    </w:p>
+    <w:p>
+      <w:pPr>
+        <w:rPr>
+          <w:b/>
+          <w:bCs/>
+        </w:rPr>
+      </w:pPr>
+      <w:r>
+        <w:rPr>
+          <w:b/>
+          <w:bCs/>
+        </w:rPr>
+        <w:t>Section 9: Local Practices and Experience</w:t>
+      </w:r>
+    </w:p>
+    <w:p>
+      <w:r>
+        <w:rPr>
+          <w:b/>
+          <w:bCs/>
+        </w:rPr>
+        <w:t>Questions about practical knowledge:</w:t>
+      </w:r>
+    </w:p>
+    <w:p>
+      <w:pPr>
+        <w:pStyle w:val="ListParagraph"/>
+        <w:numPr>
+          <w:ilvl w:val="0"/>
+          <w:numId w:val="17"/>
+        </w:numPr>
+      </w:pPr>
+      <w:r>
+        <w:t>Based on your experience, what are the most common mistakes farmers make regarding irrigation timing?</w:t>
+      </w:r>
+    </w:p>
+    <w:p>
+      <w:pPr>
+        <w:numPr>
+          <w:ilvl w:val="0"/>
+          <w:numId w:val="17"/>
+        </w:numPr>
+      </w:pPr>
+      <w:r>
+        <w:t>What early warning signs indicate that a paddy field is getting too dry or too wet?</w:t>
+      </w:r>
+    </w:p>
+    <w:p>
+      <w:pPr>
+        <w:numPr>
+          <w:ilvl w:val="0"/>
+          <w:numId w:val="17"/>
+        </w:numPr>
+      </w:pPr>
+      <w:r>
+        <w:t>In your region, how often (how many times per week) is irrigation typically needed during each crop stage under normal weather conditions?</w:t>
+      </w:r>
+    </w:p>
+    <w:p>
+      <w:pPr>
+        <w:numPr>
+          <w:ilvl w:val="0"/>
+          <w:numId w:val="17"/>
+        </w:numPr>
+      </w:pPr>
+      <w:r>
+        <w:t>Are there traditional methods or rules of thumb that experienced farmers use to decide when to irrigate?</w:t>
+      </w:r>
+    </w:p>
+    <w:p>
+      <w:pPr>
+        <w:rPr>
+          <w:b/>
+          <w:bCs/>
+        </w:rPr>
+      </w:pPr>
+      <w:r>
+        <w:rPr>
+          <w:b/>
+          <w:bCs/>
+        </w:rPr>
+        <w:t>Section 10: Output Expectations</w:t>
+      </w:r>
+    </w:p>
+    <w:p>
+      <w:r>
+        <w:rPr>
+          <w:b/>
+          <w:bCs/>
+        </w:rPr>
+        <w:t>Questions about the CWR prediction:</w:t>
+      </w:r>
+    </w:p>
+    <w:p>
+      <w:pPr>
+        <w:pStyle w:val="ListParagraph"/>
+        <w:numPr>
+          <w:ilvl w:val="0"/>
+          <w:numId w:val="17"/>
+        </w:numPr>
+      </w:pPr>
+      <w:r>
+        <w:t>In your expert opinion, how would you rate the potential effectiveness of this system for paddy cultivation? (Please rate on a scale of 1-5, where 1 = Not effective, 5 = Very effective)</w:t>
       </w:r>
     </w:p>
     <w:p/>
@@ -80,6 +649,914 @@
 <file path=word/numbering.xml><?xml version="1.0" encoding="utf-8"?>
 <w:numbering xmlns:wpc="http://schemas.microsoft.com/office/word/2010/wordprocessingCanvas" xmlns:cx="http://schemas.microsoft.com/office/drawing/2014/chartex" xmlns:cx1="http://schemas.microsoft.com/office/drawing/2015/9/8/chartex" xmlns:cx2="http://schemas.microsoft.com/office/drawing/2015/10/21/chartex" xmlns:cx3="http://schemas.microsoft.com/office/drawing/2016/5/9/chartex" xmlns:cx4="http://schemas.microsoft.com/office/drawing/2016/5/10/chartex" xmlns:cx5="http://schemas.microsoft.com/office/drawing/2016/5/11/chartex" xmlns:cx6="http://schemas.microsoft.com/office/drawing/2016/5/12/chartex" xmlns:cx7="http://schemas.microsoft.com/office/drawing/2016/5/13/chartex" xmlns:cx8="http://schemas.microsoft.com/office/drawing/2016/5/14/chartex" xmlns:mc="http://schemas.openxmlformats.org/markup-compatibility/2006" xmlns:aink="http://schemas.microsoft.com/office/drawing/2016/ink" xmlns:am3d="http://schemas.microsoft.com/office/drawing/2017/model3d" xmlns:o="urn:schemas-microsoft-com:office:office" xmlns:oel="http://schemas.microsoft.com/office/2019/extlst" xmlns:r="http://schemas.openxmlformats.org/officeDocument/2006/relationships" xmlns:m="http://schemas.openxmlformats.org/officeDocument/2006/math" xmlns:v="urn:schemas-microsoft-com:vml" xmlns:wp14="http://schemas.microsoft.com/office/word/2010/wordprocessingDrawing" xmlns:wp="http://schemas.openxmlformats.org/drawingml/2006/wordprocessingDrawing" xmlns:w10="urn:schemas-microsoft-com:office:word" xmlns:w="http://schemas.openxmlformats.org/wordprocessingml/2006/main" xmlns:w14="http://schemas.microsoft.com/office/word/2010/wordml" xmlns:w15="http://schemas.microsoft.com/office/word/2012/wordml" xmlns:w16cex="http://schemas.microsoft.com/office/word/2018/wordml/cex" xmlns:w16cid="http://schemas.microsoft.com/office/word/2016/wordml/cid" xmlns:w16="http://schemas.microsoft.com/office/word/2018/wordml" xmlns:w16du="http://schemas.microsoft.com/office/word/2023/wordml/word16du" xmlns:w16sdtdh="http://schemas.microsoft.com/office/word/2020/wordml/sdtdatahash" xmlns:w16sdtfl="http://schemas.microsoft.com/office/word/2024/wordml/sdtformatlock" xmlns:w16se="http://schemas.microsoft.com/office/word/2015/wordml/symex" xmlns:wpg="http://schemas.microsoft.com/office/word/2010/wordprocessingGroup" xmlns:wpi="http://schemas.microsoft.com/office/word/2010/wordprocessingInk" xmlns:wne="http://schemas.microsoft.com/office/word/2006/wordml" xmlns:wps="http://schemas.microsoft.com/office/word/2010/wordprocessingShape" mc:Ignorable="w14 w15 w16se w16cid w16 w16cex w16sdtdh w16sdtfl w16du wp14">
   <w:abstractNum w:abstractNumId="0" w15:restartNumberingAfterBreak="0">
+    <w:nsid w:val="083D47F4"/>
+    <w:multiLevelType w:val="multilevel"/>
+    <w:tmpl w:val="2EA60DC2"/>
+    <w:lvl w:ilvl="0">
+      <w:start w:val="35"/>
+      <w:numFmt w:val="decimal"/>
+      <w:lvlText w:val="%1."/>
+      <w:lvlJc w:val="left"/>
+      <w:pPr>
+        <w:tabs>
+          <w:tab w:val="num" w:pos="720"/>
+        </w:tabs>
+        <w:ind w:left="720" w:hanging="360"/>
+      </w:pPr>
+    </w:lvl>
+    <w:lvl w:ilvl="1" w:tentative="1">
+      <w:start w:val="1"/>
+      <w:numFmt w:val="decimal"/>
+      <w:lvlText w:val="%2."/>
+      <w:lvlJc w:val="left"/>
+      <w:pPr>
+        <w:tabs>
+          <w:tab w:val="num" w:pos="1440"/>
+        </w:tabs>
+        <w:ind w:left="1440" w:hanging="360"/>
+      </w:pPr>
+    </w:lvl>
+    <w:lvl w:ilvl="2" w:tentative="1">
+      <w:start w:val="1"/>
+      <w:numFmt w:val="decimal"/>
+      <w:lvlText w:val="%3."/>
+      <w:lvlJc w:val="left"/>
+      <w:pPr>
+        <w:tabs>
+          <w:tab w:val="num" w:pos="2160"/>
+        </w:tabs>
+        <w:ind w:left="2160" w:hanging="360"/>
+      </w:pPr>
+    </w:lvl>
+    <w:lvl w:ilvl="3" w:tentative="1">
+      <w:start w:val="1"/>
+      <w:numFmt w:val="decimal"/>
+      <w:lvlText w:val="%4."/>
+      <w:lvlJc w:val="left"/>
+      <w:pPr>
+        <w:tabs>
+          <w:tab w:val="num" w:pos="2880"/>
+        </w:tabs>
+        <w:ind w:left="2880" w:hanging="360"/>
+      </w:pPr>
+    </w:lvl>
+    <w:lvl w:ilvl="4" w:tentative="1">
+      <w:start w:val="1"/>
+      <w:numFmt w:val="decimal"/>
+      <w:lvlText w:val="%5."/>
+      <w:lvlJc w:val="left"/>
+      <w:pPr>
+        <w:tabs>
+          <w:tab w:val="num" w:pos="3600"/>
+        </w:tabs>
+        <w:ind w:left="3600" w:hanging="360"/>
+      </w:pPr>
+    </w:lvl>
+    <w:lvl w:ilvl="5" w:tentative="1">
+      <w:start w:val="1"/>
+      <w:numFmt w:val="decimal"/>
+      <w:lvlText w:val="%6."/>
+      <w:lvlJc w:val="left"/>
+      <w:pPr>
+        <w:tabs>
+          <w:tab w:val="num" w:pos="4320"/>
+        </w:tabs>
+        <w:ind w:left="4320" w:hanging="360"/>
+      </w:pPr>
+    </w:lvl>
+    <w:lvl w:ilvl="6" w:tentative="1">
+      <w:start w:val="1"/>
+      <w:numFmt w:val="decimal"/>
+      <w:lvlText w:val="%7."/>
+      <w:lvlJc w:val="left"/>
+      <w:pPr>
+        <w:tabs>
+          <w:tab w:val="num" w:pos="5040"/>
+        </w:tabs>
+        <w:ind w:left="5040" w:hanging="360"/>
+      </w:pPr>
+    </w:lvl>
+    <w:lvl w:ilvl="7" w:tentative="1">
+      <w:start w:val="1"/>
+      <w:numFmt w:val="decimal"/>
+      <w:lvlText w:val="%8."/>
+      <w:lvlJc w:val="left"/>
+      <w:pPr>
+        <w:tabs>
+          <w:tab w:val="num" w:pos="5760"/>
+        </w:tabs>
+        <w:ind w:left="5760" w:hanging="360"/>
+      </w:pPr>
+    </w:lvl>
+    <w:lvl w:ilvl="8" w:tentative="1">
+      <w:start w:val="1"/>
+      <w:numFmt w:val="decimal"/>
+      <w:lvlText w:val="%9."/>
+      <w:lvlJc w:val="left"/>
+      <w:pPr>
+        <w:tabs>
+          <w:tab w:val="num" w:pos="6480"/>
+        </w:tabs>
+        <w:ind w:left="6480" w:hanging="360"/>
+      </w:pPr>
+    </w:lvl>
+  </w:abstractNum>
+  <w:abstractNum w:abstractNumId="1" w15:restartNumberingAfterBreak="0">
+    <w:nsid w:val="0CAD6F68"/>
+    <w:multiLevelType w:val="multilevel"/>
+    <w:tmpl w:val="901602F2"/>
+    <w:lvl w:ilvl="0">
+      <w:start w:val="11"/>
+      <w:numFmt w:val="decimal"/>
+      <w:lvlText w:val="%1."/>
+      <w:lvlJc w:val="left"/>
+      <w:pPr>
+        <w:tabs>
+          <w:tab w:val="num" w:pos="720"/>
+        </w:tabs>
+        <w:ind w:left="720" w:hanging="360"/>
+      </w:pPr>
+    </w:lvl>
+    <w:lvl w:ilvl="1" w:tentative="1">
+      <w:start w:val="1"/>
+      <w:numFmt w:val="decimal"/>
+      <w:lvlText w:val="%2."/>
+      <w:lvlJc w:val="left"/>
+      <w:pPr>
+        <w:tabs>
+          <w:tab w:val="num" w:pos="1440"/>
+        </w:tabs>
+        <w:ind w:left="1440" w:hanging="360"/>
+      </w:pPr>
+    </w:lvl>
+    <w:lvl w:ilvl="2" w:tentative="1">
+      <w:start w:val="1"/>
+      <w:numFmt w:val="decimal"/>
+      <w:lvlText w:val="%3."/>
+      <w:lvlJc w:val="left"/>
+      <w:pPr>
+        <w:tabs>
+          <w:tab w:val="num" w:pos="2160"/>
+        </w:tabs>
+        <w:ind w:left="2160" w:hanging="360"/>
+      </w:pPr>
+    </w:lvl>
+    <w:lvl w:ilvl="3" w:tentative="1">
+      <w:start w:val="1"/>
+      <w:numFmt w:val="decimal"/>
+      <w:lvlText w:val="%4."/>
+      <w:lvlJc w:val="left"/>
+      <w:pPr>
+        <w:tabs>
+          <w:tab w:val="num" w:pos="2880"/>
+        </w:tabs>
+        <w:ind w:left="2880" w:hanging="360"/>
+      </w:pPr>
+    </w:lvl>
+    <w:lvl w:ilvl="4" w:tentative="1">
+      <w:start w:val="1"/>
+      <w:numFmt w:val="decimal"/>
+      <w:lvlText w:val="%5."/>
+      <w:lvlJc w:val="left"/>
+      <w:pPr>
+        <w:tabs>
+          <w:tab w:val="num" w:pos="3600"/>
+        </w:tabs>
+        <w:ind w:left="3600" w:hanging="360"/>
+      </w:pPr>
+    </w:lvl>
+    <w:lvl w:ilvl="5" w:tentative="1">
+      <w:start w:val="1"/>
+      <w:numFmt w:val="decimal"/>
+      <w:lvlText w:val="%6."/>
+      <w:lvlJc w:val="left"/>
+      <w:pPr>
+        <w:tabs>
+          <w:tab w:val="num" w:pos="4320"/>
+        </w:tabs>
+        <w:ind w:left="4320" w:hanging="360"/>
+      </w:pPr>
+    </w:lvl>
+    <w:lvl w:ilvl="6" w:tentative="1">
+      <w:start w:val="1"/>
+      <w:numFmt w:val="decimal"/>
+      <w:lvlText w:val="%7."/>
+      <w:lvlJc w:val="left"/>
+      <w:pPr>
+        <w:tabs>
+          <w:tab w:val="num" w:pos="5040"/>
+        </w:tabs>
+        <w:ind w:left="5040" w:hanging="360"/>
+      </w:pPr>
+    </w:lvl>
+    <w:lvl w:ilvl="7" w:tentative="1">
+      <w:start w:val="1"/>
+      <w:numFmt w:val="decimal"/>
+      <w:lvlText w:val="%8."/>
+      <w:lvlJc w:val="left"/>
+      <w:pPr>
+        <w:tabs>
+          <w:tab w:val="num" w:pos="5760"/>
+        </w:tabs>
+        <w:ind w:left="5760" w:hanging="360"/>
+      </w:pPr>
+    </w:lvl>
+    <w:lvl w:ilvl="8" w:tentative="1">
+      <w:start w:val="1"/>
+      <w:numFmt w:val="decimal"/>
+      <w:lvlText w:val="%9."/>
+      <w:lvlJc w:val="left"/>
+      <w:pPr>
+        <w:tabs>
+          <w:tab w:val="num" w:pos="6480"/>
+        </w:tabs>
+        <w:ind w:left="6480" w:hanging="360"/>
+      </w:pPr>
+    </w:lvl>
+  </w:abstractNum>
+  <w:abstractNum w:abstractNumId="2" w15:restartNumberingAfterBreak="0">
+    <w:nsid w:val="0DDA287B"/>
+    <w:multiLevelType w:val="multilevel"/>
+    <w:tmpl w:val="43B8656E"/>
+    <w:lvl w:ilvl="0">
+      <w:start w:val="28"/>
+      <w:numFmt w:val="decimal"/>
+      <w:lvlText w:val="%1."/>
+      <w:lvlJc w:val="left"/>
+      <w:pPr>
+        <w:tabs>
+          <w:tab w:val="num" w:pos="720"/>
+        </w:tabs>
+        <w:ind w:left="720" w:hanging="360"/>
+      </w:pPr>
+    </w:lvl>
+    <w:lvl w:ilvl="1" w:tentative="1">
+      <w:start w:val="1"/>
+      <w:numFmt w:val="decimal"/>
+      <w:lvlText w:val="%2."/>
+      <w:lvlJc w:val="left"/>
+      <w:pPr>
+        <w:tabs>
+          <w:tab w:val="num" w:pos="1440"/>
+        </w:tabs>
+        <w:ind w:left="1440" w:hanging="360"/>
+      </w:pPr>
+    </w:lvl>
+    <w:lvl w:ilvl="2" w:tentative="1">
+      <w:start w:val="1"/>
+      <w:numFmt w:val="decimal"/>
+      <w:lvlText w:val="%3."/>
+      <w:lvlJc w:val="left"/>
+      <w:pPr>
+        <w:tabs>
+          <w:tab w:val="num" w:pos="2160"/>
+        </w:tabs>
+        <w:ind w:left="2160" w:hanging="360"/>
+      </w:pPr>
+    </w:lvl>
+    <w:lvl w:ilvl="3" w:tentative="1">
+      <w:start w:val="1"/>
+      <w:numFmt w:val="decimal"/>
+      <w:lvlText w:val="%4."/>
+      <w:lvlJc w:val="left"/>
+      <w:pPr>
+        <w:tabs>
+          <w:tab w:val="num" w:pos="2880"/>
+        </w:tabs>
+        <w:ind w:left="2880" w:hanging="360"/>
+      </w:pPr>
+    </w:lvl>
+    <w:lvl w:ilvl="4" w:tentative="1">
+      <w:start w:val="1"/>
+      <w:numFmt w:val="decimal"/>
+      <w:lvlText w:val="%5."/>
+      <w:lvlJc w:val="left"/>
+      <w:pPr>
+        <w:tabs>
+          <w:tab w:val="num" w:pos="3600"/>
+        </w:tabs>
+        <w:ind w:left="3600" w:hanging="360"/>
+      </w:pPr>
+    </w:lvl>
+    <w:lvl w:ilvl="5" w:tentative="1">
+      <w:start w:val="1"/>
+      <w:numFmt w:val="decimal"/>
+      <w:lvlText w:val="%6."/>
+      <w:lvlJc w:val="left"/>
+      <w:pPr>
+        <w:tabs>
+          <w:tab w:val="num" w:pos="4320"/>
+        </w:tabs>
+        <w:ind w:left="4320" w:hanging="360"/>
+      </w:pPr>
+    </w:lvl>
+    <w:lvl w:ilvl="6" w:tentative="1">
+      <w:start w:val="1"/>
+      <w:numFmt w:val="decimal"/>
+      <w:lvlText w:val="%7."/>
+      <w:lvlJc w:val="left"/>
+      <w:pPr>
+        <w:tabs>
+          <w:tab w:val="num" w:pos="5040"/>
+        </w:tabs>
+        <w:ind w:left="5040" w:hanging="360"/>
+      </w:pPr>
+    </w:lvl>
+    <w:lvl w:ilvl="7" w:tentative="1">
+      <w:start w:val="1"/>
+      <w:numFmt w:val="decimal"/>
+      <w:lvlText w:val="%8."/>
+      <w:lvlJc w:val="left"/>
+      <w:pPr>
+        <w:tabs>
+          <w:tab w:val="num" w:pos="5760"/>
+        </w:tabs>
+        <w:ind w:left="5760" w:hanging="360"/>
+      </w:pPr>
+    </w:lvl>
+    <w:lvl w:ilvl="8" w:tentative="1">
+      <w:start w:val="1"/>
+      <w:numFmt w:val="decimal"/>
+      <w:lvlText w:val="%9."/>
+      <w:lvlJc w:val="left"/>
+      <w:pPr>
+        <w:tabs>
+          <w:tab w:val="num" w:pos="6480"/>
+        </w:tabs>
+        <w:ind w:left="6480" w:hanging="360"/>
+      </w:pPr>
+    </w:lvl>
+  </w:abstractNum>
+  <w:abstractNum w:abstractNumId="3" w15:restartNumberingAfterBreak="0">
+    <w:nsid w:val="109A22BA"/>
+    <w:multiLevelType w:val="multilevel"/>
+    <w:tmpl w:val="DB90D072"/>
+    <w:lvl w:ilvl="0">
+      <w:start w:val="35"/>
+      <w:numFmt w:val="decimal"/>
+      <w:lvlText w:val="%1."/>
+      <w:lvlJc w:val="left"/>
+      <w:pPr>
+        <w:tabs>
+          <w:tab w:val="num" w:pos="720"/>
+        </w:tabs>
+        <w:ind w:left="720" w:hanging="360"/>
+      </w:pPr>
+    </w:lvl>
+    <w:lvl w:ilvl="1" w:tentative="1">
+      <w:start w:val="1"/>
+      <w:numFmt w:val="decimal"/>
+      <w:lvlText w:val="%2."/>
+      <w:lvlJc w:val="left"/>
+      <w:pPr>
+        <w:tabs>
+          <w:tab w:val="num" w:pos="1440"/>
+        </w:tabs>
+        <w:ind w:left="1440" w:hanging="360"/>
+      </w:pPr>
+    </w:lvl>
+    <w:lvl w:ilvl="2" w:tentative="1">
+      <w:start w:val="1"/>
+      <w:numFmt w:val="decimal"/>
+      <w:lvlText w:val="%3."/>
+      <w:lvlJc w:val="left"/>
+      <w:pPr>
+        <w:tabs>
+          <w:tab w:val="num" w:pos="2160"/>
+        </w:tabs>
+        <w:ind w:left="2160" w:hanging="360"/>
+      </w:pPr>
+    </w:lvl>
+    <w:lvl w:ilvl="3" w:tentative="1">
+      <w:start w:val="1"/>
+      <w:numFmt w:val="decimal"/>
+      <w:lvlText w:val="%4."/>
+      <w:lvlJc w:val="left"/>
+      <w:pPr>
+        <w:tabs>
+          <w:tab w:val="num" w:pos="2880"/>
+        </w:tabs>
+        <w:ind w:left="2880" w:hanging="360"/>
+      </w:pPr>
+    </w:lvl>
+    <w:lvl w:ilvl="4" w:tentative="1">
+      <w:start w:val="1"/>
+      <w:numFmt w:val="decimal"/>
+      <w:lvlText w:val="%5."/>
+      <w:lvlJc w:val="left"/>
+      <w:pPr>
+        <w:tabs>
+          <w:tab w:val="num" w:pos="3600"/>
+        </w:tabs>
+        <w:ind w:left="3600" w:hanging="360"/>
+      </w:pPr>
+    </w:lvl>
+    <w:lvl w:ilvl="5" w:tentative="1">
+      <w:start w:val="1"/>
+      <w:numFmt w:val="decimal"/>
+      <w:lvlText w:val="%6."/>
+      <w:lvlJc w:val="left"/>
+      <w:pPr>
+        <w:tabs>
+          <w:tab w:val="num" w:pos="4320"/>
+        </w:tabs>
+        <w:ind w:left="4320" w:hanging="360"/>
+      </w:pPr>
+    </w:lvl>
+    <w:lvl w:ilvl="6" w:tentative="1">
+      <w:start w:val="1"/>
+      <w:numFmt w:val="decimal"/>
+      <w:lvlText w:val="%7."/>
+      <w:lvlJc w:val="left"/>
+      <w:pPr>
+        <w:tabs>
+          <w:tab w:val="num" w:pos="5040"/>
+        </w:tabs>
+        <w:ind w:left="5040" w:hanging="360"/>
+      </w:pPr>
+    </w:lvl>
+    <w:lvl w:ilvl="7" w:tentative="1">
+      <w:start w:val="1"/>
+      <w:numFmt w:val="decimal"/>
+      <w:lvlText w:val="%8."/>
+      <w:lvlJc w:val="left"/>
+      <w:pPr>
+        <w:tabs>
+          <w:tab w:val="num" w:pos="5760"/>
+        </w:tabs>
+        <w:ind w:left="5760" w:hanging="360"/>
+      </w:pPr>
+    </w:lvl>
+    <w:lvl w:ilvl="8" w:tentative="1">
+      <w:start w:val="1"/>
+      <w:numFmt w:val="decimal"/>
+      <w:lvlText w:val="%9."/>
+      <w:lvlJc w:val="left"/>
+      <w:pPr>
+        <w:tabs>
+          <w:tab w:val="num" w:pos="6480"/>
+        </w:tabs>
+        <w:ind w:left="6480" w:hanging="360"/>
+      </w:pPr>
+    </w:lvl>
+  </w:abstractNum>
+  <w:abstractNum w:abstractNumId="4" w15:restartNumberingAfterBreak="0">
+    <w:nsid w:val="1B786F51"/>
+    <w:multiLevelType w:val="multilevel"/>
+    <w:tmpl w:val="8864CBA4"/>
+    <w:lvl w:ilvl="0">
+      <w:start w:val="40"/>
+      <w:numFmt w:val="decimal"/>
+      <w:lvlText w:val="%1."/>
+      <w:lvlJc w:val="left"/>
+      <w:pPr>
+        <w:tabs>
+          <w:tab w:val="num" w:pos="720"/>
+        </w:tabs>
+        <w:ind w:left="720" w:hanging="360"/>
+      </w:pPr>
+    </w:lvl>
+    <w:lvl w:ilvl="1" w:tentative="1">
+      <w:start w:val="1"/>
+      <w:numFmt w:val="decimal"/>
+      <w:lvlText w:val="%2."/>
+      <w:lvlJc w:val="left"/>
+      <w:pPr>
+        <w:tabs>
+          <w:tab w:val="num" w:pos="1440"/>
+        </w:tabs>
+        <w:ind w:left="1440" w:hanging="360"/>
+      </w:pPr>
+    </w:lvl>
+    <w:lvl w:ilvl="2" w:tentative="1">
+      <w:start w:val="1"/>
+      <w:numFmt w:val="decimal"/>
+      <w:lvlText w:val="%3."/>
+      <w:lvlJc w:val="left"/>
+      <w:pPr>
+        <w:tabs>
+          <w:tab w:val="num" w:pos="2160"/>
+        </w:tabs>
+        <w:ind w:left="2160" w:hanging="360"/>
+      </w:pPr>
+    </w:lvl>
+    <w:lvl w:ilvl="3" w:tentative="1">
+      <w:start w:val="1"/>
+      <w:numFmt w:val="decimal"/>
+      <w:lvlText w:val="%4."/>
+      <w:lvlJc w:val="left"/>
+      <w:pPr>
+        <w:tabs>
+          <w:tab w:val="num" w:pos="2880"/>
+        </w:tabs>
+        <w:ind w:left="2880" w:hanging="360"/>
+      </w:pPr>
+    </w:lvl>
+    <w:lvl w:ilvl="4" w:tentative="1">
+      <w:start w:val="1"/>
+      <w:numFmt w:val="decimal"/>
+      <w:lvlText w:val="%5."/>
+      <w:lvlJc w:val="left"/>
+      <w:pPr>
+        <w:tabs>
+          <w:tab w:val="num" w:pos="3600"/>
+        </w:tabs>
+        <w:ind w:left="3600" w:hanging="360"/>
+      </w:pPr>
+    </w:lvl>
+    <w:lvl w:ilvl="5" w:tentative="1">
+      <w:start w:val="1"/>
+      <w:numFmt w:val="decimal"/>
+      <w:lvlText w:val="%6."/>
+      <w:lvlJc w:val="left"/>
+      <w:pPr>
+        <w:tabs>
+          <w:tab w:val="num" w:pos="4320"/>
+        </w:tabs>
+        <w:ind w:left="4320" w:hanging="360"/>
+      </w:pPr>
+    </w:lvl>
+    <w:lvl w:ilvl="6" w:tentative="1">
+      <w:start w:val="1"/>
+      <w:numFmt w:val="decimal"/>
+      <w:lvlText w:val="%7."/>
+      <w:lvlJc w:val="left"/>
+      <w:pPr>
+        <w:tabs>
+          <w:tab w:val="num" w:pos="5040"/>
+        </w:tabs>
+        <w:ind w:left="5040" w:hanging="360"/>
+      </w:pPr>
+    </w:lvl>
+    <w:lvl w:ilvl="7" w:tentative="1">
+      <w:start w:val="1"/>
+      <w:numFmt w:val="decimal"/>
+      <w:lvlText w:val="%8."/>
+      <w:lvlJc w:val="left"/>
+      <w:pPr>
+        <w:tabs>
+          <w:tab w:val="num" w:pos="5760"/>
+        </w:tabs>
+        <w:ind w:left="5760" w:hanging="360"/>
+      </w:pPr>
+    </w:lvl>
+    <w:lvl w:ilvl="8" w:tentative="1">
+      <w:start w:val="1"/>
+      <w:numFmt w:val="decimal"/>
+      <w:lvlText w:val="%9."/>
+      <w:lvlJc w:val="left"/>
+      <w:pPr>
+        <w:tabs>
+          <w:tab w:val="num" w:pos="6480"/>
+        </w:tabs>
+        <w:ind w:left="6480" w:hanging="360"/>
+      </w:pPr>
+    </w:lvl>
+  </w:abstractNum>
+  <w:abstractNum w:abstractNumId="5" w15:restartNumberingAfterBreak="0">
+    <w:nsid w:val="1C552FDE"/>
+    <w:multiLevelType w:val="multilevel"/>
+    <w:tmpl w:val="19147210"/>
+    <w:lvl w:ilvl="0">
+      <w:start w:val="15"/>
+      <w:numFmt w:val="decimal"/>
+      <w:lvlText w:val="%1."/>
+      <w:lvlJc w:val="left"/>
+      <w:pPr>
+        <w:tabs>
+          <w:tab w:val="num" w:pos="720"/>
+        </w:tabs>
+        <w:ind w:left="720" w:hanging="360"/>
+      </w:pPr>
+    </w:lvl>
+    <w:lvl w:ilvl="1" w:tentative="1">
+      <w:start w:val="1"/>
+      <w:numFmt w:val="decimal"/>
+      <w:lvlText w:val="%2."/>
+      <w:lvlJc w:val="left"/>
+      <w:pPr>
+        <w:tabs>
+          <w:tab w:val="num" w:pos="1440"/>
+        </w:tabs>
+        <w:ind w:left="1440" w:hanging="360"/>
+      </w:pPr>
+    </w:lvl>
+    <w:lvl w:ilvl="2" w:tentative="1">
+      <w:start w:val="1"/>
+      <w:numFmt w:val="decimal"/>
+      <w:lvlText w:val="%3."/>
+      <w:lvlJc w:val="left"/>
+      <w:pPr>
+        <w:tabs>
+          <w:tab w:val="num" w:pos="2160"/>
+        </w:tabs>
+        <w:ind w:left="2160" w:hanging="360"/>
+      </w:pPr>
+    </w:lvl>
+    <w:lvl w:ilvl="3" w:tentative="1">
+      <w:start w:val="1"/>
+      <w:numFmt w:val="decimal"/>
+      <w:lvlText w:val="%4."/>
+      <w:lvlJc w:val="left"/>
+      <w:pPr>
+        <w:tabs>
+          <w:tab w:val="num" w:pos="2880"/>
+        </w:tabs>
+        <w:ind w:left="2880" w:hanging="360"/>
+      </w:pPr>
+    </w:lvl>
+    <w:lvl w:ilvl="4" w:tentative="1">
+      <w:start w:val="1"/>
+      <w:numFmt w:val="decimal"/>
+      <w:lvlText w:val="%5."/>
+      <w:lvlJc w:val="left"/>
+      <w:pPr>
+        <w:tabs>
+          <w:tab w:val="num" w:pos="3600"/>
+        </w:tabs>
+        <w:ind w:left="3600" w:hanging="360"/>
+      </w:pPr>
+    </w:lvl>
+    <w:lvl w:ilvl="5" w:tentative="1">
+      <w:start w:val="1"/>
+      <w:numFmt w:val="decimal"/>
+      <w:lvlText w:val="%6."/>
+      <w:lvlJc w:val="left"/>
+      <w:pPr>
+        <w:tabs>
+          <w:tab w:val="num" w:pos="4320"/>
+        </w:tabs>
+        <w:ind w:left="4320" w:hanging="360"/>
+      </w:pPr>
+    </w:lvl>
+    <w:lvl w:ilvl="6" w:tentative="1">
+      <w:start w:val="1"/>
+      <w:numFmt w:val="decimal"/>
+      <w:lvlText w:val="%7."/>
+      <w:lvlJc w:val="left"/>
+      <w:pPr>
+        <w:tabs>
+          <w:tab w:val="num" w:pos="5040"/>
+        </w:tabs>
+        <w:ind w:left="5040" w:hanging="360"/>
+      </w:pPr>
+    </w:lvl>
+    <w:lvl w:ilvl="7" w:tentative="1">
+      <w:start w:val="1"/>
+      <w:numFmt w:val="decimal"/>
+      <w:lvlText w:val="%8."/>
+      <w:lvlJc w:val="left"/>
+      <w:pPr>
+        <w:tabs>
+          <w:tab w:val="num" w:pos="5760"/>
+        </w:tabs>
+        <w:ind w:left="5760" w:hanging="360"/>
+      </w:pPr>
+    </w:lvl>
+    <w:lvl w:ilvl="8" w:tentative="1">
+      <w:start w:val="1"/>
+      <w:numFmt w:val="decimal"/>
+      <w:lvlText w:val="%9."/>
+      <w:lvlJc w:val="left"/>
+      <w:pPr>
+        <w:tabs>
+          <w:tab w:val="num" w:pos="6480"/>
+        </w:tabs>
+        <w:ind w:left="6480" w:hanging="360"/>
+      </w:pPr>
+    </w:lvl>
+  </w:abstractNum>
+  <w:abstractNum w:abstractNumId="6" w15:restartNumberingAfterBreak="0">
+    <w:nsid w:val="1C9E056E"/>
+    <w:multiLevelType w:val="multilevel"/>
+    <w:tmpl w:val="D6CCD4BC"/>
+    <w:lvl w:ilvl="0">
+      <w:start w:val="23"/>
+      <w:numFmt w:val="decimal"/>
+      <w:lvlText w:val="%1."/>
+      <w:lvlJc w:val="left"/>
+      <w:pPr>
+        <w:tabs>
+          <w:tab w:val="num" w:pos="720"/>
+        </w:tabs>
+        <w:ind w:left="720" w:hanging="360"/>
+      </w:pPr>
+    </w:lvl>
+    <w:lvl w:ilvl="1" w:tentative="1">
+      <w:start w:val="1"/>
+      <w:numFmt w:val="decimal"/>
+      <w:lvlText w:val="%2."/>
+      <w:lvlJc w:val="left"/>
+      <w:pPr>
+        <w:tabs>
+          <w:tab w:val="num" w:pos="1440"/>
+        </w:tabs>
+        <w:ind w:left="1440" w:hanging="360"/>
+      </w:pPr>
+    </w:lvl>
+    <w:lvl w:ilvl="2" w:tentative="1">
+      <w:start w:val="1"/>
+      <w:numFmt w:val="decimal"/>
+      <w:lvlText w:val="%3."/>
+      <w:lvlJc w:val="left"/>
+      <w:pPr>
+        <w:tabs>
+          <w:tab w:val="num" w:pos="2160"/>
+        </w:tabs>
+        <w:ind w:left="2160" w:hanging="360"/>
+      </w:pPr>
+    </w:lvl>
+    <w:lvl w:ilvl="3" w:tentative="1">
+      <w:start w:val="1"/>
+      <w:numFmt w:val="decimal"/>
+      <w:lvlText w:val="%4."/>
+      <w:lvlJc w:val="left"/>
+      <w:pPr>
+        <w:tabs>
+          <w:tab w:val="num" w:pos="2880"/>
+        </w:tabs>
+        <w:ind w:left="2880" w:hanging="360"/>
+      </w:pPr>
+    </w:lvl>
+    <w:lvl w:ilvl="4" w:tentative="1">
+      <w:start w:val="1"/>
+      <w:numFmt w:val="decimal"/>
+      <w:lvlText w:val="%5."/>
+      <w:lvlJc w:val="left"/>
+      <w:pPr>
+        <w:tabs>
+          <w:tab w:val="num" w:pos="3600"/>
+        </w:tabs>
+        <w:ind w:left="3600" w:hanging="360"/>
+      </w:pPr>
+    </w:lvl>
+    <w:lvl w:ilvl="5" w:tentative="1">
+      <w:start w:val="1"/>
+      <w:numFmt w:val="decimal"/>
+      <w:lvlText w:val="%6."/>
+      <w:lvlJc w:val="left"/>
+      <w:pPr>
+        <w:tabs>
+          <w:tab w:val="num" w:pos="4320"/>
+        </w:tabs>
+        <w:ind w:left="4320" w:hanging="360"/>
+      </w:pPr>
+    </w:lvl>
+    <w:lvl w:ilvl="6" w:tentative="1">
+      <w:start w:val="1"/>
+      <w:numFmt w:val="decimal"/>
+      <w:lvlText w:val="%7."/>
+      <w:lvlJc w:val="left"/>
+      <w:pPr>
+        <w:tabs>
+          <w:tab w:val="num" w:pos="5040"/>
+        </w:tabs>
+        <w:ind w:left="5040" w:hanging="360"/>
+      </w:pPr>
+    </w:lvl>
+    <w:lvl w:ilvl="7" w:tentative="1">
+      <w:start w:val="1"/>
+      <w:numFmt w:val="decimal"/>
+      <w:lvlText w:val="%8."/>
+      <w:lvlJc w:val="left"/>
+      <w:pPr>
+        <w:tabs>
+          <w:tab w:val="num" w:pos="5760"/>
+        </w:tabs>
+        <w:ind w:left="5760" w:hanging="360"/>
+      </w:pPr>
+    </w:lvl>
+    <w:lvl w:ilvl="8" w:tentative="1">
+      <w:start w:val="1"/>
+      <w:numFmt w:val="decimal"/>
+      <w:lvlText w:val="%9."/>
+      <w:lvlJc w:val="left"/>
+      <w:pPr>
+        <w:tabs>
+          <w:tab w:val="num" w:pos="6480"/>
+        </w:tabs>
+        <w:ind w:left="6480" w:hanging="360"/>
+      </w:pPr>
+    </w:lvl>
+  </w:abstractNum>
+  <w:abstractNum w:abstractNumId="7" w15:restartNumberingAfterBreak="0">
+    <w:nsid w:val="230C3688"/>
+    <w:multiLevelType w:val="multilevel"/>
+    <w:tmpl w:val="7FCC4E66"/>
+    <w:lvl w:ilvl="0">
+      <w:start w:val="8"/>
+      <w:numFmt w:val="decimal"/>
+      <w:lvlText w:val="%1."/>
+      <w:lvlJc w:val="left"/>
+      <w:pPr>
+        <w:tabs>
+          <w:tab w:val="num" w:pos="720"/>
+        </w:tabs>
+        <w:ind w:left="720" w:hanging="360"/>
+      </w:pPr>
+    </w:lvl>
+    <w:lvl w:ilvl="1">
+      <w:start w:val="1"/>
+      <w:numFmt w:val="bullet"/>
+      <w:lvlText w:val=""/>
+      <w:lvlJc w:val="left"/>
+      <w:pPr>
+        <w:tabs>
+          <w:tab w:val="num" w:pos="1440"/>
+        </w:tabs>
+        <w:ind w:left="1440" w:hanging="360"/>
+      </w:pPr>
+      <w:rPr>
+        <w:rFonts w:ascii="Symbol" w:hAnsi="Symbol" w:hint="default"/>
+        <w:sz w:val="20"/>
+      </w:rPr>
+    </w:lvl>
+    <w:lvl w:ilvl="2" w:tentative="1">
+      <w:start w:val="1"/>
+      <w:numFmt w:val="decimal"/>
+      <w:lvlText w:val="%3."/>
+      <w:lvlJc w:val="left"/>
+      <w:pPr>
+        <w:tabs>
+          <w:tab w:val="num" w:pos="2160"/>
+        </w:tabs>
+        <w:ind w:left="2160" w:hanging="360"/>
+      </w:pPr>
+    </w:lvl>
+    <w:lvl w:ilvl="3" w:tentative="1">
+      <w:start w:val="1"/>
+      <w:numFmt w:val="decimal"/>
+      <w:lvlText w:val="%4."/>
+      <w:lvlJc w:val="left"/>
+      <w:pPr>
+        <w:tabs>
+          <w:tab w:val="num" w:pos="2880"/>
+        </w:tabs>
+        <w:ind w:left="2880" w:hanging="360"/>
+      </w:pPr>
+    </w:lvl>
+    <w:lvl w:ilvl="4" w:tentative="1">
+      <w:start w:val="1"/>
+      <w:numFmt w:val="decimal"/>
+      <w:lvlText w:val="%5."/>
+      <w:lvlJc w:val="left"/>
+      <w:pPr>
+        <w:tabs>
+          <w:tab w:val="num" w:pos="3600"/>
+        </w:tabs>
+        <w:ind w:left="3600" w:hanging="360"/>
+      </w:pPr>
+    </w:lvl>
+    <w:lvl w:ilvl="5" w:tentative="1">
+      <w:start w:val="1"/>
+      <w:numFmt w:val="decimal"/>
+      <w:lvlText w:val="%6."/>
+      <w:lvlJc w:val="left"/>
+      <w:pPr>
+        <w:tabs>
+          <w:tab w:val="num" w:pos="4320"/>
+        </w:tabs>
+        <w:ind w:left="4320" w:hanging="360"/>
+      </w:pPr>
+    </w:lvl>
+    <w:lvl w:ilvl="6" w:tentative="1">
+      <w:start w:val="1"/>
+      <w:numFmt w:val="decimal"/>
+      <w:lvlText w:val="%7."/>
+      <w:lvlJc w:val="left"/>
+      <w:pPr>
+        <w:tabs>
+          <w:tab w:val="num" w:pos="5040"/>
+        </w:tabs>
+        <w:ind w:left="5040" w:hanging="360"/>
+      </w:pPr>
+    </w:lvl>
+    <w:lvl w:ilvl="7" w:tentative="1">
+      <w:start w:val="1"/>
+      <w:numFmt w:val="decimal"/>
+      <w:lvlText w:val="%8."/>
+      <w:lvlJc w:val="left"/>
+      <w:pPr>
+        <w:tabs>
+          <w:tab w:val="num" w:pos="5760"/>
+        </w:tabs>
+        <w:ind w:left="5760" w:hanging="360"/>
+      </w:pPr>
+    </w:lvl>
+    <w:lvl w:ilvl="8" w:tentative="1">
+      <w:start w:val="1"/>
+      <w:numFmt w:val="decimal"/>
+      <w:lvlText w:val="%9."/>
+      <w:lvlJc w:val="left"/>
+      <w:pPr>
+        <w:tabs>
+          <w:tab w:val="num" w:pos="6480"/>
+        </w:tabs>
+        <w:ind w:left="6480" w:hanging="360"/>
+      </w:pPr>
+    </w:lvl>
+  </w:abstractNum>
+  <w:abstractNum w:abstractNumId="8" w15:restartNumberingAfterBreak="0">
     <w:nsid w:val="292A71D0"/>
     <w:multiLevelType w:val="multilevel"/>
     <w:tmpl w:val="099036EA"/>
@@ -192,7 +1669,120 @@
       </w:pPr>
     </w:lvl>
   </w:abstractNum>
-  <w:abstractNum w:abstractNumId="1" w15:restartNumberingAfterBreak="0">
+  <w:abstractNum w:abstractNumId="9" w15:restartNumberingAfterBreak="0">
+    <w:nsid w:val="2F92339F"/>
+    <w:multiLevelType w:val="multilevel"/>
+    <w:tmpl w:val="37E479C4"/>
+    <w:lvl w:ilvl="0">
+      <w:start w:val="23"/>
+      <w:numFmt w:val="decimal"/>
+      <w:lvlText w:val="%1."/>
+      <w:lvlJc w:val="left"/>
+      <w:pPr>
+        <w:tabs>
+          <w:tab w:val="num" w:pos="720"/>
+        </w:tabs>
+        <w:ind w:left="720" w:hanging="360"/>
+      </w:pPr>
+    </w:lvl>
+    <w:lvl w:ilvl="1" w:tentative="1">
+      <w:start w:val="1"/>
+      <w:numFmt w:val="decimal"/>
+      <w:lvlText w:val="%2."/>
+      <w:lvlJc w:val="left"/>
+      <w:pPr>
+        <w:tabs>
+          <w:tab w:val="num" w:pos="1440"/>
+        </w:tabs>
+        <w:ind w:left="1440" w:hanging="360"/>
+      </w:pPr>
+    </w:lvl>
+    <w:lvl w:ilvl="2" w:tentative="1">
+      <w:start w:val="1"/>
+      <w:numFmt w:val="decimal"/>
+      <w:lvlText w:val="%3."/>
+      <w:lvlJc w:val="left"/>
+      <w:pPr>
+        <w:tabs>
+          <w:tab w:val="num" w:pos="2160"/>
+        </w:tabs>
+        <w:ind w:left="2160" w:hanging="360"/>
+      </w:pPr>
+    </w:lvl>
+    <w:lvl w:ilvl="3" w:tentative="1">
+      <w:start w:val="1"/>
+      <w:numFmt w:val="decimal"/>
+      <w:lvlText w:val="%4."/>
+      <w:lvlJc w:val="left"/>
+      <w:pPr>
+        <w:tabs>
+          <w:tab w:val="num" w:pos="2880"/>
+        </w:tabs>
+        <w:ind w:left="2880" w:hanging="360"/>
+      </w:pPr>
+    </w:lvl>
+    <w:lvl w:ilvl="4" w:tentative="1">
+      <w:start w:val="1"/>
+      <w:numFmt w:val="decimal"/>
+      <w:lvlText w:val="%5."/>
+      <w:lvlJc w:val="left"/>
+      <w:pPr>
+        <w:tabs>
+          <w:tab w:val="num" w:pos="3600"/>
+        </w:tabs>
+        <w:ind w:left="3600" w:hanging="360"/>
+      </w:pPr>
+    </w:lvl>
+    <w:lvl w:ilvl="5" w:tentative="1">
+      <w:start w:val="1"/>
+      <w:numFmt w:val="decimal"/>
+      <w:lvlText w:val="%6."/>
+      <w:lvlJc w:val="left"/>
+      <w:pPr>
+        <w:tabs>
+          <w:tab w:val="num" w:pos="4320"/>
+        </w:tabs>
+        <w:ind w:left="4320" w:hanging="360"/>
+      </w:pPr>
+    </w:lvl>
+    <w:lvl w:ilvl="6" w:tentative="1">
+      <w:start w:val="1"/>
+      <w:numFmt w:val="decimal"/>
+      <w:lvlText w:val="%7."/>
+      <w:lvlJc w:val="left"/>
+      <w:pPr>
+        <w:tabs>
+          <w:tab w:val="num" w:pos="5040"/>
+        </w:tabs>
+        <w:ind w:left="5040" w:hanging="360"/>
+      </w:pPr>
+    </w:lvl>
+    <w:lvl w:ilvl="7" w:tentative="1">
+      <w:start w:val="1"/>
+      <w:numFmt w:val="decimal"/>
+      <w:lvlText w:val="%8."/>
+      <w:lvlJc w:val="left"/>
+      <w:pPr>
+        <w:tabs>
+          <w:tab w:val="num" w:pos="5760"/>
+        </w:tabs>
+        <w:ind w:left="5760" w:hanging="360"/>
+      </w:pPr>
+    </w:lvl>
+    <w:lvl w:ilvl="8" w:tentative="1">
+      <w:start w:val="1"/>
+      <w:numFmt w:val="decimal"/>
+      <w:lvlText w:val="%9."/>
+      <w:lvlJc w:val="left"/>
+      <w:pPr>
+        <w:tabs>
+          <w:tab w:val="num" w:pos="6480"/>
+        </w:tabs>
+        <w:ind w:left="6480" w:hanging="360"/>
+      </w:pPr>
+    </w:lvl>
+  </w:abstractNum>
+  <w:abstractNum w:abstractNumId="10" w15:restartNumberingAfterBreak="0">
     <w:nsid w:val="302C5327"/>
     <w:multiLevelType w:val="multilevel"/>
     <w:tmpl w:val="95E28A62"/>
@@ -305,7 +1895,346 @@
       </w:pPr>
     </w:lvl>
   </w:abstractNum>
-  <w:abstractNum w:abstractNumId="2" w15:restartNumberingAfterBreak="0">
+  <w:abstractNum w:abstractNumId="11" w15:restartNumberingAfterBreak="0">
+    <w:nsid w:val="371F4D87"/>
+    <w:multiLevelType w:val="multilevel"/>
+    <w:tmpl w:val="F710EA62"/>
+    <w:lvl w:ilvl="0">
+      <w:start w:val="31"/>
+      <w:numFmt w:val="decimal"/>
+      <w:lvlText w:val="%1."/>
+      <w:lvlJc w:val="left"/>
+      <w:pPr>
+        <w:tabs>
+          <w:tab w:val="num" w:pos="720"/>
+        </w:tabs>
+        <w:ind w:left="720" w:hanging="360"/>
+      </w:pPr>
+    </w:lvl>
+    <w:lvl w:ilvl="1" w:tentative="1">
+      <w:start w:val="1"/>
+      <w:numFmt w:val="decimal"/>
+      <w:lvlText w:val="%2."/>
+      <w:lvlJc w:val="left"/>
+      <w:pPr>
+        <w:tabs>
+          <w:tab w:val="num" w:pos="1440"/>
+        </w:tabs>
+        <w:ind w:left="1440" w:hanging="360"/>
+      </w:pPr>
+    </w:lvl>
+    <w:lvl w:ilvl="2" w:tentative="1">
+      <w:start w:val="1"/>
+      <w:numFmt w:val="decimal"/>
+      <w:lvlText w:val="%3."/>
+      <w:lvlJc w:val="left"/>
+      <w:pPr>
+        <w:tabs>
+          <w:tab w:val="num" w:pos="2160"/>
+        </w:tabs>
+        <w:ind w:left="2160" w:hanging="360"/>
+      </w:pPr>
+    </w:lvl>
+    <w:lvl w:ilvl="3" w:tentative="1">
+      <w:start w:val="1"/>
+      <w:numFmt w:val="decimal"/>
+      <w:lvlText w:val="%4."/>
+      <w:lvlJc w:val="left"/>
+      <w:pPr>
+        <w:tabs>
+          <w:tab w:val="num" w:pos="2880"/>
+        </w:tabs>
+        <w:ind w:left="2880" w:hanging="360"/>
+      </w:pPr>
+    </w:lvl>
+    <w:lvl w:ilvl="4" w:tentative="1">
+      <w:start w:val="1"/>
+      <w:numFmt w:val="decimal"/>
+      <w:lvlText w:val="%5."/>
+      <w:lvlJc w:val="left"/>
+      <w:pPr>
+        <w:tabs>
+          <w:tab w:val="num" w:pos="3600"/>
+        </w:tabs>
+        <w:ind w:left="3600" w:hanging="360"/>
+      </w:pPr>
+    </w:lvl>
+    <w:lvl w:ilvl="5" w:tentative="1">
+      <w:start w:val="1"/>
+      <w:numFmt w:val="decimal"/>
+      <w:lvlText w:val="%6."/>
+      <w:lvlJc w:val="left"/>
+      <w:pPr>
+        <w:tabs>
+          <w:tab w:val="num" w:pos="4320"/>
+        </w:tabs>
+        <w:ind w:left="4320" w:hanging="360"/>
+      </w:pPr>
+    </w:lvl>
+    <w:lvl w:ilvl="6" w:tentative="1">
+      <w:start w:val="1"/>
+      <w:numFmt w:val="decimal"/>
+      <w:lvlText w:val="%7."/>
+      <w:lvlJc w:val="left"/>
+      <w:pPr>
+        <w:tabs>
+          <w:tab w:val="num" w:pos="5040"/>
+        </w:tabs>
+        <w:ind w:left="5040" w:hanging="360"/>
+      </w:pPr>
+    </w:lvl>
+    <w:lvl w:ilvl="7" w:tentative="1">
+      <w:start w:val="1"/>
+      <w:numFmt w:val="decimal"/>
+      <w:lvlText w:val="%8."/>
+      <w:lvlJc w:val="left"/>
+      <w:pPr>
+        <w:tabs>
+          <w:tab w:val="num" w:pos="5760"/>
+        </w:tabs>
+        <w:ind w:left="5760" w:hanging="360"/>
+      </w:pPr>
+    </w:lvl>
+    <w:lvl w:ilvl="8" w:tentative="1">
+      <w:start w:val="1"/>
+      <w:numFmt w:val="decimal"/>
+      <w:lvlText w:val="%9."/>
+      <w:lvlJc w:val="left"/>
+      <w:pPr>
+        <w:tabs>
+          <w:tab w:val="num" w:pos="6480"/>
+        </w:tabs>
+        <w:ind w:left="6480" w:hanging="360"/>
+      </w:pPr>
+    </w:lvl>
+  </w:abstractNum>
+  <w:abstractNum w:abstractNumId="12" w15:restartNumberingAfterBreak="0">
+    <w:nsid w:val="38246EE2"/>
+    <w:multiLevelType w:val="multilevel"/>
+    <w:tmpl w:val="4B30C298"/>
+    <w:lvl w:ilvl="0">
+      <w:start w:val="28"/>
+      <w:numFmt w:val="decimal"/>
+      <w:lvlText w:val="%1."/>
+      <w:lvlJc w:val="left"/>
+      <w:pPr>
+        <w:tabs>
+          <w:tab w:val="num" w:pos="720"/>
+        </w:tabs>
+        <w:ind w:left="720" w:hanging="360"/>
+      </w:pPr>
+    </w:lvl>
+    <w:lvl w:ilvl="1" w:tentative="1">
+      <w:start w:val="1"/>
+      <w:numFmt w:val="decimal"/>
+      <w:lvlText w:val="%2."/>
+      <w:lvlJc w:val="left"/>
+      <w:pPr>
+        <w:tabs>
+          <w:tab w:val="num" w:pos="1440"/>
+        </w:tabs>
+        <w:ind w:left="1440" w:hanging="360"/>
+      </w:pPr>
+    </w:lvl>
+    <w:lvl w:ilvl="2" w:tentative="1">
+      <w:start w:val="1"/>
+      <w:numFmt w:val="decimal"/>
+      <w:lvlText w:val="%3."/>
+      <w:lvlJc w:val="left"/>
+      <w:pPr>
+        <w:tabs>
+          <w:tab w:val="num" w:pos="2160"/>
+        </w:tabs>
+        <w:ind w:left="2160" w:hanging="360"/>
+      </w:pPr>
+    </w:lvl>
+    <w:lvl w:ilvl="3" w:tentative="1">
+      <w:start w:val="1"/>
+      <w:numFmt w:val="decimal"/>
+      <w:lvlText w:val="%4."/>
+      <w:lvlJc w:val="left"/>
+      <w:pPr>
+        <w:tabs>
+          <w:tab w:val="num" w:pos="2880"/>
+        </w:tabs>
+        <w:ind w:left="2880" w:hanging="360"/>
+      </w:pPr>
+    </w:lvl>
+    <w:lvl w:ilvl="4" w:tentative="1">
+      <w:start w:val="1"/>
+      <w:numFmt w:val="decimal"/>
+      <w:lvlText w:val="%5."/>
+      <w:lvlJc w:val="left"/>
+      <w:pPr>
+        <w:tabs>
+          <w:tab w:val="num" w:pos="3600"/>
+        </w:tabs>
+        <w:ind w:left="3600" w:hanging="360"/>
+      </w:pPr>
+    </w:lvl>
+    <w:lvl w:ilvl="5" w:tentative="1">
+      <w:start w:val="1"/>
+      <w:numFmt w:val="decimal"/>
+      <w:lvlText w:val="%6."/>
+      <w:lvlJc w:val="left"/>
+      <w:pPr>
+        <w:tabs>
+          <w:tab w:val="num" w:pos="4320"/>
+        </w:tabs>
+        <w:ind w:left="4320" w:hanging="360"/>
+      </w:pPr>
+    </w:lvl>
+    <w:lvl w:ilvl="6" w:tentative="1">
+      <w:start w:val="1"/>
+      <w:numFmt w:val="decimal"/>
+      <w:lvlText w:val="%7."/>
+      <w:lvlJc w:val="left"/>
+      <w:pPr>
+        <w:tabs>
+          <w:tab w:val="num" w:pos="5040"/>
+        </w:tabs>
+        <w:ind w:left="5040" w:hanging="360"/>
+      </w:pPr>
+    </w:lvl>
+    <w:lvl w:ilvl="7" w:tentative="1">
+      <w:start w:val="1"/>
+      <w:numFmt w:val="decimal"/>
+      <w:lvlText w:val="%8."/>
+      <w:lvlJc w:val="left"/>
+      <w:pPr>
+        <w:tabs>
+          <w:tab w:val="num" w:pos="5760"/>
+        </w:tabs>
+        <w:ind w:left="5760" w:hanging="360"/>
+      </w:pPr>
+    </w:lvl>
+    <w:lvl w:ilvl="8" w:tentative="1">
+      <w:start w:val="1"/>
+      <w:numFmt w:val="decimal"/>
+      <w:lvlText w:val="%9."/>
+      <w:lvlJc w:val="left"/>
+      <w:pPr>
+        <w:tabs>
+          <w:tab w:val="num" w:pos="6480"/>
+        </w:tabs>
+        <w:ind w:left="6480" w:hanging="360"/>
+      </w:pPr>
+    </w:lvl>
+  </w:abstractNum>
+  <w:abstractNum w:abstractNumId="13" w15:restartNumberingAfterBreak="0">
+    <w:nsid w:val="46683BDD"/>
+    <w:multiLevelType w:val="multilevel"/>
+    <w:tmpl w:val="8C9E35CE"/>
+    <w:lvl w:ilvl="0">
+      <w:start w:val="23"/>
+      <w:numFmt w:val="decimal"/>
+      <w:lvlText w:val="%1."/>
+      <w:lvlJc w:val="left"/>
+      <w:pPr>
+        <w:tabs>
+          <w:tab w:val="num" w:pos="720"/>
+        </w:tabs>
+        <w:ind w:left="720" w:hanging="360"/>
+      </w:pPr>
+    </w:lvl>
+    <w:lvl w:ilvl="1" w:tentative="1">
+      <w:start w:val="1"/>
+      <w:numFmt w:val="decimal"/>
+      <w:lvlText w:val="%2."/>
+      <w:lvlJc w:val="left"/>
+      <w:pPr>
+        <w:tabs>
+          <w:tab w:val="num" w:pos="1440"/>
+        </w:tabs>
+        <w:ind w:left="1440" w:hanging="360"/>
+      </w:pPr>
+    </w:lvl>
+    <w:lvl w:ilvl="2" w:tentative="1">
+      <w:start w:val="1"/>
+      <w:numFmt w:val="decimal"/>
+      <w:lvlText w:val="%3."/>
+      <w:lvlJc w:val="left"/>
+      <w:pPr>
+        <w:tabs>
+          <w:tab w:val="num" w:pos="2160"/>
+        </w:tabs>
+        <w:ind w:left="2160" w:hanging="360"/>
+      </w:pPr>
+    </w:lvl>
+    <w:lvl w:ilvl="3" w:tentative="1">
+      <w:start w:val="1"/>
+      <w:numFmt w:val="decimal"/>
+      <w:lvlText w:val="%4."/>
+      <w:lvlJc w:val="left"/>
+      <w:pPr>
+        <w:tabs>
+          <w:tab w:val="num" w:pos="2880"/>
+        </w:tabs>
+        <w:ind w:left="2880" w:hanging="360"/>
+      </w:pPr>
+    </w:lvl>
+    <w:lvl w:ilvl="4" w:tentative="1">
+      <w:start w:val="1"/>
+      <w:numFmt w:val="decimal"/>
+      <w:lvlText w:val="%5."/>
+      <w:lvlJc w:val="left"/>
+      <w:pPr>
+        <w:tabs>
+          <w:tab w:val="num" w:pos="3600"/>
+        </w:tabs>
+        <w:ind w:left="3600" w:hanging="360"/>
+      </w:pPr>
+    </w:lvl>
+    <w:lvl w:ilvl="5" w:tentative="1">
+      <w:start w:val="1"/>
+      <w:numFmt w:val="decimal"/>
+      <w:lvlText w:val="%6."/>
+      <w:lvlJc w:val="left"/>
+      <w:pPr>
+        <w:tabs>
+          <w:tab w:val="num" w:pos="4320"/>
+        </w:tabs>
+        <w:ind w:left="4320" w:hanging="360"/>
+      </w:pPr>
+    </w:lvl>
+    <w:lvl w:ilvl="6" w:tentative="1">
+      <w:start w:val="1"/>
+      <w:numFmt w:val="decimal"/>
+      <w:lvlText w:val="%7."/>
+      <w:lvlJc w:val="left"/>
+      <w:pPr>
+        <w:tabs>
+          <w:tab w:val="num" w:pos="5040"/>
+        </w:tabs>
+        <w:ind w:left="5040" w:hanging="360"/>
+      </w:pPr>
+    </w:lvl>
+    <w:lvl w:ilvl="7" w:tentative="1">
+      <w:start w:val="1"/>
+      <w:numFmt w:val="decimal"/>
+      <w:lvlText w:val="%8."/>
+      <w:lvlJc w:val="left"/>
+      <w:pPr>
+        <w:tabs>
+          <w:tab w:val="num" w:pos="5760"/>
+        </w:tabs>
+        <w:ind w:left="5760" w:hanging="360"/>
+      </w:pPr>
+    </w:lvl>
+    <w:lvl w:ilvl="8" w:tentative="1">
+      <w:start w:val="1"/>
+      <w:numFmt w:val="decimal"/>
+      <w:lvlText w:val="%9."/>
+      <w:lvlJc w:val="left"/>
+      <w:pPr>
+        <w:tabs>
+          <w:tab w:val="num" w:pos="6480"/>
+        </w:tabs>
+        <w:ind w:left="6480" w:hanging="360"/>
+      </w:pPr>
+    </w:lvl>
+  </w:abstractNum>
+  <w:abstractNum w:abstractNumId="14" w15:restartNumberingAfterBreak="0">
     <w:nsid w:val="480109A6"/>
     <w:multiLevelType w:val="multilevel"/>
     <w:tmpl w:val="A672DAC4"/>
@@ -418,7 +2347,350 @@
       </w:pPr>
     </w:lvl>
   </w:abstractNum>
-  <w:abstractNum w:abstractNumId="3" w15:restartNumberingAfterBreak="0">
+  <w:abstractNum w:abstractNumId="15" w15:restartNumberingAfterBreak="0">
+    <w:nsid w:val="48CA2D9A"/>
+    <w:multiLevelType w:val="multilevel"/>
+    <w:tmpl w:val="5CA468F0"/>
+    <w:lvl w:ilvl="0">
+      <w:start w:val="1"/>
+      <w:numFmt w:val="decimal"/>
+      <w:lvlText w:val="%1."/>
+      <w:lvlJc w:val="left"/>
+      <w:pPr>
+        <w:tabs>
+          <w:tab w:val="num" w:pos="720"/>
+        </w:tabs>
+        <w:ind w:left="720" w:hanging="360"/>
+      </w:pPr>
+    </w:lvl>
+    <w:lvl w:ilvl="1" w:tentative="1">
+      <w:start w:val="1"/>
+      <w:numFmt w:val="decimal"/>
+      <w:lvlText w:val="%2."/>
+      <w:lvlJc w:val="left"/>
+      <w:pPr>
+        <w:tabs>
+          <w:tab w:val="num" w:pos="1440"/>
+        </w:tabs>
+        <w:ind w:left="1440" w:hanging="360"/>
+      </w:pPr>
+    </w:lvl>
+    <w:lvl w:ilvl="2" w:tentative="1">
+      <w:start w:val="1"/>
+      <w:numFmt w:val="decimal"/>
+      <w:lvlText w:val="%3."/>
+      <w:lvlJc w:val="left"/>
+      <w:pPr>
+        <w:tabs>
+          <w:tab w:val="num" w:pos="2160"/>
+        </w:tabs>
+        <w:ind w:left="2160" w:hanging="360"/>
+      </w:pPr>
+    </w:lvl>
+    <w:lvl w:ilvl="3" w:tentative="1">
+      <w:start w:val="1"/>
+      <w:numFmt w:val="decimal"/>
+      <w:lvlText w:val="%4."/>
+      <w:lvlJc w:val="left"/>
+      <w:pPr>
+        <w:tabs>
+          <w:tab w:val="num" w:pos="2880"/>
+        </w:tabs>
+        <w:ind w:left="2880" w:hanging="360"/>
+      </w:pPr>
+    </w:lvl>
+    <w:lvl w:ilvl="4" w:tentative="1">
+      <w:start w:val="1"/>
+      <w:numFmt w:val="decimal"/>
+      <w:lvlText w:val="%5."/>
+      <w:lvlJc w:val="left"/>
+      <w:pPr>
+        <w:tabs>
+          <w:tab w:val="num" w:pos="3600"/>
+        </w:tabs>
+        <w:ind w:left="3600" w:hanging="360"/>
+      </w:pPr>
+    </w:lvl>
+    <w:lvl w:ilvl="5" w:tentative="1">
+      <w:start w:val="1"/>
+      <w:numFmt w:val="decimal"/>
+      <w:lvlText w:val="%6."/>
+      <w:lvlJc w:val="left"/>
+      <w:pPr>
+        <w:tabs>
+          <w:tab w:val="num" w:pos="4320"/>
+        </w:tabs>
+        <w:ind w:left="4320" w:hanging="360"/>
+      </w:pPr>
+    </w:lvl>
+    <w:lvl w:ilvl="6" w:tentative="1">
+      <w:start w:val="1"/>
+      <w:numFmt w:val="decimal"/>
+      <w:lvlText w:val="%7."/>
+      <w:lvlJc w:val="left"/>
+      <w:pPr>
+        <w:tabs>
+          <w:tab w:val="num" w:pos="5040"/>
+        </w:tabs>
+        <w:ind w:left="5040" w:hanging="360"/>
+      </w:pPr>
+    </w:lvl>
+    <w:lvl w:ilvl="7" w:tentative="1">
+      <w:start w:val="1"/>
+      <w:numFmt w:val="decimal"/>
+      <w:lvlText w:val="%8."/>
+      <w:lvlJc w:val="left"/>
+      <w:pPr>
+        <w:tabs>
+          <w:tab w:val="num" w:pos="5760"/>
+        </w:tabs>
+        <w:ind w:left="5760" w:hanging="360"/>
+      </w:pPr>
+    </w:lvl>
+    <w:lvl w:ilvl="8" w:tentative="1">
+      <w:start w:val="1"/>
+      <w:numFmt w:val="decimal"/>
+      <w:lvlText w:val="%9."/>
+      <w:lvlJc w:val="left"/>
+      <w:pPr>
+        <w:tabs>
+          <w:tab w:val="num" w:pos="6480"/>
+        </w:tabs>
+        <w:ind w:left="6480" w:hanging="360"/>
+      </w:pPr>
+    </w:lvl>
+  </w:abstractNum>
+  <w:abstractNum w:abstractNumId="16" w15:restartNumberingAfterBreak="0">
+    <w:nsid w:val="4DFF00F7"/>
+    <w:multiLevelType w:val="multilevel"/>
+    <w:tmpl w:val="7FCC4E66"/>
+    <w:lvl w:ilvl="0">
+      <w:start w:val="8"/>
+      <w:numFmt w:val="decimal"/>
+      <w:lvlText w:val="%1."/>
+      <w:lvlJc w:val="left"/>
+      <w:pPr>
+        <w:tabs>
+          <w:tab w:val="num" w:pos="720"/>
+        </w:tabs>
+        <w:ind w:left="720" w:hanging="360"/>
+      </w:pPr>
+    </w:lvl>
+    <w:lvl w:ilvl="1">
+      <w:start w:val="1"/>
+      <w:numFmt w:val="bullet"/>
+      <w:lvlText w:val=""/>
+      <w:lvlJc w:val="left"/>
+      <w:pPr>
+        <w:tabs>
+          <w:tab w:val="num" w:pos="1440"/>
+        </w:tabs>
+        <w:ind w:left="1440" w:hanging="360"/>
+      </w:pPr>
+      <w:rPr>
+        <w:rFonts w:ascii="Symbol" w:hAnsi="Symbol" w:hint="default"/>
+        <w:sz w:val="20"/>
+      </w:rPr>
+    </w:lvl>
+    <w:lvl w:ilvl="2" w:tentative="1">
+      <w:start w:val="1"/>
+      <w:numFmt w:val="decimal"/>
+      <w:lvlText w:val="%3."/>
+      <w:lvlJc w:val="left"/>
+      <w:pPr>
+        <w:tabs>
+          <w:tab w:val="num" w:pos="2160"/>
+        </w:tabs>
+        <w:ind w:left="2160" w:hanging="360"/>
+      </w:pPr>
+    </w:lvl>
+    <w:lvl w:ilvl="3" w:tentative="1">
+      <w:start w:val="1"/>
+      <w:numFmt w:val="decimal"/>
+      <w:lvlText w:val="%4."/>
+      <w:lvlJc w:val="left"/>
+      <w:pPr>
+        <w:tabs>
+          <w:tab w:val="num" w:pos="2880"/>
+        </w:tabs>
+        <w:ind w:left="2880" w:hanging="360"/>
+      </w:pPr>
+    </w:lvl>
+    <w:lvl w:ilvl="4" w:tentative="1">
+      <w:start w:val="1"/>
+      <w:numFmt w:val="decimal"/>
+      <w:lvlText w:val="%5."/>
+      <w:lvlJc w:val="left"/>
+      <w:pPr>
+        <w:tabs>
+          <w:tab w:val="num" w:pos="3600"/>
+        </w:tabs>
+        <w:ind w:left="3600" w:hanging="360"/>
+      </w:pPr>
+    </w:lvl>
+    <w:lvl w:ilvl="5" w:tentative="1">
+      <w:start w:val="1"/>
+      <w:numFmt w:val="decimal"/>
+      <w:lvlText w:val="%6."/>
+      <w:lvlJc w:val="left"/>
+      <w:pPr>
+        <w:tabs>
+          <w:tab w:val="num" w:pos="4320"/>
+        </w:tabs>
+        <w:ind w:left="4320" w:hanging="360"/>
+      </w:pPr>
+    </w:lvl>
+    <w:lvl w:ilvl="6" w:tentative="1">
+      <w:start w:val="1"/>
+      <w:numFmt w:val="decimal"/>
+      <w:lvlText w:val="%7."/>
+      <w:lvlJc w:val="left"/>
+      <w:pPr>
+        <w:tabs>
+          <w:tab w:val="num" w:pos="5040"/>
+        </w:tabs>
+        <w:ind w:left="5040" w:hanging="360"/>
+      </w:pPr>
+    </w:lvl>
+    <w:lvl w:ilvl="7" w:tentative="1">
+      <w:start w:val="1"/>
+      <w:numFmt w:val="decimal"/>
+      <w:lvlText w:val="%8."/>
+      <w:lvlJc w:val="left"/>
+      <w:pPr>
+        <w:tabs>
+          <w:tab w:val="num" w:pos="5760"/>
+        </w:tabs>
+        <w:ind w:left="5760" w:hanging="360"/>
+      </w:pPr>
+    </w:lvl>
+    <w:lvl w:ilvl="8" w:tentative="1">
+      <w:start w:val="1"/>
+      <w:numFmt w:val="decimal"/>
+      <w:lvlText w:val="%9."/>
+      <w:lvlJc w:val="left"/>
+      <w:pPr>
+        <w:tabs>
+          <w:tab w:val="num" w:pos="6480"/>
+        </w:tabs>
+        <w:ind w:left="6480" w:hanging="360"/>
+      </w:pPr>
+    </w:lvl>
+  </w:abstractNum>
+  <w:abstractNum w:abstractNumId="17" w15:restartNumberingAfterBreak="0">
+    <w:nsid w:val="518772EC"/>
+    <w:multiLevelType w:val="multilevel"/>
+    <w:tmpl w:val="44CE0F0E"/>
+    <w:lvl w:ilvl="0">
+      <w:start w:val="1"/>
+      <w:numFmt w:val="decimal"/>
+      <w:lvlText w:val="%1."/>
+      <w:lvlJc w:val="left"/>
+      <w:pPr>
+        <w:tabs>
+          <w:tab w:val="num" w:pos="720"/>
+        </w:tabs>
+        <w:ind w:left="720" w:hanging="360"/>
+      </w:pPr>
+    </w:lvl>
+    <w:lvl w:ilvl="1" w:tentative="1">
+      <w:start w:val="1"/>
+      <w:numFmt w:val="decimal"/>
+      <w:lvlText w:val="%2."/>
+      <w:lvlJc w:val="left"/>
+      <w:pPr>
+        <w:tabs>
+          <w:tab w:val="num" w:pos="1440"/>
+        </w:tabs>
+        <w:ind w:left="1440" w:hanging="360"/>
+      </w:pPr>
+    </w:lvl>
+    <w:lvl w:ilvl="2" w:tentative="1">
+      <w:start w:val="1"/>
+      <w:numFmt w:val="decimal"/>
+      <w:lvlText w:val="%3."/>
+      <w:lvlJc w:val="left"/>
+      <w:pPr>
+        <w:tabs>
+          <w:tab w:val="num" w:pos="2160"/>
+        </w:tabs>
+        <w:ind w:left="2160" w:hanging="360"/>
+      </w:pPr>
+    </w:lvl>
+    <w:lvl w:ilvl="3" w:tentative="1">
+      <w:start w:val="1"/>
+      <w:numFmt w:val="decimal"/>
+      <w:lvlText w:val="%4."/>
+      <w:lvlJc w:val="left"/>
+      <w:pPr>
+        <w:tabs>
+          <w:tab w:val="num" w:pos="2880"/>
+        </w:tabs>
+        <w:ind w:left="2880" w:hanging="360"/>
+      </w:pPr>
+    </w:lvl>
+    <w:lvl w:ilvl="4" w:tentative="1">
+      <w:start w:val="1"/>
+      <w:numFmt w:val="decimal"/>
+      <w:lvlText w:val="%5."/>
+      <w:lvlJc w:val="left"/>
+      <w:pPr>
+        <w:tabs>
+          <w:tab w:val="num" w:pos="3600"/>
+        </w:tabs>
+        <w:ind w:left="3600" w:hanging="360"/>
+      </w:pPr>
+    </w:lvl>
+    <w:lvl w:ilvl="5" w:tentative="1">
+      <w:start w:val="1"/>
+      <w:numFmt w:val="decimal"/>
+      <w:lvlText w:val="%6."/>
+      <w:lvlJc w:val="left"/>
+      <w:pPr>
+        <w:tabs>
+          <w:tab w:val="num" w:pos="4320"/>
+        </w:tabs>
+        <w:ind w:left="4320" w:hanging="360"/>
+      </w:pPr>
+    </w:lvl>
+    <w:lvl w:ilvl="6" w:tentative="1">
+      <w:start w:val="1"/>
+      <w:numFmt w:val="decimal"/>
+      <w:lvlText w:val="%7."/>
+      <w:lvlJc w:val="left"/>
+      <w:pPr>
+        <w:tabs>
+          <w:tab w:val="num" w:pos="5040"/>
+        </w:tabs>
+        <w:ind w:left="5040" w:hanging="360"/>
+      </w:pPr>
+    </w:lvl>
+    <w:lvl w:ilvl="7" w:tentative="1">
+      <w:start w:val="1"/>
+      <w:numFmt w:val="decimal"/>
+      <w:lvlText w:val="%8."/>
+      <w:lvlJc w:val="left"/>
+      <w:pPr>
+        <w:tabs>
+          <w:tab w:val="num" w:pos="5760"/>
+        </w:tabs>
+        <w:ind w:left="5760" w:hanging="360"/>
+      </w:pPr>
+    </w:lvl>
+    <w:lvl w:ilvl="8" w:tentative="1">
+      <w:start w:val="1"/>
+      <w:numFmt w:val="decimal"/>
+      <w:lvlText w:val="%9."/>
+      <w:lvlJc w:val="left"/>
+      <w:pPr>
+        <w:tabs>
+          <w:tab w:val="num" w:pos="6480"/>
+        </w:tabs>
+        <w:ind w:left="6480" w:hanging="360"/>
+      </w:pPr>
+    </w:lvl>
+  </w:abstractNum>
+  <w:abstractNum w:abstractNumId="18" w15:restartNumberingAfterBreak="0">
     <w:nsid w:val="54047806"/>
     <w:multiLevelType w:val="multilevel"/>
     <w:tmpl w:val="A920B604"/>
@@ -531,7 +2803,346 @@
       </w:pPr>
     </w:lvl>
   </w:abstractNum>
-  <w:abstractNum w:abstractNumId="4" w15:restartNumberingAfterBreak="0">
+  <w:abstractNum w:abstractNumId="19" w15:restartNumberingAfterBreak="0">
+    <w:nsid w:val="566F35C7"/>
+    <w:multiLevelType w:val="multilevel"/>
+    <w:tmpl w:val="7D82720E"/>
+    <w:lvl w:ilvl="0">
+      <w:start w:val="28"/>
+      <w:numFmt w:val="decimal"/>
+      <w:lvlText w:val="%1."/>
+      <w:lvlJc w:val="left"/>
+      <w:pPr>
+        <w:tabs>
+          <w:tab w:val="num" w:pos="720"/>
+        </w:tabs>
+        <w:ind w:left="720" w:hanging="360"/>
+      </w:pPr>
+    </w:lvl>
+    <w:lvl w:ilvl="1" w:tentative="1">
+      <w:start w:val="1"/>
+      <w:numFmt w:val="decimal"/>
+      <w:lvlText w:val="%2."/>
+      <w:lvlJc w:val="left"/>
+      <w:pPr>
+        <w:tabs>
+          <w:tab w:val="num" w:pos="1440"/>
+        </w:tabs>
+        <w:ind w:left="1440" w:hanging="360"/>
+      </w:pPr>
+    </w:lvl>
+    <w:lvl w:ilvl="2" w:tentative="1">
+      <w:start w:val="1"/>
+      <w:numFmt w:val="decimal"/>
+      <w:lvlText w:val="%3."/>
+      <w:lvlJc w:val="left"/>
+      <w:pPr>
+        <w:tabs>
+          <w:tab w:val="num" w:pos="2160"/>
+        </w:tabs>
+        <w:ind w:left="2160" w:hanging="360"/>
+      </w:pPr>
+    </w:lvl>
+    <w:lvl w:ilvl="3" w:tentative="1">
+      <w:start w:val="1"/>
+      <w:numFmt w:val="decimal"/>
+      <w:lvlText w:val="%4."/>
+      <w:lvlJc w:val="left"/>
+      <w:pPr>
+        <w:tabs>
+          <w:tab w:val="num" w:pos="2880"/>
+        </w:tabs>
+        <w:ind w:left="2880" w:hanging="360"/>
+      </w:pPr>
+    </w:lvl>
+    <w:lvl w:ilvl="4" w:tentative="1">
+      <w:start w:val="1"/>
+      <w:numFmt w:val="decimal"/>
+      <w:lvlText w:val="%5."/>
+      <w:lvlJc w:val="left"/>
+      <w:pPr>
+        <w:tabs>
+          <w:tab w:val="num" w:pos="3600"/>
+        </w:tabs>
+        <w:ind w:left="3600" w:hanging="360"/>
+      </w:pPr>
+    </w:lvl>
+    <w:lvl w:ilvl="5" w:tentative="1">
+      <w:start w:val="1"/>
+      <w:numFmt w:val="decimal"/>
+      <w:lvlText w:val="%6."/>
+      <w:lvlJc w:val="left"/>
+      <w:pPr>
+        <w:tabs>
+          <w:tab w:val="num" w:pos="4320"/>
+        </w:tabs>
+        <w:ind w:left="4320" w:hanging="360"/>
+      </w:pPr>
+    </w:lvl>
+    <w:lvl w:ilvl="6" w:tentative="1">
+      <w:start w:val="1"/>
+      <w:numFmt w:val="decimal"/>
+      <w:lvlText w:val="%7."/>
+      <w:lvlJc w:val="left"/>
+      <w:pPr>
+        <w:tabs>
+          <w:tab w:val="num" w:pos="5040"/>
+        </w:tabs>
+        <w:ind w:left="5040" w:hanging="360"/>
+      </w:pPr>
+    </w:lvl>
+    <w:lvl w:ilvl="7" w:tentative="1">
+      <w:start w:val="1"/>
+      <w:numFmt w:val="decimal"/>
+      <w:lvlText w:val="%8."/>
+      <w:lvlJc w:val="left"/>
+      <w:pPr>
+        <w:tabs>
+          <w:tab w:val="num" w:pos="5760"/>
+        </w:tabs>
+        <w:ind w:left="5760" w:hanging="360"/>
+      </w:pPr>
+    </w:lvl>
+    <w:lvl w:ilvl="8" w:tentative="1">
+      <w:start w:val="1"/>
+      <w:numFmt w:val="decimal"/>
+      <w:lvlText w:val="%9."/>
+      <w:lvlJc w:val="left"/>
+      <w:pPr>
+        <w:tabs>
+          <w:tab w:val="num" w:pos="6480"/>
+        </w:tabs>
+        <w:ind w:left="6480" w:hanging="360"/>
+      </w:pPr>
+    </w:lvl>
+  </w:abstractNum>
+  <w:abstractNum w:abstractNumId="20" w15:restartNumberingAfterBreak="0">
+    <w:nsid w:val="58E05045"/>
+    <w:multiLevelType w:val="multilevel"/>
+    <w:tmpl w:val="406020FA"/>
+    <w:lvl w:ilvl="0">
+      <w:start w:val="28"/>
+      <w:numFmt w:val="decimal"/>
+      <w:lvlText w:val="%1."/>
+      <w:lvlJc w:val="left"/>
+      <w:pPr>
+        <w:tabs>
+          <w:tab w:val="num" w:pos="720"/>
+        </w:tabs>
+        <w:ind w:left="720" w:hanging="360"/>
+      </w:pPr>
+    </w:lvl>
+    <w:lvl w:ilvl="1" w:tentative="1">
+      <w:start w:val="1"/>
+      <w:numFmt w:val="decimal"/>
+      <w:lvlText w:val="%2."/>
+      <w:lvlJc w:val="left"/>
+      <w:pPr>
+        <w:tabs>
+          <w:tab w:val="num" w:pos="1440"/>
+        </w:tabs>
+        <w:ind w:left="1440" w:hanging="360"/>
+      </w:pPr>
+    </w:lvl>
+    <w:lvl w:ilvl="2" w:tentative="1">
+      <w:start w:val="1"/>
+      <w:numFmt w:val="decimal"/>
+      <w:lvlText w:val="%3."/>
+      <w:lvlJc w:val="left"/>
+      <w:pPr>
+        <w:tabs>
+          <w:tab w:val="num" w:pos="2160"/>
+        </w:tabs>
+        <w:ind w:left="2160" w:hanging="360"/>
+      </w:pPr>
+    </w:lvl>
+    <w:lvl w:ilvl="3" w:tentative="1">
+      <w:start w:val="1"/>
+      <w:numFmt w:val="decimal"/>
+      <w:lvlText w:val="%4."/>
+      <w:lvlJc w:val="left"/>
+      <w:pPr>
+        <w:tabs>
+          <w:tab w:val="num" w:pos="2880"/>
+        </w:tabs>
+        <w:ind w:left="2880" w:hanging="360"/>
+      </w:pPr>
+    </w:lvl>
+    <w:lvl w:ilvl="4" w:tentative="1">
+      <w:start w:val="1"/>
+      <w:numFmt w:val="decimal"/>
+      <w:lvlText w:val="%5."/>
+      <w:lvlJc w:val="left"/>
+      <w:pPr>
+        <w:tabs>
+          <w:tab w:val="num" w:pos="3600"/>
+        </w:tabs>
+        <w:ind w:left="3600" w:hanging="360"/>
+      </w:pPr>
+    </w:lvl>
+    <w:lvl w:ilvl="5" w:tentative="1">
+      <w:start w:val="1"/>
+      <w:numFmt w:val="decimal"/>
+      <w:lvlText w:val="%6."/>
+      <w:lvlJc w:val="left"/>
+      <w:pPr>
+        <w:tabs>
+          <w:tab w:val="num" w:pos="4320"/>
+        </w:tabs>
+        <w:ind w:left="4320" w:hanging="360"/>
+      </w:pPr>
+    </w:lvl>
+    <w:lvl w:ilvl="6" w:tentative="1">
+      <w:start w:val="1"/>
+      <w:numFmt w:val="decimal"/>
+      <w:lvlText w:val="%7."/>
+      <w:lvlJc w:val="left"/>
+      <w:pPr>
+        <w:tabs>
+          <w:tab w:val="num" w:pos="5040"/>
+        </w:tabs>
+        <w:ind w:left="5040" w:hanging="360"/>
+      </w:pPr>
+    </w:lvl>
+    <w:lvl w:ilvl="7" w:tentative="1">
+      <w:start w:val="1"/>
+      <w:numFmt w:val="decimal"/>
+      <w:lvlText w:val="%8."/>
+      <w:lvlJc w:val="left"/>
+      <w:pPr>
+        <w:tabs>
+          <w:tab w:val="num" w:pos="5760"/>
+        </w:tabs>
+        <w:ind w:left="5760" w:hanging="360"/>
+      </w:pPr>
+    </w:lvl>
+    <w:lvl w:ilvl="8" w:tentative="1">
+      <w:start w:val="1"/>
+      <w:numFmt w:val="decimal"/>
+      <w:lvlText w:val="%9."/>
+      <w:lvlJc w:val="left"/>
+      <w:pPr>
+        <w:tabs>
+          <w:tab w:val="num" w:pos="6480"/>
+        </w:tabs>
+        <w:ind w:left="6480" w:hanging="360"/>
+      </w:pPr>
+    </w:lvl>
+  </w:abstractNum>
+  <w:abstractNum w:abstractNumId="21" w15:restartNumberingAfterBreak="0">
+    <w:nsid w:val="5B3F5280"/>
+    <w:multiLevelType w:val="multilevel"/>
+    <w:tmpl w:val="7A323152"/>
+    <w:lvl w:ilvl="0">
+      <w:start w:val="39"/>
+      <w:numFmt w:val="decimal"/>
+      <w:lvlText w:val="%1."/>
+      <w:lvlJc w:val="left"/>
+      <w:pPr>
+        <w:tabs>
+          <w:tab w:val="num" w:pos="720"/>
+        </w:tabs>
+        <w:ind w:left="720" w:hanging="360"/>
+      </w:pPr>
+    </w:lvl>
+    <w:lvl w:ilvl="1" w:tentative="1">
+      <w:start w:val="1"/>
+      <w:numFmt w:val="decimal"/>
+      <w:lvlText w:val="%2."/>
+      <w:lvlJc w:val="left"/>
+      <w:pPr>
+        <w:tabs>
+          <w:tab w:val="num" w:pos="1440"/>
+        </w:tabs>
+        <w:ind w:left="1440" w:hanging="360"/>
+      </w:pPr>
+    </w:lvl>
+    <w:lvl w:ilvl="2" w:tentative="1">
+      <w:start w:val="1"/>
+      <w:numFmt w:val="decimal"/>
+      <w:lvlText w:val="%3."/>
+      <w:lvlJc w:val="left"/>
+      <w:pPr>
+        <w:tabs>
+          <w:tab w:val="num" w:pos="2160"/>
+        </w:tabs>
+        <w:ind w:left="2160" w:hanging="360"/>
+      </w:pPr>
+    </w:lvl>
+    <w:lvl w:ilvl="3" w:tentative="1">
+      <w:start w:val="1"/>
+      <w:numFmt w:val="decimal"/>
+      <w:lvlText w:val="%4."/>
+      <w:lvlJc w:val="left"/>
+      <w:pPr>
+        <w:tabs>
+          <w:tab w:val="num" w:pos="2880"/>
+        </w:tabs>
+        <w:ind w:left="2880" w:hanging="360"/>
+      </w:pPr>
+    </w:lvl>
+    <w:lvl w:ilvl="4" w:tentative="1">
+      <w:start w:val="1"/>
+      <w:numFmt w:val="decimal"/>
+      <w:lvlText w:val="%5."/>
+      <w:lvlJc w:val="left"/>
+      <w:pPr>
+        <w:tabs>
+          <w:tab w:val="num" w:pos="3600"/>
+        </w:tabs>
+        <w:ind w:left="3600" w:hanging="360"/>
+      </w:pPr>
+    </w:lvl>
+    <w:lvl w:ilvl="5" w:tentative="1">
+      <w:start w:val="1"/>
+      <w:numFmt w:val="decimal"/>
+      <w:lvlText w:val="%6."/>
+      <w:lvlJc w:val="left"/>
+      <w:pPr>
+        <w:tabs>
+          <w:tab w:val="num" w:pos="4320"/>
+        </w:tabs>
+        <w:ind w:left="4320" w:hanging="360"/>
+      </w:pPr>
+    </w:lvl>
+    <w:lvl w:ilvl="6" w:tentative="1">
+      <w:start w:val="1"/>
+      <w:numFmt w:val="decimal"/>
+      <w:lvlText w:val="%7."/>
+      <w:lvlJc w:val="left"/>
+      <w:pPr>
+        <w:tabs>
+          <w:tab w:val="num" w:pos="5040"/>
+        </w:tabs>
+        <w:ind w:left="5040" w:hanging="360"/>
+      </w:pPr>
+    </w:lvl>
+    <w:lvl w:ilvl="7" w:tentative="1">
+      <w:start w:val="1"/>
+      <w:numFmt w:val="decimal"/>
+      <w:lvlText w:val="%8."/>
+      <w:lvlJc w:val="left"/>
+      <w:pPr>
+        <w:tabs>
+          <w:tab w:val="num" w:pos="5760"/>
+        </w:tabs>
+        <w:ind w:left="5760" w:hanging="360"/>
+      </w:pPr>
+    </w:lvl>
+    <w:lvl w:ilvl="8" w:tentative="1">
+      <w:start w:val="1"/>
+      <w:numFmt w:val="decimal"/>
+      <w:lvlText w:val="%9."/>
+      <w:lvlJc w:val="left"/>
+      <w:pPr>
+        <w:tabs>
+          <w:tab w:val="num" w:pos="6480"/>
+        </w:tabs>
+        <w:ind w:left="6480" w:hanging="360"/>
+      </w:pPr>
+    </w:lvl>
+  </w:abstractNum>
+  <w:abstractNum w:abstractNumId="22" w15:restartNumberingAfterBreak="0">
     <w:nsid w:val="5F2607EA"/>
     <w:multiLevelType w:val="multilevel"/>
     <w:tmpl w:val="A5227854"/>
@@ -644,7 +3255,386 @@
       </w:pPr>
     </w:lvl>
   </w:abstractNum>
-  <w:abstractNum w:abstractNumId="5" w15:restartNumberingAfterBreak="0">
+  <w:abstractNum w:abstractNumId="23" w15:restartNumberingAfterBreak="0">
+    <w:nsid w:val="65857AB9"/>
+    <w:multiLevelType w:val="multilevel"/>
+    <w:tmpl w:val="D0C0115C"/>
+    <w:lvl w:ilvl="0">
+      <w:start w:val="19"/>
+      <w:numFmt w:val="decimal"/>
+      <w:lvlText w:val="%1."/>
+      <w:lvlJc w:val="left"/>
+      <w:pPr>
+        <w:tabs>
+          <w:tab w:val="num" w:pos="720"/>
+        </w:tabs>
+        <w:ind w:left="720" w:hanging="360"/>
+      </w:pPr>
+    </w:lvl>
+    <w:lvl w:ilvl="1" w:tentative="1">
+      <w:start w:val="1"/>
+      <w:numFmt w:val="decimal"/>
+      <w:lvlText w:val="%2."/>
+      <w:lvlJc w:val="left"/>
+      <w:pPr>
+        <w:tabs>
+          <w:tab w:val="num" w:pos="1440"/>
+        </w:tabs>
+        <w:ind w:left="1440" w:hanging="360"/>
+      </w:pPr>
+    </w:lvl>
+    <w:lvl w:ilvl="2" w:tentative="1">
+      <w:start w:val="1"/>
+      <w:numFmt w:val="decimal"/>
+      <w:lvlText w:val="%3."/>
+      <w:lvlJc w:val="left"/>
+      <w:pPr>
+        <w:tabs>
+          <w:tab w:val="num" w:pos="2160"/>
+        </w:tabs>
+        <w:ind w:left="2160" w:hanging="360"/>
+      </w:pPr>
+    </w:lvl>
+    <w:lvl w:ilvl="3" w:tentative="1">
+      <w:start w:val="1"/>
+      <w:numFmt w:val="decimal"/>
+      <w:lvlText w:val="%4."/>
+      <w:lvlJc w:val="left"/>
+      <w:pPr>
+        <w:tabs>
+          <w:tab w:val="num" w:pos="2880"/>
+        </w:tabs>
+        <w:ind w:left="2880" w:hanging="360"/>
+      </w:pPr>
+    </w:lvl>
+    <w:lvl w:ilvl="4" w:tentative="1">
+      <w:start w:val="1"/>
+      <w:numFmt w:val="decimal"/>
+      <w:lvlText w:val="%5."/>
+      <w:lvlJc w:val="left"/>
+      <w:pPr>
+        <w:tabs>
+          <w:tab w:val="num" w:pos="3600"/>
+        </w:tabs>
+        <w:ind w:left="3600" w:hanging="360"/>
+      </w:pPr>
+    </w:lvl>
+    <w:lvl w:ilvl="5" w:tentative="1">
+      <w:start w:val="1"/>
+      <w:numFmt w:val="decimal"/>
+      <w:lvlText w:val="%6."/>
+      <w:lvlJc w:val="left"/>
+      <w:pPr>
+        <w:tabs>
+          <w:tab w:val="num" w:pos="4320"/>
+        </w:tabs>
+        <w:ind w:left="4320" w:hanging="360"/>
+      </w:pPr>
+    </w:lvl>
+    <w:lvl w:ilvl="6" w:tentative="1">
+      <w:start w:val="1"/>
+      <w:numFmt w:val="decimal"/>
+      <w:lvlText w:val="%7."/>
+      <w:lvlJc w:val="left"/>
+      <w:pPr>
+        <w:tabs>
+          <w:tab w:val="num" w:pos="5040"/>
+        </w:tabs>
+        <w:ind w:left="5040" w:hanging="360"/>
+      </w:pPr>
+    </w:lvl>
+    <w:lvl w:ilvl="7" w:tentative="1">
+      <w:start w:val="1"/>
+      <w:numFmt w:val="decimal"/>
+      <w:lvlText w:val="%8."/>
+      <w:lvlJc w:val="left"/>
+      <w:pPr>
+        <w:tabs>
+          <w:tab w:val="num" w:pos="5760"/>
+        </w:tabs>
+        <w:ind w:left="5760" w:hanging="360"/>
+      </w:pPr>
+    </w:lvl>
+    <w:lvl w:ilvl="8" w:tentative="1">
+      <w:start w:val="1"/>
+      <w:numFmt w:val="decimal"/>
+      <w:lvlText w:val="%9."/>
+      <w:lvlJc w:val="left"/>
+      <w:pPr>
+        <w:tabs>
+          <w:tab w:val="num" w:pos="6480"/>
+        </w:tabs>
+        <w:ind w:left="6480" w:hanging="360"/>
+      </w:pPr>
+    </w:lvl>
+  </w:abstractNum>
+  <w:abstractNum w:abstractNumId="24" w15:restartNumberingAfterBreak="0">
+    <w:nsid w:val="687B7EE3"/>
+    <w:multiLevelType w:val="multilevel"/>
+    <w:tmpl w:val="56D45ABA"/>
+    <w:lvl w:ilvl="0">
+      <w:start w:val="8"/>
+      <w:numFmt w:val="decimal"/>
+      <w:lvlText w:val="%1."/>
+      <w:lvlJc w:val="left"/>
+      <w:pPr>
+        <w:tabs>
+          <w:tab w:val="num" w:pos="720"/>
+        </w:tabs>
+        <w:ind w:left="720" w:hanging="360"/>
+      </w:pPr>
+    </w:lvl>
+    <w:lvl w:ilvl="1">
+      <w:start w:val="1"/>
+      <w:numFmt w:val="bullet"/>
+      <w:lvlText w:val=""/>
+      <w:lvlJc w:val="left"/>
+      <w:pPr>
+        <w:tabs>
+          <w:tab w:val="num" w:pos="1440"/>
+        </w:tabs>
+        <w:ind w:left="1440" w:hanging="360"/>
+      </w:pPr>
+      <w:rPr>
+        <w:rFonts w:ascii="Symbol" w:hAnsi="Symbol" w:hint="default"/>
+        <w:sz w:val="20"/>
+      </w:rPr>
+    </w:lvl>
+    <w:lvl w:ilvl="2" w:tentative="1">
+      <w:start w:val="1"/>
+      <w:numFmt w:val="decimal"/>
+      <w:lvlText w:val="%3."/>
+      <w:lvlJc w:val="left"/>
+      <w:pPr>
+        <w:tabs>
+          <w:tab w:val="num" w:pos="2160"/>
+        </w:tabs>
+        <w:ind w:left="2160" w:hanging="360"/>
+      </w:pPr>
+    </w:lvl>
+    <w:lvl w:ilvl="3" w:tentative="1">
+      <w:start w:val="1"/>
+      <w:numFmt w:val="decimal"/>
+      <w:lvlText w:val="%4."/>
+      <w:lvlJc w:val="left"/>
+      <w:pPr>
+        <w:tabs>
+          <w:tab w:val="num" w:pos="2880"/>
+        </w:tabs>
+        <w:ind w:left="2880" w:hanging="360"/>
+      </w:pPr>
+    </w:lvl>
+    <w:lvl w:ilvl="4" w:tentative="1">
+      <w:start w:val="1"/>
+      <w:numFmt w:val="decimal"/>
+      <w:lvlText w:val="%5."/>
+      <w:lvlJc w:val="left"/>
+      <w:pPr>
+        <w:tabs>
+          <w:tab w:val="num" w:pos="3600"/>
+        </w:tabs>
+        <w:ind w:left="3600" w:hanging="360"/>
+      </w:pPr>
+    </w:lvl>
+    <w:lvl w:ilvl="5" w:tentative="1">
+      <w:start w:val="1"/>
+      <w:numFmt w:val="decimal"/>
+      <w:lvlText w:val="%6."/>
+      <w:lvlJc w:val="left"/>
+      <w:pPr>
+        <w:tabs>
+          <w:tab w:val="num" w:pos="4320"/>
+        </w:tabs>
+        <w:ind w:left="4320" w:hanging="360"/>
+      </w:pPr>
+    </w:lvl>
+    <w:lvl w:ilvl="6" w:tentative="1">
+      <w:start w:val="1"/>
+      <w:numFmt w:val="decimal"/>
+      <w:lvlText w:val="%7."/>
+      <w:lvlJc w:val="left"/>
+      <w:pPr>
+        <w:tabs>
+          <w:tab w:val="num" w:pos="5040"/>
+        </w:tabs>
+        <w:ind w:left="5040" w:hanging="360"/>
+      </w:pPr>
+    </w:lvl>
+    <w:lvl w:ilvl="7" w:tentative="1">
+      <w:start w:val="1"/>
+      <w:numFmt w:val="decimal"/>
+      <w:lvlText w:val="%8."/>
+      <w:lvlJc w:val="left"/>
+      <w:pPr>
+        <w:tabs>
+          <w:tab w:val="num" w:pos="5760"/>
+        </w:tabs>
+        <w:ind w:left="5760" w:hanging="360"/>
+      </w:pPr>
+    </w:lvl>
+    <w:lvl w:ilvl="8" w:tentative="1">
+      <w:start w:val="1"/>
+      <w:numFmt w:val="decimal"/>
+      <w:lvlText w:val="%9."/>
+      <w:lvlJc w:val="left"/>
+      <w:pPr>
+        <w:tabs>
+          <w:tab w:val="num" w:pos="6480"/>
+        </w:tabs>
+        <w:ind w:left="6480" w:hanging="360"/>
+      </w:pPr>
+    </w:lvl>
+  </w:abstractNum>
+  <w:abstractNum w:abstractNumId="25" w15:restartNumberingAfterBreak="0">
+    <w:nsid w:val="737476F9"/>
+    <w:multiLevelType w:val="multilevel"/>
+    <w:tmpl w:val="0F8A7D72"/>
+    <w:lvl w:ilvl="0">
+      <w:start w:val="1"/>
+      <w:numFmt w:val="bullet"/>
+      <w:lvlText w:val=""/>
+      <w:lvlJc w:val="left"/>
+      <w:pPr>
+        <w:tabs>
+          <w:tab w:val="num" w:pos="720"/>
+        </w:tabs>
+        <w:ind w:left="720" w:hanging="360"/>
+      </w:pPr>
+      <w:rPr>
+        <w:rFonts w:ascii="Symbol" w:hAnsi="Symbol" w:hint="default"/>
+        <w:sz w:val="20"/>
+      </w:rPr>
+    </w:lvl>
+    <w:lvl w:ilvl="1" w:tentative="1">
+      <w:start w:val="1"/>
+      <w:numFmt w:val="bullet"/>
+      <w:lvlText w:val=""/>
+      <w:lvlJc w:val="left"/>
+      <w:pPr>
+        <w:tabs>
+          <w:tab w:val="num" w:pos="1440"/>
+        </w:tabs>
+        <w:ind w:left="1440" w:hanging="360"/>
+      </w:pPr>
+      <w:rPr>
+        <w:rFonts w:ascii="Symbol" w:hAnsi="Symbol" w:hint="default"/>
+        <w:sz w:val="20"/>
+      </w:rPr>
+    </w:lvl>
+    <w:lvl w:ilvl="2" w:tentative="1">
+      <w:start w:val="1"/>
+      <w:numFmt w:val="bullet"/>
+      <w:lvlText w:val=""/>
+      <w:lvlJc w:val="left"/>
+      <w:pPr>
+        <w:tabs>
+          <w:tab w:val="num" w:pos="2160"/>
+        </w:tabs>
+        <w:ind w:left="2160" w:hanging="360"/>
+      </w:pPr>
+      <w:rPr>
+        <w:rFonts w:ascii="Symbol" w:hAnsi="Symbol" w:hint="default"/>
+        <w:sz w:val="20"/>
+      </w:rPr>
+    </w:lvl>
+    <w:lvl w:ilvl="3" w:tentative="1">
+      <w:start w:val="1"/>
+      <w:numFmt w:val="bullet"/>
+      <w:lvlText w:val=""/>
+      <w:lvlJc w:val="left"/>
+      <w:pPr>
+        <w:tabs>
+          <w:tab w:val="num" w:pos="2880"/>
+        </w:tabs>
+        <w:ind w:left="2880" w:hanging="360"/>
+      </w:pPr>
+      <w:rPr>
+        <w:rFonts w:ascii="Symbol" w:hAnsi="Symbol" w:hint="default"/>
+        <w:sz w:val="20"/>
+      </w:rPr>
+    </w:lvl>
+    <w:lvl w:ilvl="4" w:tentative="1">
+      <w:start w:val="1"/>
+      <w:numFmt w:val="bullet"/>
+      <w:lvlText w:val=""/>
+      <w:lvlJc w:val="left"/>
+      <w:pPr>
+        <w:tabs>
+          <w:tab w:val="num" w:pos="3600"/>
+        </w:tabs>
+        <w:ind w:left="3600" w:hanging="360"/>
+      </w:pPr>
+      <w:rPr>
+        <w:rFonts w:ascii="Symbol" w:hAnsi="Symbol" w:hint="default"/>
+        <w:sz w:val="20"/>
+      </w:rPr>
+    </w:lvl>
+    <w:lvl w:ilvl="5" w:tentative="1">
+      <w:start w:val="1"/>
+      <w:numFmt w:val="bullet"/>
+      <w:lvlText w:val=""/>
+      <w:lvlJc w:val="left"/>
+      <w:pPr>
+        <w:tabs>
+          <w:tab w:val="num" w:pos="4320"/>
+        </w:tabs>
+        <w:ind w:left="4320" w:hanging="360"/>
+      </w:pPr>
+      <w:rPr>
+        <w:rFonts w:ascii="Symbol" w:hAnsi="Symbol" w:hint="default"/>
+        <w:sz w:val="20"/>
+      </w:rPr>
+    </w:lvl>
+    <w:lvl w:ilvl="6" w:tentative="1">
+      <w:start w:val="1"/>
+      <w:numFmt w:val="bullet"/>
+      <w:lvlText w:val=""/>
+      <w:lvlJc w:val="left"/>
+      <w:pPr>
+        <w:tabs>
+          <w:tab w:val="num" w:pos="5040"/>
+        </w:tabs>
+        <w:ind w:left="5040" w:hanging="360"/>
+      </w:pPr>
+      <w:rPr>
+        <w:rFonts w:ascii="Symbol" w:hAnsi="Symbol" w:hint="default"/>
+        <w:sz w:val="20"/>
+      </w:rPr>
+    </w:lvl>
+    <w:lvl w:ilvl="7" w:tentative="1">
+      <w:start w:val="1"/>
+      <w:numFmt w:val="bullet"/>
+      <w:lvlText w:val=""/>
+      <w:lvlJc w:val="left"/>
+      <w:pPr>
+        <w:tabs>
+          <w:tab w:val="num" w:pos="5760"/>
+        </w:tabs>
+        <w:ind w:left="5760" w:hanging="360"/>
+      </w:pPr>
+      <w:rPr>
+        <w:rFonts w:ascii="Symbol" w:hAnsi="Symbol" w:hint="default"/>
+        <w:sz w:val="20"/>
+      </w:rPr>
+    </w:lvl>
+    <w:lvl w:ilvl="8" w:tentative="1">
+      <w:start w:val="1"/>
+      <w:numFmt w:val="bullet"/>
+      <w:lvlText w:val=""/>
+      <w:lvlJc w:val="left"/>
+      <w:pPr>
+        <w:tabs>
+          <w:tab w:val="num" w:pos="6480"/>
+        </w:tabs>
+        <w:ind w:left="6480" w:hanging="360"/>
+      </w:pPr>
+      <w:rPr>
+        <w:rFonts w:ascii="Symbol" w:hAnsi="Symbol" w:hint="default"/>
+        <w:sz w:val="20"/>
+      </w:rPr>
+    </w:lvl>
+  </w:abstractNum>
+  <w:abstractNum w:abstractNumId="26" w15:restartNumberingAfterBreak="0">
     <w:nsid w:val="74275769"/>
     <w:multiLevelType w:val="multilevel"/>
     <w:tmpl w:val="2F6A8366"/>
@@ -757,7 +3747,7 @@
       </w:pPr>
     </w:lvl>
   </w:abstractNum>
-  <w:abstractNum w:abstractNumId="6" w15:restartNumberingAfterBreak="0">
+  <w:abstractNum w:abstractNumId="27" w15:restartNumberingAfterBreak="0">
     <w:nsid w:val="754227C3"/>
     <w:multiLevelType w:val="multilevel"/>
     <w:tmpl w:val="3E00FCDA"/>
@@ -871,25 +3861,88 @@
     </w:lvl>
   </w:abstractNum>
   <w:num w:numId="1" w16cid:durableId="304745820">
+    <w:abstractNumId w:val="14"/>
+  </w:num>
+  <w:num w:numId="2" w16cid:durableId="1865827512">
+    <w:abstractNumId w:val="27"/>
+  </w:num>
+  <w:num w:numId="3" w16cid:durableId="367729933">
+    <w:abstractNumId w:val="18"/>
+  </w:num>
+  <w:num w:numId="4" w16cid:durableId="93786539">
+    <w:abstractNumId w:val="8"/>
+  </w:num>
+  <w:num w:numId="5" w16cid:durableId="1018386414">
+    <w:abstractNumId w:val="10"/>
+  </w:num>
+  <w:num w:numId="6" w16cid:durableId="768234242">
+    <w:abstractNumId w:val="26"/>
+  </w:num>
+  <w:num w:numId="7" w16cid:durableId="1567569997">
+    <w:abstractNumId w:val="22"/>
+  </w:num>
+  <w:num w:numId="8" w16cid:durableId="1845778941">
+    <w:abstractNumId w:val="6"/>
+  </w:num>
+  <w:num w:numId="9" w16cid:durableId="971518908">
+    <w:abstractNumId w:val="13"/>
+  </w:num>
+  <w:num w:numId="10" w16cid:durableId="745803538">
+    <w:abstractNumId w:val="20"/>
+  </w:num>
+  <w:num w:numId="11" w16cid:durableId="1667130054">
+    <w:abstractNumId w:val="12"/>
+  </w:num>
+  <w:num w:numId="12" w16cid:durableId="1404377431">
     <w:abstractNumId w:val="2"/>
   </w:num>
-  <w:num w:numId="2" w16cid:durableId="1865827512">
-    <w:abstractNumId w:val="6"/>
+  <w:num w:numId="13" w16cid:durableId="529881486">
+    <w:abstractNumId w:val="0"/>
   </w:num>
-  <w:num w:numId="3" w16cid:durableId="367729933">
+  <w:num w:numId="14" w16cid:durableId="212430287">
+    <w:abstractNumId w:val="15"/>
+  </w:num>
+  <w:num w:numId="15" w16cid:durableId="345790991">
+    <w:abstractNumId w:val="24"/>
+  </w:num>
+  <w:num w:numId="16" w16cid:durableId="1854683628">
+    <w:abstractNumId w:val="17"/>
+  </w:num>
+  <w:num w:numId="17" w16cid:durableId="2041124838">
+    <w:abstractNumId w:val="16"/>
+  </w:num>
+  <w:num w:numId="18" w16cid:durableId="554707417">
+    <w:abstractNumId w:val="1"/>
+  </w:num>
+  <w:num w:numId="19" w16cid:durableId="499007758">
+    <w:abstractNumId w:val="5"/>
+  </w:num>
+  <w:num w:numId="20" w16cid:durableId="639309332">
+    <w:abstractNumId w:val="23"/>
+  </w:num>
+  <w:num w:numId="21" w16cid:durableId="2061320164">
+    <w:abstractNumId w:val="9"/>
+  </w:num>
+  <w:num w:numId="22" w16cid:durableId="1864316892">
+    <w:abstractNumId w:val="19"/>
+  </w:num>
+  <w:num w:numId="23" w16cid:durableId="518667945">
+    <w:abstractNumId w:val="11"/>
+  </w:num>
+  <w:num w:numId="24" w16cid:durableId="449668364">
     <w:abstractNumId w:val="3"/>
   </w:num>
-  <w:num w:numId="4" w16cid:durableId="93786539">
-    <w:abstractNumId w:val="0"/>
+  <w:num w:numId="25" w16cid:durableId="939799134">
+    <w:abstractNumId w:val="21"/>
   </w:num>
-  <w:num w:numId="5" w16cid:durableId="1018386414">
-    <w:abstractNumId w:val="1"/>
+  <w:num w:numId="26" w16cid:durableId="1909462324">
+    <w:abstractNumId w:val="25"/>
   </w:num>
-  <w:num w:numId="6" w16cid:durableId="768234242">
-    <w:abstractNumId w:val="5"/>
+  <w:num w:numId="27" w16cid:durableId="1907758480">
+    <w:abstractNumId w:val="4"/>
   </w:num>
-  <w:num w:numId="7" w16cid:durableId="1567569997">
-    <w:abstractNumId w:val="4"/>
+  <w:num w:numId="28" w16cid:durableId="131489892">
+    <w:abstractNumId w:val="7"/>
   </w:num>
 </w:numbering>
 </file>
@@ -1294,6 +4347,7 @@
   <w:style w:type="paragraph" w:default="1" w:styleId="Normal">
     <w:name w:val="Normal"/>
     <w:qFormat/>
+    <w:rsid w:val="00823B8F"/>
   </w:style>
   <w:style w:type="paragraph" w:styleId="Heading1">
     <w:name w:val="heading 1"/>

</xml_diff>

<commit_message>
two staged rain forecasting with lstm and xgboost
</commit_message>
<xml_diff>
--- a/Documents/Dataset_Question.docx
+++ b/Documents/Dataset_Question.docx
@@ -2027,8 +2027,13 @@
         </w:numPr>
       </w:pPr>
       <w:r>
-        <w:t>Reduced pollination success</w:t>
-      </w:r>
+        <w:t xml:space="preserve">Reduced </w:t>
+      </w:r>
+      <w:proofErr w:type="gramStart"/>
+      <w:r>
+        <w:t>pollination success</w:t>
+      </w:r>
+      <w:proofErr w:type="gramEnd"/>
     </w:p>
     <w:p>
       <w:pPr>
@@ -2146,7 +2151,15 @@
         <w:t>Q21:</w:t>
       </w:r>
       <w:r>
-        <w:t> If rain &gt;10mm expected, skip irrigation. If 5-10mm expected, irrigate 30-50% of requirement. Consider crop stage urgency - reproductive stage takes priority.</w:t>
+        <w:t xml:space="preserve"> If rain </w:t>
+      </w:r>
+      <w:proofErr w:type="gramStart"/>
+      <w:r>
+        <w:t>&gt;10</w:t>
+      </w:r>
+      <w:proofErr w:type="gramEnd"/>
+      <w:r>
+        <w:t>mm expected, skip irrigation. If 5-10mm expected, irrigate 30-50% of requirement. Consider crop stage urgency - reproductive stage takes priority.</w:t>
       </w:r>
     </w:p>
     <w:p>
@@ -2344,7 +2357,15 @@
         </w:numPr>
       </w:pPr>
       <w:r>
-        <w:t>Ripening: Reduce to intermittent irrigation or drain field</w:t>
+        <w:t xml:space="preserve">Ripening: </w:t>
+      </w:r>
+      <w:proofErr w:type="gramStart"/>
+      <w:r>
+        <w:t>Reduce to</w:t>
+      </w:r>
+      <w:proofErr w:type="gramEnd"/>
+      <w:r>
+        <w:t xml:space="preserve"> intermittent irrigation or drain field</w:t>
       </w:r>
       <w:r>
         <w:rPr>
@@ -3278,11 +3299,154 @@
           <w:i/>
           <w:iCs/>
         </w:rPr>
-        <w:t>Justification: The system addresses critical water management needs for Sri Lankan paddy cultivation. The integration of real-time sensing, weather forecasting, and automated control aligns well with precision agriculture needs. Rating not 5/5 because field validation is needed and initial synthetic dataset limitations exist.</w:t>
+        <w:t xml:space="preserve">Justification: The system addresses critical water management needs for Sri Lankan paddy cultivation. The integration of real-time sensing, weather forecasting, and automated control aligns well with precision agriculture needs. Rating </w:t>
+      </w:r>
+      <w:proofErr w:type="gramStart"/>
+      <w:r>
+        <w:rPr>
+          <w:i/>
+          <w:iCs/>
+        </w:rPr>
+        <w:t>not</w:t>
+      </w:r>
+      <w:proofErr w:type="gramEnd"/>
+      <w:r>
+        <w:rPr>
+          <w:i/>
+          <w:iCs/>
+        </w:rPr>
+        <w:t xml:space="preserve"> 5/5 because field validation is needed and initial synthetic dataset limitations exist.</w:t>
       </w:r>
     </w:p>
     <w:p/>
     <w:p/>
+    <w:p>
+      <w:r>
+        <w:br w:type="page"/>
+      </w:r>
+    </w:p>
+    <w:p>
+      <w:r>
+        <w:lastRenderedPageBreak/>
+        <w:drawing>
+          <wp:inline distT="0" distB="0" distL="0" distR="0" wp14:anchorId="793CA9B3" wp14:editId="0B68E6D5">
+            <wp:extent cx="5943600" cy="3953510"/>
+            <wp:effectExtent l="0" t="0" r="0" b="8890"/>
+            <wp:docPr id="904317077" name="Picture 1"/>
+            <wp:cNvGraphicFramePr>
+              <a:graphicFrameLocks xmlns:a="http://schemas.openxmlformats.org/drawingml/2006/main" noChangeAspect="1"/>
+            </wp:cNvGraphicFramePr>
+            <a:graphic xmlns:a="http://schemas.openxmlformats.org/drawingml/2006/main">
+              <a:graphicData uri="http://schemas.openxmlformats.org/drawingml/2006/picture">
+                <pic:pic xmlns:pic="http://schemas.openxmlformats.org/drawingml/2006/picture">
+                  <pic:nvPicPr>
+                    <pic:cNvPr id="904317077" name=""/>
+                    <pic:cNvPicPr/>
+                  </pic:nvPicPr>
+                  <pic:blipFill>
+                    <a:blip r:embed="rId5"/>
+                    <a:stretch>
+                      <a:fillRect/>
+                    </a:stretch>
+                  </pic:blipFill>
+                  <pic:spPr>
+                    <a:xfrm>
+                      <a:off x="0" y="0"/>
+                      <a:ext cx="5943600" cy="3953510"/>
+                    </a:xfrm>
+                    <a:prstGeom prst="rect">
+                      <a:avLst/>
+                    </a:prstGeom>
+                  </pic:spPr>
+                </pic:pic>
+              </a:graphicData>
+            </a:graphic>
+          </wp:inline>
+        </w:drawing>
+      </w:r>
+    </w:p>
+    <w:p/>
+    <w:p/>
+    <w:p>
+      <w:r>
+        <w:lastRenderedPageBreak/>
+        <w:drawing>
+          <wp:inline distT="0" distB="0" distL="0" distR="0" wp14:anchorId="0F7366F0" wp14:editId="690B7879">
+            <wp:extent cx="5943600" cy="3953510"/>
+            <wp:effectExtent l="0" t="0" r="0" b="8890"/>
+            <wp:docPr id="1254614384" name="Picture 1"/>
+            <wp:cNvGraphicFramePr>
+              <a:graphicFrameLocks xmlns:a="http://schemas.openxmlformats.org/drawingml/2006/main" noChangeAspect="1"/>
+            </wp:cNvGraphicFramePr>
+            <a:graphic xmlns:a="http://schemas.openxmlformats.org/drawingml/2006/main">
+              <a:graphicData uri="http://schemas.openxmlformats.org/drawingml/2006/picture">
+                <pic:pic xmlns:pic="http://schemas.openxmlformats.org/drawingml/2006/picture">
+                  <pic:nvPicPr>
+                    <pic:cNvPr id="1254614384" name=""/>
+                    <pic:cNvPicPr/>
+                  </pic:nvPicPr>
+                  <pic:blipFill>
+                    <a:blip r:embed="rId6"/>
+                    <a:stretch>
+                      <a:fillRect/>
+                    </a:stretch>
+                  </pic:blipFill>
+                  <pic:spPr>
+                    <a:xfrm>
+                      <a:off x="0" y="0"/>
+                      <a:ext cx="5943600" cy="3953510"/>
+                    </a:xfrm>
+                    <a:prstGeom prst="rect">
+                      <a:avLst/>
+                    </a:prstGeom>
+                  </pic:spPr>
+                </pic:pic>
+              </a:graphicData>
+            </a:graphic>
+          </wp:inline>
+        </w:drawing>
+      </w:r>
+    </w:p>
+    <w:p/>
+    <w:p>
+      <w:r>
+        <w:drawing>
+          <wp:inline distT="0" distB="0" distL="0" distR="0" wp14:anchorId="4C24FED1" wp14:editId="42B9B5B9">
+            <wp:extent cx="5943600" cy="2663190"/>
+            <wp:effectExtent l="0" t="0" r="0" b="3810"/>
+            <wp:docPr id="1274635441" name="Picture 1"/>
+            <wp:cNvGraphicFramePr>
+              <a:graphicFrameLocks xmlns:a="http://schemas.openxmlformats.org/drawingml/2006/main" noChangeAspect="1"/>
+            </wp:cNvGraphicFramePr>
+            <a:graphic xmlns:a="http://schemas.openxmlformats.org/drawingml/2006/main">
+              <a:graphicData uri="http://schemas.openxmlformats.org/drawingml/2006/picture">
+                <pic:pic xmlns:pic="http://schemas.openxmlformats.org/drawingml/2006/picture">
+                  <pic:nvPicPr>
+                    <pic:cNvPr id="1274635441" name=""/>
+                    <pic:cNvPicPr/>
+                  </pic:nvPicPr>
+                  <pic:blipFill>
+                    <a:blip r:embed="rId7"/>
+                    <a:stretch>
+                      <a:fillRect/>
+                    </a:stretch>
+                  </pic:blipFill>
+                  <pic:spPr>
+                    <a:xfrm>
+                      <a:off x="0" y="0"/>
+                      <a:ext cx="5943600" cy="2663190"/>
+                    </a:xfrm>
+                    <a:prstGeom prst="rect">
+                      <a:avLst/>
+                    </a:prstGeom>
+                  </pic:spPr>
+                </pic:pic>
+              </a:graphicData>
+            </a:graphic>
+          </wp:inline>
+        </w:drawing>
+      </w:r>
+    </w:p>
     <w:sectPr>
       <w:pgSz w:w="12240" w:h="15840"/>
       <w:pgMar w:top="1440" w:right="1440" w:bottom="1440" w:left="1440" w:header="720" w:footer="720" w:gutter="0"/>
@@ -8886,6 +9050,7 @@
   <w:style w:type="character" w:default="1" w:styleId="DefaultParagraphFont">
     <w:name w:val="Default Paragraph Font"/>
     <w:uiPriority w:val="1"/>
+    <w:semiHidden/>
     <w:unhideWhenUsed/>
   </w:style>
   <w:style w:type="table" w:default="1" w:styleId="TableNormal">

</xml_diff>

<commit_message>
Added the final pi testing and field deployment codes
</commit_message>
<xml_diff>
--- a/Documents/Dataset_Question.docx
+++ b/Documents/Dataset_Question.docx
@@ -727,36 +727,16 @@
           <w:b/>
           <w:bCs/>
         </w:rPr>
-        <w:t xml:space="preserve">Section </w:t>
-      </w:r>
-      <w:r>
-        <w:rPr>
-          <w:b/>
-          <w:bCs/>
-        </w:rPr>
-        <w:t>8</w:t>
-      </w:r>
-      <w:r>
-        <w:rPr>
-          <w:b/>
-          <w:bCs/>
-        </w:rPr>
-        <w:t>: Output Expectations</w:t>
-      </w:r>
-    </w:p>
-    <w:p>
-      <w:pPr>
-        <w:rPr>
-          <w:b/>
-          <w:bCs/>
-        </w:rPr>
-      </w:pPr>
-      <w:r>
-        <w:rPr>
-          <w:b/>
-          <w:bCs/>
-        </w:rPr>
-        <w:t>Questions about the CWR prediction:</w:t>
+        <w:t>Section 8: Expert Opinion &amp; System Feedback</w:t>
+      </w:r>
+    </w:p>
+    <w:p>
+      <w:r>
+        <w:rPr>
+          <w:b/>
+          <w:bCs/>
+        </w:rPr>
+        <w:t>Questions about your overall assessment of the system</w:t>
       </w:r>
     </w:p>
     <w:p>
@@ -769,864 +749,21 @@
       </w:pPr>
       <w:r>
         <w:lastRenderedPageBreak/>
-        <w:t>Based on typical paddy cultivation, here are 3 example scenarios. Do these calculations seem reasonable?</w:t>
-      </w:r>
-    </w:p>
-    <w:tbl>
-      <w:tblPr>
-        <w:tblW w:w="5000" w:type="pct"/>
-        <w:tblCellMar>
-          <w:top w:w="15" w:type="dxa"/>
-          <w:left w:w="15" w:type="dxa"/>
-          <w:bottom w:w="15" w:type="dxa"/>
-          <w:right w:w="15" w:type="dxa"/>
-        </w:tblCellMar>
-        <w:tblLook w:val="04A0" w:firstRow="1" w:lastRow="0" w:firstColumn="1" w:lastColumn="0" w:noHBand="0" w:noVBand="1"/>
-      </w:tblPr>
-      <w:tblGrid>
-        <w:gridCol w:w="1299"/>
-        <w:gridCol w:w="1721"/>
-        <w:gridCol w:w="1791"/>
-        <w:gridCol w:w="833"/>
-        <w:gridCol w:w="970"/>
-        <w:gridCol w:w="1399"/>
-        <w:gridCol w:w="1331"/>
-      </w:tblGrid>
-      <w:tr>
-        <w:trPr>
-          <w:tblHeader/>
-        </w:trPr>
-        <w:tc>
-          <w:tcPr>
-            <w:tcW w:w="0" w:type="auto"/>
-            <w:tcBorders>
-              <w:top w:val="single" w:sz="6" w:space="0" w:color="DDDDDD"/>
-              <w:left w:val="single" w:sz="6" w:space="0" w:color="DDDDDD"/>
-              <w:bottom w:val="single" w:sz="6" w:space="0" w:color="DDDDDD"/>
-              <w:right w:val="single" w:sz="6" w:space="0" w:color="DDDDDD"/>
-            </w:tcBorders>
-            <w:shd w:val="clear" w:color="auto" w:fill="F2F2F2"/>
-            <w:tcMar>
-              <w:top w:w="120" w:type="dxa"/>
-              <w:left w:w="120" w:type="dxa"/>
-              <w:bottom w:w="120" w:type="dxa"/>
-              <w:right w:w="120" w:type="dxa"/>
-            </w:tcMar>
-            <w:vAlign w:val="center"/>
-            <w:hideMark/>
-          </w:tcPr>
-          <w:p>
-            <w:pPr>
-              <w:rPr>
-                <w:b/>
-                <w:bCs/>
-              </w:rPr>
-            </w:pPr>
-            <w:r>
-              <w:rPr>
-                <w:b/>
-                <w:bCs/>
-              </w:rPr>
-              <w:t>Scenario</w:t>
-            </w:r>
-          </w:p>
-        </w:tc>
-        <w:tc>
-          <w:tcPr>
-            <w:tcW w:w="0" w:type="auto"/>
-            <w:tcBorders>
-              <w:top w:val="single" w:sz="6" w:space="0" w:color="DDDDDD"/>
-              <w:left w:val="single" w:sz="6" w:space="0" w:color="DDDDDD"/>
-              <w:bottom w:val="single" w:sz="6" w:space="0" w:color="DDDDDD"/>
-              <w:right w:val="single" w:sz="6" w:space="0" w:color="DDDDDD"/>
-            </w:tcBorders>
-            <w:shd w:val="clear" w:color="auto" w:fill="F2F2F2"/>
-            <w:tcMar>
-              <w:top w:w="120" w:type="dxa"/>
-              <w:left w:w="120" w:type="dxa"/>
-              <w:bottom w:w="120" w:type="dxa"/>
-              <w:right w:w="120" w:type="dxa"/>
-            </w:tcMar>
-            <w:vAlign w:val="center"/>
-            <w:hideMark/>
-          </w:tcPr>
-          <w:p>
-            <w:pPr>
-              <w:rPr>
-                <w:b/>
-                <w:bCs/>
-              </w:rPr>
-            </w:pPr>
-            <w:r>
-              <w:rPr>
-                <w:b/>
-                <w:bCs/>
-              </w:rPr>
-              <w:t>Water Depth</w:t>
-            </w:r>
-          </w:p>
-        </w:tc>
-        <w:tc>
-          <w:tcPr>
-            <w:tcW w:w="0" w:type="auto"/>
-            <w:tcBorders>
-              <w:top w:val="single" w:sz="6" w:space="0" w:color="DDDDDD"/>
-              <w:left w:val="single" w:sz="6" w:space="0" w:color="DDDDDD"/>
-              <w:bottom w:val="single" w:sz="6" w:space="0" w:color="DDDDDD"/>
-              <w:right w:val="single" w:sz="6" w:space="0" w:color="DDDDDD"/>
-            </w:tcBorders>
-            <w:shd w:val="clear" w:color="auto" w:fill="F2F2F2"/>
-            <w:tcMar>
-              <w:top w:w="120" w:type="dxa"/>
-              <w:left w:w="120" w:type="dxa"/>
-              <w:bottom w:w="120" w:type="dxa"/>
-              <w:right w:w="120" w:type="dxa"/>
-            </w:tcMar>
-            <w:vAlign w:val="center"/>
-            <w:hideMark/>
-          </w:tcPr>
-          <w:p>
-            <w:pPr>
-              <w:rPr>
-                <w:b/>
-                <w:bCs/>
-              </w:rPr>
-            </w:pPr>
-            <w:r>
-              <w:rPr>
-                <w:b/>
-                <w:bCs/>
-              </w:rPr>
-              <w:t>Soil Moisture</w:t>
-            </w:r>
-          </w:p>
-        </w:tc>
-        <w:tc>
-          <w:tcPr>
-            <w:tcW w:w="0" w:type="auto"/>
-            <w:tcBorders>
-              <w:top w:val="single" w:sz="6" w:space="0" w:color="DDDDDD"/>
-              <w:left w:val="single" w:sz="6" w:space="0" w:color="DDDDDD"/>
-              <w:bottom w:val="single" w:sz="6" w:space="0" w:color="DDDDDD"/>
-              <w:right w:val="single" w:sz="6" w:space="0" w:color="DDDDDD"/>
-            </w:tcBorders>
-            <w:shd w:val="clear" w:color="auto" w:fill="F2F2F2"/>
-            <w:tcMar>
-              <w:top w:w="120" w:type="dxa"/>
-              <w:left w:w="120" w:type="dxa"/>
-              <w:bottom w:w="120" w:type="dxa"/>
-              <w:right w:w="120" w:type="dxa"/>
-            </w:tcMar>
-            <w:vAlign w:val="center"/>
-            <w:hideMark/>
-          </w:tcPr>
-          <w:p>
-            <w:pPr>
-              <w:rPr>
-                <w:b/>
-                <w:bCs/>
-              </w:rPr>
-            </w:pPr>
-            <w:r>
-              <w:rPr>
-                <w:b/>
-                <w:bCs/>
-              </w:rPr>
-              <w:t>ET</w:t>
-            </w:r>
-          </w:p>
-        </w:tc>
-        <w:tc>
-          <w:tcPr>
-            <w:tcW w:w="0" w:type="auto"/>
-            <w:tcBorders>
-              <w:top w:val="single" w:sz="6" w:space="0" w:color="DDDDDD"/>
-              <w:left w:val="single" w:sz="6" w:space="0" w:color="DDDDDD"/>
-              <w:bottom w:val="single" w:sz="6" w:space="0" w:color="DDDDDD"/>
-              <w:right w:val="single" w:sz="6" w:space="0" w:color="DDDDDD"/>
-            </w:tcBorders>
-            <w:shd w:val="clear" w:color="auto" w:fill="F2F2F2"/>
-            <w:tcMar>
-              <w:top w:w="120" w:type="dxa"/>
-              <w:left w:w="120" w:type="dxa"/>
-              <w:bottom w:w="120" w:type="dxa"/>
-              <w:right w:w="120" w:type="dxa"/>
-            </w:tcMar>
-            <w:vAlign w:val="center"/>
-            <w:hideMark/>
-          </w:tcPr>
-          <w:p>
-            <w:pPr>
-              <w:rPr>
-                <w:b/>
-                <w:bCs/>
-              </w:rPr>
-            </w:pPr>
-            <w:r>
-              <w:rPr>
-                <w:b/>
-                <w:bCs/>
-              </w:rPr>
-              <w:t>Rain</w:t>
-            </w:r>
-          </w:p>
-        </w:tc>
-        <w:tc>
-          <w:tcPr>
-            <w:tcW w:w="0" w:type="auto"/>
-            <w:tcBorders>
-              <w:top w:val="single" w:sz="6" w:space="0" w:color="DDDDDD"/>
-              <w:left w:val="single" w:sz="6" w:space="0" w:color="DDDDDD"/>
-              <w:bottom w:val="single" w:sz="6" w:space="0" w:color="DDDDDD"/>
-              <w:right w:val="single" w:sz="6" w:space="0" w:color="DDDDDD"/>
-            </w:tcBorders>
-            <w:shd w:val="clear" w:color="auto" w:fill="F2F2F2"/>
-            <w:tcMar>
-              <w:top w:w="120" w:type="dxa"/>
-              <w:left w:w="120" w:type="dxa"/>
-              <w:bottom w:w="120" w:type="dxa"/>
-              <w:right w:w="120" w:type="dxa"/>
-            </w:tcMar>
-            <w:vAlign w:val="center"/>
-            <w:hideMark/>
-          </w:tcPr>
-          <w:p>
-            <w:pPr>
-              <w:rPr>
-                <w:b/>
-                <w:bCs/>
-              </w:rPr>
-            </w:pPr>
-            <w:r>
-              <w:rPr>
-                <w:b/>
-                <w:bCs/>
-              </w:rPr>
-              <w:t>Stage</w:t>
-            </w:r>
-          </w:p>
-        </w:tc>
-        <w:tc>
-          <w:tcPr>
-            <w:tcW w:w="0" w:type="auto"/>
-            <w:tcBorders>
-              <w:top w:val="single" w:sz="6" w:space="0" w:color="DDDDDD"/>
-              <w:left w:val="single" w:sz="6" w:space="0" w:color="DDDDDD"/>
-              <w:bottom w:val="single" w:sz="6" w:space="0" w:color="DDDDDD"/>
-              <w:right w:val="single" w:sz="6" w:space="0" w:color="DDDDDD"/>
-            </w:tcBorders>
-            <w:shd w:val="clear" w:color="auto" w:fill="F2F2F2"/>
-            <w:tcMar>
-              <w:top w:w="120" w:type="dxa"/>
-              <w:left w:w="120" w:type="dxa"/>
-              <w:bottom w:w="120" w:type="dxa"/>
-              <w:right w:w="120" w:type="dxa"/>
-            </w:tcMar>
-            <w:vAlign w:val="center"/>
-            <w:hideMark/>
-          </w:tcPr>
-          <w:p>
-            <w:pPr>
-              <w:rPr>
-                <w:b/>
-                <w:bCs/>
-              </w:rPr>
-            </w:pPr>
-            <w:r>
-              <w:rPr>
-                <w:b/>
-                <w:bCs/>
-              </w:rPr>
-              <w:t>CWR</w:t>
-            </w:r>
-          </w:p>
-        </w:tc>
-      </w:tr>
-      <w:tr>
-        <w:tc>
-          <w:tcPr>
-            <w:tcW w:w="0" w:type="auto"/>
-            <w:tcBorders>
-              <w:top w:val="single" w:sz="6" w:space="0" w:color="DDDDDD"/>
-              <w:left w:val="single" w:sz="6" w:space="0" w:color="DDDDDD"/>
-              <w:bottom w:val="single" w:sz="6" w:space="0" w:color="DDDDDD"/>
-              <w:right w:val="single" w:sz="6" w:space="0" w:color="DDDDDD"/>
-            </w:tcBorders>
-            <w:tcMar>
-              <w:top w:w="120" w:type="dxa"/>
-              <w:left w:w="120" w:type="dxa"/>
-              <w:bottom w:w="120" w:type="dxa"/>
-              <w:right w:w="120" w:type="dxa"/>
-            </w:tcMar>
-            <w:vAlign w:val="center"/>
-            <w:hideMark/>
-          </w:tcPr>
-          <w:p>
-            <w:r>
-              <w:t>A</w:t>
-            </w:r>
-          </w:p>
-        </w:tc>
-        <w:tc>
-          <w:tcPr>
-            <w:tcW w:w="0" w:type="auto"/>
-            <w:tcBorders>
-              <w:top w:val="single" w:sz="6" w:space="0" w:color="DDDDDD"/>
-              <w:left w:val="single" w:sz="6" w:space="0" w:color="DDDDDD"/>
-              <w:bottom w:val="single" w:sz="6" w:space="0" w:color="DDDDDD"/>
-              <w:right w:val="single" w:sz="6" w:space="0" w:color="DDDDDD"/>
-            </w:tcBorders>
-            <w:tcMar>
-              <w:top w:w="120" w:type="dxa"/>
-              <w:left w:w="120" w:type="dxa"/>
-              <w:bottom w:w="120" w:type="dxa"/>
-              <w:right w:w="120" w:type="dxa"/>
-            </w:tcMar>
-            <w:vAlign w:val="center"/>
-            <w:hideMark/>
-          </w:tcPr>
-          <w:p>
-            <w:r>
-              <w:t>3cm</w:t>
-            </w:r>
-          </w:p>
-        </w:tc>
-        <w:tc>
-          <w:tcPr>
-            <w:tcW w:w="0" w:type="auto"/>
-            <w:tcBorders>
-              <w:top w:val="single" w:sz="6" w:space="0" w:color="DDDDDD"/>
-              <w:left w:val="single" w:sz="6" w:space="0" w:color="DDDDDD"/>
-              <w:bottom w:val="single" w:sz="6" w:space="0" w:color="DDDDDD"/>
-              <w:right w:val="single" w:sz="6" w:space="0" w:color="DDDDDD"/>
-            </w:tcBorders>
-            <w:tcMar>
-              <w:top w:w="120" w:type="dxa"/>
-              <w:left w:w="120" w:type="dxa"/>
-              <w:bottom w:w="120" w:type="dxa"/>
-              <w:right w:w="120" w:type="dxa"/>
-            </w:tcMar>
-            <w:vAlign w:val="center"/>
-            <w:hideMark/>
-          </w:tcPr>
-          <w:p>
-            <w:r>
-              <w:t>85%</w:t>
-            </w:r>
-          </w:p>
-        </w:tc>
-        <w:tc>
-          <w:tcPr>
-            <w:tcW w:w="0" w:type="auto"/>
-            <w:tcBorders>
-              <w:top w:val="single" w:sz="6" w:space="0" w:color="DDDDDD"/>
-              <w:left w:val="single" w:sz="6" w:space="0" w:color="DDDDDD"/>
-              <w:bottom w:val="single" w:sz="6" w:space="0" w:color="DDDDDD"/>
-              <w:right w:val="single" w:sz="6" w:space="0" w:color="DDDDDD"/>
-            </w:tcBorders>
-            <w:tcMar>
-              <w:top w:w="120" w:type="dxa"/>
-              <w:left w:w="120" w:type="dxa"/>
-              <w:bottom w:w="120" w:type="dxa"/>
-              <w:right w:w="120" w:type="dxa"/>
-            </w:tcMar>
-            <w:vAlign w:val="center"/>
-            <w:hideMark/>
-          </w:tcPr>
-          <w:p>
-            <w:r>
-              <w:t>6mm</w:t>
-            </w:r>
-          </w:p>
-        </w:tc>
-        <w:tc>
-          <w:tcPr>
-            <w:tcW w:w="0" w:type="auto"/>
-            <w:tcBorders>
-              <w:top w:val="single" w:sz="6" w:space="0" w:color="DDDDDD"/>
-              <w:left w:val="single" w:sz="6" w:space="0" w:color="DDDDDD"/>
-              <w:bottom w:val="single" w:sz="6" w:space="0" w:color="DDDDDD"/>
-              <w:right w:val="single" w:sz="6" w:space="0" w:color="DDDDDD"/>
-            </w:tcBorders>
-            <w:tcMar>
-              <w:top w:w="120" w:type="dxa"/>
-              <w:left w:w="120" w:type="dxa"/>
-              <w:bottom w:w="120" w:type="dxa"/>
-              <w:right w:w="120" w:type="dxa"/>
-            </w:tcMar>
-            <w:vAlign w:val="center"/>
-            <w:hideMark/>
-          </w:tcPr>
-          <w:p>
-            <w:r>
-              <w:t>0mm</w:t>
-            </w:r>
-          </w:p>
-        </w:tc>
-        <w:tc>
-          <w:tcPr>
-            <w:tcW w:w="0" w:type="auto"/>
-            <w:tcBorders>
-              <w:top w:val="single" w:sz="6" w:space="0" w:color="DDDDDD"/>
-              <w:left w:val="single" w:sz="6" w:space="0" w:color="DDDDDD"/>
-              <w:bottom w:val="single" w:sz="6" w:space="0" w:color="DDDDDD"/>
-              <w:right w:val="single" w:sz="6" w:space="0" w:color="DDDDDD"/>
-            </w:tcBorders>
-            <w:tcMar>
-              <w:top w:w="120" w:type="dxa"/>
-              <w:left w:w="120" w:type="dxa"/>
-              <w:bottom w:w="120" w:type="dxa"/>
-              <w:right w:w="120" w:type="dxa"/>
-            </w:tcMar>
-            <w:vAlign w:val="center"/>
-            <w:hideMark/>
-          </w:tcPr>
-          <w:p>
-            <w:r>
-              <w:t>Tillering</w:t>
-            </w:r>
-          </w:p>
-        </w:tc>
-        <w:tc>
-          <w:tcPr>
-            <w:tcW w:w="0" w:type="auto"/>
-            <w:tcBorders>
-              <w:top w:val="single" w:sz="6" w:space="0" w:color="DDDDDD"/>
-              <w:left w:val="single" w:sz="6" w:space="0" w:color="DDDDDD"/>
-              <w:bottom w:val="single" w:sz="6" w:space="0" w:color="DDDDDD"/>
-              <w:right w:val="single" w:sz="6" w:space="0" w:color="DDDDDD"/>
-            </w:tcBorders>
-            <w:tcMar>
-              <w:top w:w="120" w:type="dxa"/>
-              <w:left w:w="120" w:type="dxa"/>
-              <w:bottom w:w="120" w:type="dxa"/>
-              <w:right w:w="120" w:type="dxa"/>
-            </w:tcMar>
-            <w:vAlign w:val="center"/>
-            <w:hideMark/>
-          </w:tcPr>
-          <w:p>
-            <w:r>
-              <w:t>2</w:t>
-            </w:r>
-            <w:r>
-              <w:t>5</w:t>
-            </w:r>
-            <w:r>
-              <w:t>-</w:t>
-            </w:r>
-            <w:r>
-              <w:t>30</w:t>
-            </w:r>
-            <w:r>
-              <w:t>mm</w:t>
-            </w:r>
-          </w:p>
-        </w:tc>
-      </w:tr>
-      <w:tr>
-        <w:tc>
-          <w:tcPr>
-            <w:tcW w:w="0" w:type="auto"/>
-            <w:tcBorders>
-              <w:top w:val="single" w:sz="6" w:space="0" w:color="DDDDDD"/>
-              <w:left w:val="single" w:sz="6" w:space="0" w:color="DDDDDD"/>
-              <w:bottom w:val="single" w:sz="6" w:space="0" w:color="DDDDDD"/>
-              <w:right w:val="single" w:sz="6" w:space="0" w:color="DDDDDD"/>
-            </w:tcBorders>
-            <w:tcMar>
-              <w:top w:w="120" w:type="dxa"/>
-              <w:left w:w="120" w:type="dxa"/>
-              <w:bottom w:w="120" w:type="dxa"/>
-              <w:right w:w="120" w:type="dxa"/>
-            </w:tcMar>
-            <w:vAlign w:val="center"/>
-            <w:hideMark/>
-          </w:tcPr>
-          <w:p>
-            <w:r>
-              <w:t>B</w:t>
-            </w:r>
-          </w:p>
-        </w:tc>
-        <w:tc>
-          <w:tcPr>
-            <w:tcW w:w="0" w:type="auto"/>
-            <w:tcBorders>
-              <w:top w:val="single" w:sz="6" w:space="0" w:color="DDDDDD"/>
-              <w:left w:val="single" w:sz="6" w:space="0" w:color="DDDDDD"/>
-              <w:bottom w:val="single" w:sz="6" w:space="0" w:color="DDDDDD"/>
-              <w:right w:val="single" w:sz="6" w:space="0" w:color="DDDDDD"/>
-            </w:tcBorders>
-            <w:tcMar>
-              <w:top w:w="120" w:type="dxa"/>
-              <w:left w:w="120" w:type="dxa"/>
-              <w:bottom w:w="120" w:type="dxa"/>
-              <w:right w:w="120" w:type="dxa"/>
-            </w:tcMar>
-            <w:vAlign w:val="center"/>
-            <w:hideMark/>
-          </w:tcPr>
-          <w:p>
-            <w:r>
-              <w:t>5cm</w:t>
-            </w:r>
-          </w:p>
-        </w:tc>
-        <w:tc>
-          <w:tcPr>
-            <w:tcW w:w="0" w:type="auto"/>
-            <w:tcBorders>
-              <w:top w:val="single" w:sz="6" w:space="0" w:color="DDDDDD"/>
-              <w:left w:val="single" w:sz="6" w:space="0" w:color="DDDDDD"/>
-              <w:bottom w:val="single" w:sz="6" w:space="0" w:color="DDDDDD"/>
-              <w:right w:val="single" w:sz="6" w:space="0" w:color="DDDDDD"/>
-            </w:tcBorders>
-            <w:tcMar>
-              <w:top w:w="120" w:type="dxa"/>
-              <w:left w:w="120" w:type="dxa"/>
-              <w:bottom w:w="120" w:type="dxa"/>
-              <w:right w:w="120" w:type="dxa"/>
-            </w:tcMar>
-            <w:vAlign w:val="center"/>
-            <w:hideMark/>
-          </w:tcPr>
-          <w:p>
-            <w:r>
-              <w:t>90%</w:t>
-            </w:r>
-          </w:p>
-        </w:tc>
-        <w:tc>
-          <w:tcPr>
-            <w:tcW w:w="0" w:type="auto"/>
-            <w:tcBorders>
-              <w:top w:val="single" w:sz="6" w:space="0" w:color="DDDDDD"/>
-              <w:left w:val="single" w:sz="6" w:space="0" w:color="DDDDDD"/>
-              <w:bottom w:val="single" w:sz="6" w:space="0" w:color="DDDDDD"/>
-              <w:right w:val="single" w:sz="6" w:space="0" w:color="DDDDDD"/>
-            </w:tcBorders>
-            <w:tcMar>
-              <w:top w:w="120" w:type="dxa"/>
-              <w:left w:w="120" w:type="dxa"/>
-              <w:bottom w:w="120" w:type="dxa"/>
-              <w:right w:w="120" w:type="dxa"/>
-            </w:tcMar>
-            <w:vAlign w:val="center"/>
-            <w:hideMark/>
-          </w:tcPr>
-          <w:p>
-            <w:r>
-              <w:t>5mm</w:t>
-            </w:r>
-          </w:p>
-        </w:tc>
-        <w:tc>
-          <w:tcPr>
-            <w:tcW w:w="0" w:type="auto"/>
-            <w:tcBorders>
-              <w:top w:val="single" w:sz="6" w:space="0" w:color="DDDDDD"/>
-              <w:left w:val="single" w:sz="6" w:space="0" w:color="DDDDDD"/>
-              <w:bottom w:val="single" w:sz="6" w:space="0" w:color="DDDDDD"/>
-              <w:right w:val="single" w:sz="6" w:space="0" w:color="DDDDDD"/>
-            </w:tcBorders>
-            <w:tcMar>
-              <w:top w:w="120" w:type="dxa"/>
-              <w:left w:w="120" w:type="dxa"/>
-              <w:bottom w:w="120" w:type="dxa"/>
-              <w:right w:w="120" w:type="dxa"/>
-            </w:tcMar>
-            <w:vAlign w:val="center"/>
-            <w:hideMark/>
-          </w:tcPr>
-          <w:p>
-            <w:r>
-              <w:t>10mm</w:t>
-            </w:r>
-          </w:p>
-        </w:tc>
-        <w:tc>
-          <w:tcPr>
-            <w:tcW w:w="0" w:type="auto"/>
-            <w:tcBorders>
-              <w:top w:val="single" w:sz="6" w:space="0" w:color="DDDDDD"/>
-              <w:left w:val="single" w:sz="6" w:space="0" w:color="DDDDDD"/>
-              <w:bottom w:val="single" w:sz="6" w:space="0" w:color="DDDDDD"/>
-              <w:right w:val="single" w:sz="6" w:space="0" w:color="DDDDDD"/>
-            </w:tcBorders>
-            <w:tcMar>
-              <w:top w:w="120" w:type="dxa"/>
-              <w:left w:w="120" w:type="dxa"/>
-              <w:bottom w:w="120" w:type="dxa"/>
-              <w:right w:w="120" w:type="dxa"/>
-            </w:tcMar>
-            <w:vAlign w:val="center"/>
-            <w:hideMark/>
-          </w:tcPr>
-          <w:p>
-            <w:r>
-              <w:t>Vegetative</w:t>
-            </w:r>
-          </w:p>
-        </w:tc>
-        <w:tc>
-          <w:tcPr>
-            <w:tcW w:w="0" w:type="auto"/>
-            <w:tcBorders>
-              <w:top w:val="single" w:sz="6" w:space="0" w:color="DDDDDD"/>
-              <w:left w:val="single" w:sz="6" w:space="0" w:color="DDDDDD"/>
-              <w:bottom w:val="single" w:sz="6" w:space="0" w:color="DDDDDD"/>
-              <w:right w:val="single" w:sz="6" w:space="0" w:color="DDDDDD"/>
-            </w:tcBorders>
-            <w:tcMar>
-              <w:top w:w="120" w:type="dxa"/>
-              <w:left w:w="120" w:type="dxa"/>
-              <w:bottom w:w="120" w:type="dxa"/>
-              <w:right w:w="120" w:type="dxa"/>
-            </w:tcMar>
-            <w:vAlign w:val="center"/>
-            <w:hideMark/>
-          </w:tcPr>
-          <w:p>
-            <w:r>
-              <w:t>0</w:t>
-            </w:r>
-            <w:r>
-              <w:t>-5</w:t>
-            </w:r>
-            <w:r>
-              <w:t>mm</w:t>
-            </w:r>
-          </w:p>
-        </w:tc>
-      </w:tr>
-      <w:tr>
-        <w:tc>
-          <w:tcPr>
-            <w:tcW w:w="0" w:type="auto"/>
-            <w:tcBorders>
-              <w:top w:val="single" w:sz="6" w:space="0" w:color="DDDDDD"/>
-              <w:left w:val="single" w:sz="6" w:space="0" w:color="DDDDDD"/>
-              <w:bottom w:val="single" w:sz="6" w:space="0" w:color="DDDDDD"/>
-              <w:right w:val="single" w:sz="6" w:space="0" w:color="DDDDDD"/>
-            </w:tcBorders>
-            <w:tcMar>
-              <w:top w:w="120" w:type="dxa"/>
-              <w:left w:w="120" w:type="dxa"/>
-              <w:bottom w:w="120" w:type="dxa"/>
-              <w:right w:w="120" w:type="dxa"/>
-            </w:tcMar>
-            <w:vAlign w:val="center"/>
-            <w:hideMark/>
-          </w:tcPr>
-          <w:p>
-            <w:r>
-              <w:t>C</w:t>
-            </w:r>
-          </w:p>
-        </w:tc>
-        <w:tc>
-          <w:tcPr>
-            <w:tcW w:w="0" w:type="auto"/>
-            <w:tcBorders>
-              <w:top w:val="single" w:sz="6" w:space="0" w:color="DDDDDD"/>
-              <w:left w:val="single" w:sz="6" w:space="0" w:color="DDDDDD"/>
-              <w:bottom w:val="single" w:sz="6" w:space="0" w:color="DDDDDD"/>
-              <w:right w:val="single" w:sz="6" w:space="0" w:color="DDDDDD"/>
-            </w:tcBorders>
-            <w:tcMar>
-              <w:top w:w="120" w:type="dxa"/>
-              <w:left w:w="120" w:type="dxa"/>
-              <w:bottom w:w="120" w:type="dxa"/>
-              <w:right w:w="120" w:type="dxa"/>
-            </w:tcMar>
-            <w:vAlign w:val="center"/>
-            <w:hideMark/>
-          </w:tcPr>
-          <w:p>
-            <w:r>
-              <w:t>0cm</w:t>
-            </w:r>
-          </w:p>
-        </w:tc>
-        <w:tc>
-          <w:tcPr>
-            <w:tcW w:w="0" w:type="auto"/>
-            <w:tcBorders>
-              <w:top w:val="single" w:sz="6" w:space="0" w:color="DDDDDD"/>
-              <w:left w:val="single" w:sz="6" w:space="0" w:color="DDDDDD"/>
-              <w:bottom w:val="single" w:sz="6" w:space="0" w:color="DDDDDD"/>
-              <w:right w:val="single" w:sz="6" w:space="0" w:color="DDDDDD"/>
-            </w:tcBorders>
-            <w:tcMar>
-              <w:top w:w="120" w:type="dxa"/>
-              <w:left w:w="120" w:type="dxa"/>
-              <w:bottom w:w="120" w:type="dxa"/>
-              <w:right w:w="120" w:type="dxa"/>
-            </w:tcMar>
-            <w:vAlign w:val="center"/>
-            <w:hideMark/>
-          </w:tcPr>
-          <w:p>
-            <w:r>
-              <w:t>65%</w:t>
-            </w:r>
-          </w:p>
-        </w:tc>
-        <w:tc>
-          <w:tcPr>
-            <w:tcW w:w="0" w:type="auto"/>
-            <w:tcBorders>
-              <w:top w:val="single" w:sz="6" w:space="0" w:color="DDDDDD"/>
-              <w:left w:val="single" w:sz="6" w:space="0" w:color="DDDDDD"/>
-              <w:bottom w:val="single" w:sz="6" w:space="0" w:color="DDDDDD"/>
-              <w:right w:val="single" w:sz="6" w:space="0" w:color="DDDDDD"/>
-            </w:tcBorders>
-            <w:tcMar>
-              <w:top w:w="120" w:type="dxa"/>
-              <w:left w:w="120" w:type="dxa"/>
-              <w:bottom w:w="120" w:type="dxa"/>
-              <w:right w:w="120" w:type="dxa"/>
-            </w:tcMar>
-            <w:vAlign w:val="center"/>
-            <w:hideMark/>
-          </w:tcPr>
-          <w:p>
-            <w:r>
-              <w:t>8mm</w:t>
-            </w:r>
-          </w:p>
-        </w:tc>
-        <w:tc>
-          <w:tcPr>
-            <w:tcW w:w="0" w:type="auto"/>
-            <w:tcBorders>
-              <w:top w:val="single" w:sz="6" w:space="0" w:color="DDDDDD"/>
-              <w:left w:val="single" w:sz="6" w:space="0" w:color="DDDDDD"/>
-              <w:bottom w:val="single" w:sz="6" w:space="0" w:color="DDDDDD"/>
-              <w:right w:val="single" w:sz="6" w:space="0" w:color="DDDDDD"/>
-            </w:tcBorders>
-            <w:tcMar>
-              <w:top w:w="120" w:type="dxa"/>
-              <w:left w:w="120" w:type="dxa"/>
-              <w:bottom w:w="120" w:type="dxa"/>
-              <w:right w:w="120" w:type="dxa"/>
-            </w:tcMar>
-            <w:vAlign w:val="center"/>
-            <w:hideMark/>
-          </w:tcPr>
-          <w:p>
-            <w:r>
-              <w:t>0mm</w:t>
-            </w:r>
-          </w:p>
-        </w:tc>
-        <w:tc>
-          <w:tcPr>
-            <w:tcW w:w="0" w:type="auto"/>
-            <w:tcBorders>
-              <w:top w:val="single" w:sz="6" w:space="0" w:color="DDDDDD"/>
-              <w:left w:val="single" w:sz="6" w:space="0" w:color="DDDDDD"/>
-              <w:bottom w:val="single" w:sz="6" w:space="0" w:color="DDDDDD"/>
-              <w:right w:val="single" w:sz="6" w:space="0" w:color="DDDDDD"/>
-            </w:tcBorders>
-            <w:tcMar>
-              <w:top w:w="120" w:type="dxa"/>
-              <w:left w:w="120" w:type="dxa"/>
-              <w:bottom w:w="120" w:type="dxa"/>
-              <w:right w:w="120" w:type="dxa"/>
-            </w:tcMar>
-            <w:vAlign w:val="center"/>
-            <w:hideMark/>
-          </w:tcPr>
-          <w:p>
-            <w:r>
-              <w:t>Ripening</w:t>
-            </w:r>
-          </w:p>
-        </w:tc>
-        <w:tc>
-          <w:tcPr>
-            <w:tcW w:w="0" w:type="auto"/>
-            <w:tcBorders>
-              <w:top w:val="single" w:sz="6" w:space="0" w:color="DDDDDD"/>
-              <w:left w:val="single" w:sz="6" w:space="0" w:color="DDDDDD"/>
-              <w:bottom w:val="single" w:sz="6" w:space="0" w:color="DDDDDD"/>
-              <w:right w:val="single" w:sz="6" w:space="0" w:color="DDDDDD"/>
-            </w:tcBorders>
-            <w:tcMar>
-              <w:top w:w="120" w:type="dxa"/>
-              <w:left w:w="120" w:type="dxa"/>
-              <w:bottom w:w="120" w:type="dxa"/>
-              <w:right w:w="120" w:type="dxa"/>
-            </w:tcMar>
-            <w:vAlign w:val="center"/>
-            <w:hideMark/>
-          </w:tcPr>
-          <w:p>
-            <w:r>
-              <w:t>20</w:t>
-            </w:r>
-            <w:r>
-              <w:t>-2</w:t>
-            </w:r>
-            <w:r>
-              <w:t>5</w:t>
-            </w:r>
-            <w:r>
-              <w:t>mm</w:t>
-            </w:r>
-          </w:p>
-        </w:tc>
-      </w:tr>
-    </w:tbl>
-    <w:p>
-      <w:pPr>
-        <w:pStyle w:val="ListParagraph"/>
-      </w:pPr>
-    </w:p>
-    <w:p>
-      <w:pPr>
-        <w:pStyle w:val="ListParagraph"/>
-        <w:numPr>
-          <w:ilvl w:val="0"/>
-          <w:numId w:val="33"/>
-        </w:numPr>
-      </w:pPr>
-      <w:r>
-        <w:t>These calculations seem reasonable</w:t>
-      </w:r>
-    </w:p>
-    <w:p>
-      <w:pPr>
-        <w:pStyle w:val="ListParagraph"/>
-        <w:numPr>
-          <w:ilvl w:val="0"/>
-          <w:numId w:val="33"/>
-        </w:numPr>
-      </w:pPr>
-      <w:r>
-        <w:t>These need adjustment (please explain below)</w:t>
-      </w:r>
-    </w:p>
-    <w:p/>
-    <w:p>
-      <w:pPr>
-        <w:pStyle w:val="ListParagraph"/>
-        <w:numPr>
-          <w:ilvl w:val="0"/>
-          <w:numId w:val="31"/>
-        </w:numPr>
-      </w:pPr>
-      <w:r>
         <w:t>In your expert opinion, how would you rate the potential effectiveness of this system for paddy cultivation? (Please rate on a scale of 1-5, where 1 = Not effective, 5 = Very effective)</w:t>
       </w:r>
     </w:p>
     <w:p/>
     <w:p/>
     <w:p/>
-    <w:p>
-      <w:r>
+    <w:p/>
+    <w:p>
+      <w:r>
+        <w:br w:type="page"/>
+      </w:r>
+    </w:p>
+    <w:p>
+      <w:r>
+        <w:lastRenderedPageBreak/>
         <w:br w:type="page"/>
       </w:r>
     </w:p>
@@ -2451,833 +1588,30 @@
           <w:b/>
           <w:bCs/>
         </w:rPr>
-        <w:t>Section 8: Output Expectations</w:t>
-      </w:r>
-    </w:p>
-    <w:p>
-      <w:pPr>
-        <w:rPr>
-          <w:b/>
-          <w:bCs/>
-        </w:rPr>
-      </w:pPr>
-      <w:r>
-        <w:rPr>
-          <w:b/>
-          <w:bCs/>
-        </w:rPr>
-        <w:t>Q29 - Scenario Review</w:t>
-      </w:r>
-      <w:r>
-        <w:rPr>
-          <w:b/>
-          <w:bCs/>
-        </w:rPr>
-        <w:t>:</w:t>
-      </w:r>
-    </w:p>
-    <w:tbl>
-      <w:tblPr>
-        <w:tblW w:w="5000" w:type="pct"/>
-        <w:tblCellMar>
-          <w:top w:w="15" w:type="dxa"/>
-          <w:left w:w="15" w:type="dxa"/>
-          <w:bottom w:w="15" w:type="dxa"/>
-          <w:right w:w="15" w:type="dxa"/>
-        </w:tblCellMar>
-        <w:tblLook w:val="04A0" w:firstRow="1" w:lastRow="0" w:firstColumn="1" w:lastColumn="0" w:noHBand="0" w:noVBand="1"/>
-      </w:tblPr>
-      <w:tblGrid>
-        <w:gridCol w:w="1267"/>
-        <w:gridCol w:w="1677"/>
-        <w:gridCol w:w="1745"/>
-        <w:gridCol w:w="811"/>
-        <w:gridCol w:w="945"/>
-        <w:gridCol w:w="1363"/>
-        <w:gridCol w:w="1536"/>
-      </w:tblGrid>
-      <w:tr>
-        <w:trPr>
-          <w:tblHeader/>
-        </w:trPr>
-        <w:tc>
-          <w:tcPr>
-            <w:tcW w:w="0" w:type="auto"/>
-            <w:tcBorders>
-              <w:top w:val="single" w:sz="6" w:space="0" w:color="DDDDDD"/>
-              <w:left w:val="single" w:sz="6" w:space="0" w:color="DDDDDD"/>
-              <w:bottom w:val="single" w:sz="6" w:space="0" w:color="DDDDDD"/>
-              <w:right w:val="single" w:sz="6" w:space="0" w:color="DDDDDD"/>
-            </w:tcBorders>
-            <w:shd w:val="clear" w:color="auto" w:fill="F2F2F2"/>
-            <w:tcMar>
-              <w:top w:w="120" w:type="dxa"/>
-              <w:left w:w="120" w:type="dxa"/>
-              <w:bottom w:w="120" w:type="dxa"/>
-              <w:right w:w="120" w:type="dxa"/>
-            </w:tcMar>
-            <w:vAlign w:val="center"/>
-            <w:hideMark/>
-          </w:tcPr>
-          <w:p>
-            <w:pPr>
-              <w:rPr>
-                <w:b/>
-                <w:bCs/>
-              </w:rPr>
-            </w:pPr>
-            <w:r>
-              <w:rPr>
-                <w:b/>
-                <w:bCs/>
-              </w:rPr>
-              <w:t>Scenario</w:t>
-            </w:r>
-          </w:p>
-        </w:tc>
-        <w:tc>
-          <w:tcPr>
-            <w:tcW w:w="0" w:type="auto"/>
-            <w:tcBorders>
-              <w:top w:val="single" w:sz="6" w:space="0" w:color="DDDDDD"/>
-              <w:left w:val="single" w:sz="6" w:space="0" w:color="DDDDDD"/>
-              <w:bottom w:val="single" w:sz="6" w:space="0" w:color="DDDDDD"/>
-              <w:right w:val="single" w:sz="6" w:space="0" w:color="DDDDDD"/>
-            </w:tcBorders>
-            <w:shd w:val="clear" w:color="auto" w:fill="F2F2F2"/>
-            <w:tcMar>
-              <w:top w:w="120" w:type="dxa"/>
-              <w:left w:w="120" w:type="dxa"/>
-              <w:bottom w:w="120" w:type="dxa"/>
-              <w:right w:w="120" w:type="dxa"/>
-            </w:tcMar>
-            <w:vAlign w:val="center"/>
-            <w:hideMark/>
-          </w:tcPr>
-          <w:p>
-            <w:pPr>
-              <w:rPr>
-                <w:b/>
-                <w:bCs/>
-              </w:rPr>
-            </w:pPr>
-            <w:r>
-              <w:rPr>
-                <w:b/>
-                <w:bCs/>
-              </w:rPr>
-              <w:t>Water Depth</w:t>
-            </w:r>
-          </w:p>
-        </w:tc>
-        <w:tc>
-          <w:tcPr>
-            <w:tcW w:w="0" w:type="auto"/>
-            <w:tcBorders>
-              <w:top w:val="single" w:sz="6" w:space="0" w:color="DDDDDD"/>
-              <w:left w:val="single" w:sz="6" w:space="0" w:color="DDDDDD"/>
-              <w:bottom w:val="single" w:sz="6" w:space="0" w:color="DDDDDD"/>
-              <w:right w:val="single" w:sz="6" w:space="0" w:color="DDDDDD"/>
-            </w:tcBorders>
-            <w:shd w:val="clear" w:color="auto" w:fill="F2F2F2"/>
-            <w:tcMar>
-              <w:top w:w="120" w:type="dxa"/>
-              <w:left w:w="120" w:type="dxa"/>
-              <w:bottom w:w="120" w:type="dxa"/>
-              <w:right w:w="120" w:type="dxa"/>
-            </w:tcMar>
-            <w:vAlign w:val="center"/>
-            <w:hideMark/>
-          </w:tcPr>
-          <w:p>
-            <w:pPr>
-              <w:rPr>
-                <w:b/>
-                <w:bCs/>
-              </w:rPr>
-            </w:pPr>
-            <w:r>
-              <w:rPr>
-                <w:b/>
-                <w:bCs/>
-              </w:rPr>
-              <w:t>Soil Moisture</w:t>
-            </w:r>
-          </w:p>
-        </w:tc>
-        <w:tc>
-          <w:tcPr>
-            <w:tcW w:w="0" w:type="auto"/>
-            <w:tcBorders>
-              <w:top w:val="single" w:sz="6" w:space="0" w:color="DDDDDD"/>
-              <w:left w:val="single" w:sz="6" w:space="0" w:color="DDDDDD"/>
-              <w:bottom w:val="single" w:sz="6" w:space="0" w:color="DDDDDD"/>
-              <w:right w:val="single" w:sz="6" w:space="0" w:color="DDDDDD"/>
-            </w:tcBorders>
-            <w:shd w:val="clear" w:color="auto" w:fill="F2F2F2"/>
-            <w:tcMar>
-              <w:top w:w="120" w:type="dxa"/>
-              <w:left w:w="120" w:type="dxa"/>
-              <w:bottom w:w="120" w:type="dxa"/>
-              <w:right w:w="120" w:type="dxa"/>
-            </w:tcMar>
-            <w:vAlign w:val="center"/>
-            <w:hideMark/>
-          </w:tcPr>
-          <w:p>
-            <w:pPr>
-              <w:rPr>
-                <w:b/>
-                <w:bCs/>
-              </w:rPr>
-            </w:pPr>
-            <w:r>
-              <w:rPr>
-                <w:b/>
-                <w:bCs/>
-              </w:rPr>
-              <w:t>ET</w:t>
-            </w:r>
-          </w:p>
-        </w:tc>
-        <w:tc>
-          <w:tcPr>
-            <w:tcW w:w="0" w:type="auto"/>
-            <w:tcBorders>
-              <w:top w:val="single" w:sz="6" w:space="0" w:color="DDDDDD"/>
-              <w:left w:val="single" w:sz="6" w:space="0" w:color="DDDDDD"/>
-              <w:bottom w:val="single" w:sz="6" w:space="0" w:color="DDDDDD"/>
-              <w:right w:val="single" w:sz="6" w:space="0" w:color="DDDDDD"/>
-            </w:tcBorders>
-            <w:shd w:val="clear" w:color="auto" w:fill="F2F2F2"/>
-            <w:tcMar>
-              <w:top w:w="120" w:type="dxa"/>
-              <w:left w:w="120" w:type="dxa"/>
-              <w:bottom w:w="120" w:type="dxa"/>
-              <w:right w:w="120" w:type="dxa"/>
-            </w:tcMar>
-            <w:vAlign w:val="center"/>
-            <w:hideMark/>
-          </w:tcPr>
-          <w:p>
-            <w:pPr>
-              <w:rPr>
-                <w:b/>
-                <w:bCs/>
-              </w:rPr>
-            </w:pPr>
-            <w:r>
-              <w:rPr>
-                <w:b/>
-                <w:bCs/>
-              </w:rPr>
-              <w:t>Rain</w:t>
-            </w:r>
-          </w:p>
-        </w:tc>
-        <w:tc>
-          <w:tcPr>
-            <w:tcW w:w="0" w:type="auto"/>
-            <w:tcBorders>
-              <w:top w:val="single" w:sz="6" w:space="0" w:color="DDDDDD"/>
-              <w:left w:val="single" w:sz="6" w:space="0" w:color="DDDDDD"/>
-              <w:bottom w:val="single" w:sz="6" w:space="0" w:color="DDDDDD"/>
-              <w:right w:val="single" w:sz="6" w:space="0" w:color="DDDDDD"/>
-            </w:tcBorders>
-            <w:shd w:val="clear" w:color="auto" w:fill="F2F2F2"/>
-            <w:tcMar>
-              <w:top w:w="120" w:type="dxa"/>
-              <w:left w:w="120" w:type="dxa"/>
-              <w:bottom w:w="120" w:type="dxa"/>
-              <w:right w:w="120" w:type="dxa"/>
-            </w:tcMar>
-            <w:vAlign w:val="center"/>
-            <w:hideMark/>
-          </w:tcPr>
-          <w:p>
-            <w:pPr>
-              <w:rPr>
-                <w:b/>
-                <w:bCs/>
-              </w:rPr>
-            </w:pPr>
-            <w:r>
-              <w:rPr>
-                <w:b/>
-                <w:bCs/>
-              </w:rPr>
-              <w:t>Stage</w:t>
-            </w:r>
-          </w:p>
-        </w:tc>
-        <w:tc>
-          <w:tcPr>
-            <w:tcW w:w="0" w:type="auto"/>
-            <w:tcBorders>
-              <w:top w:val="single" w:sz="6" w:space="0" w:color="DDDDDD"/>
-              <w:left w:val="single" w:sz="6" w:space="0" w:color="DDDDDD"/>
-              <w:bottom w:val="single" w:sz="6" w:space="0" w:color="DDDDDD"/>
-              <w:right w:val="single" w:sz="6" w:space="0" w:color="DDDDDD"/>
-            </w:tcBorders>
-            <w:shd w:val="clear" w:color="auto" w:fill="F2F2F2"/>
-            <w:tcMar>
-              <w:top w:w="120" w:type="dxa"/>
-              <w:left w:w="120" w:type="dxa"/>
-              <w:bottom w:w="120" w:type="dxa"/>
-              <w:right w:w="120" w:type="dxa"/>
-            </w:tcMar>
-            <w:vAlign w:val="center"/>
-            <w:hideMark/>
-          </w:tcPr>
-          <w:p>
-            <w:pPr>
-              <w:rPr>
-                <w:b/>
-                <w:bCs/>
-              </w:rPr>
-            </w:pPr>
-            <w:r>
-              <w:rPr>
-                <w:b/>
-                <w:bCs/>
-              </w:rPr>
-              <w:t>CWR</w:t>
-            </w:r>
-          </w:p>
-        </w:tc>
-      </w:tr>
-      <w:tr>
-        <w:tc>
-          <w:tcPr>
-            <w:tcW w:w="0" w:type="auto"/>
-            <w:tcBorders>
-              <w:top w:val="single" w:sz="6" w:space="0" w:color="DDDDDD"/>
-              <w:left w:val="single" w:sz="6" w:space="0" w:color="DDDDDD"/>
-              <w:bottom w:val="single" w:sz="6" w:space="0" w:color="DDDDDD"/>
-              <w:right w:val="single" w:sz="6" w:space="0" w:color="DDDDDD"/>
-            </w:tcBorders>
-            <w:tcMar>
-              <w:top w:w="120" w:type="dxa"/>
-              <w:left w:w="120" w:type="dxa"/>
-              <w:bottom w:w="120" w:type="dxa"/>
-              <w:right w:w="120" w:type="dxa"/>
-            </w:tcMar>
-            <w:vAlign w:val="center"/>
-            <w:hideMark/>
-          </w:tcPr>
-          <w:p>
-            <w:r>
-              <w:t>A</w:t>
-            </w:r>
-          </w:p>
-        </w:tc>
-        <w:tc>
-          <w:tcPr>
-            <w:tcW w:w="0" w:type="auto"/>
-            <w:tcBorders>
-              <w:top w:val="single" w:sz="6" w:space="0" w:color="DDDDDD"/>
-              <w:left w:val="single" w:sz="6" w:space="0" w:color="DDDDDD"/>
-              <w:bottom w:val="single" w:sz="6" w:space="0" w:color="DDDDDD"/>
-              <w:right w:val="single" w:sz="6" w:space="0" w:color="DDDDDD"/>
-            </w:tcBorders>
-            <w:tcMar>
-              <w:top w:w="120" w:type="dxa"/>
-              <w:left w:w="120" w:type="dxa"/>
-              <w:bottom w:w="120" w:type="dxa"/>
-              <w:right w:w="120" w:type="dxa"/>
-            </w:tcMar>
-            <w:vAlign w:val="center"/>
-            <w:hideMark/>
-          </w:tcPr>
-          <w:p>
-            <w:r>
-              <w:t>3cm</w:t>
-            </w:r>
-          </w:p>
-        </w:tc>
-        <w:tc>
-          <w:tcPr>
-            <w:tcW w:w="0" w:type="auto"/>
-            <w:tcBorders>
-              <w:top w:val="single" w:sz="6" w:space="0" w:color="DDDDDD"/>
-              <w:left w:val="single" w:sz="6" w:space="0" w:color="DDDDDD"/>
-              <w:bottom w:val="single" w:sz="6" w:space="0" w:color="DDDDDD"/>
-              <w:right w:val="single" w:sz="6" w:space="0" w:color="DDDDDD"/>
-            </w:tcBorders>
-            <w:tcMar>
-              <w:top w:w="120" w:type="dxa"/>
-              <w:left w:w="120" w:type="dxa"/>
-              <w:bottom w:w="120" w:type="dxa"/>
-              <w:right w:w="120" w:type="dxa"/>
-            </w:tcMar>
-            <w:vAlign w:val="center"/>
-            <w:hideMark/>
-          </w:tcPr>
-          <w:p>
-            <w:r>
-              <w:t>85%</w:t>
-            </w:r>
-          </w:p>
-        </w:tc>
-        <w:tc>
-          <w:tcPr>
-            <w:tcW w:w="0" w:type="auto"/>
-            <w:tcBorders>
-              <w:top w:val="single" w:sz="6" w:space="0" w:color="DDDDDD"/>
-              <w:left w:val="single" w:sz="6" w:space="0" w:color="DDDDDD"/>
-              <w:bottom w:val="single" w:sz="6" w:space="0" w:color="DDDDDD"/>
-              <w:right w:val="single" w:sz="6" w:space="0" w:color="DDDDDD"/>
-            </w:tcBorders>
-            <w:tcMar>
-              <w:top w:w="120" w:type="dxa"/>
-              <w:left w:w="120" w:type="dxa"/>
-              <w:bottom w:w="120" w:type="dxa"/>
-              <w:right w:w="120" w:type="dxa"/>
-            </w:tcMar>
-            <w:vAlign w:val="center"/>
-            <w:hideMark/>
-          </w:tcPr>
-          <w:p>
-            <w:r>
-              <w:t>6mm</w:t>
-            </w:r>
-          </w:p>
-        </w:tc>
-        <w:tc>
-          <w:tcPr>
-            <w:tcW w:w="0" w:type="auto"/>
-            <w:tcBorders>
-              <w:top w:val="single" w:sz="6" w:space="0" w:color="DDDDDD"/>
-              <w:left w:val="single" w:sz="6" w:space="0" w:color="DDDDDD"/>
-              <w:bottom w:val="single" w:sz="6" w:space="0" w:color="DDDDDD"/>
-              <w:right w:val="single" w:sz="6" w:space="0" w:color="DDDDDD"/>
-            </w:tcBorders>
-            <w:tcMar>
-              <w:top w:w="120" w:type="dxa"/>
-              <w:left w:w="120" w:type="dxa"/>
-              <w:bottom w:w="120" w:type="dxa"/>
-              <w:right w:w="120" w:type="dxa"/>
-            </w:tcMar>
-            <w:vAlign w:val="center"/>
-            <w:hideMark/>
-          </w:tcPr>
-          <w:p>
-            <w:r>
-              <w:t>0mm</w:t>
-            </w:r>
-          </w:p>
-        </w:tc>
-        <w:tc>
-          <w:tcPr>
-            <w:tcW w:w="0" w:type="auto"/>
-            <w:tcBorders>
-              <w:top w:val="single" w:sz="6" w:space="0" w:color="DDDDDD"/>
-              <w:left w:val="single" w:sz="6" w:space="0" w:color="DDDDDD"/>
-              <w:bottom w:val="single" w:sz="6" w:space="0" w:color="DDDDDD"/>
-              <w:right w:val="single" w:sz="6" w:space="0" w:color="DDDDDD"/>
-            </w:tcBorders>
-            <w:tcMar>
-              <w:top w:w="120" w:type="dxa"/>
-              <w:left w:w="120" w:type="dxa"/>
-              <w:bottom w:w="120" w:type="dxa"/>
-              <w:right w:w="120" w:type="dxa"/>
-            </w:tcMar>
-            <w:vAlign w:val="center"/>
-            <w:hideMark/>
-          </w:tcPr>
-          <w:p>
-            <w:r>
-              <w:t>Tillering</w:t>
-            </w:r>
-          </w:p>
-        </w:tc>
-        <w:tc>
-          <w:tcPr>
-            <w:tcW w:w="0" w:type="auto"/>
-            <w:tcBorders>
-              <w:top w:val="single" w:sz="6" w:space="0" w:color="DDDDDD"/>
-              <w:left w:val="single" w:sz="6" w:space="0" w:color="DDDDDD"/>
-              <w:bottom w:val="single" w:sz="6" w:space="0" w:color="DDDDDD"/>
-              <w:right w:val="single" w:sz="6" w:space="0" w:color="DDDDDD"/>
-            </w:tcBorders>
-            <w:tcMar>
-              <w:top w:w="120" w:type="dxa"/>
-              <w:left w:w="120" w:type="dxa"/>
-              <w:bottom w:w="120" w:type="dxa"/>
-              <w:right w:w="120" w:type="dxa"/>
-            </w:tcMar>
-            <w:vAlign w:val="center"/>
-            <w:hideMark/>
-          </w:tcPr>
-          <w:p>
-            <w:r>
-              <w:t>20-25mm ✓</w:t>
-            </w:r>
-          </w:p>
-        </w:tc>
-      </w:tr>
-      <w:tr>
-        <w:tc>
-          <w:tcPr>
-            <w:tcW w:w="0" w:type="auto"/>
-            <w:tcBorders>
-              <w:top w:val="single" w:sz="6" w:space="0" w:color="DDDDDD"/>
-              <w:left w:val="single" w:sz="6" w:space="0" w:color="DDDDDD"/>
-              <w:bottom w:val="single" w:sz="6" w:space="0" w:color="DDDDDD"/>
-              <w:right w:val="single" w:sz="6" w:space="0" w:color="DDDDDD"/>
-            </w:tcBorders>
-            <w:tcMar>
-              <w:top w:w="120" w:type="dxa"/>
-              <w:left w:w="120" w:type="dxa"/>
-              <w:bottom w:w="120" w:type="dxa"/>
-              <w:right w:w="120" w:type="dxa"/>
-            </w:tcMar>
-            <w:vAlign w:val="center"/>
-            <w:hideMark/>
-          </w:tcPr>
-          <w:p>
-            <w:r>
-              <w:lastRenderedPageBreak/>
-              <w:t>B</w:t>
-            </w:r>
-          </w:p>
-        </w:tc>
-        <w:tc>
-          <w:tcPr>
-            <w:tcW w:w="0" w:type="auto"/>
-            <w:tcBorders>
-              <w:top w:val="single" w:sz="6" w:space="0" w:color="DDDDDD"/>
-              <w:left w:val="single" w:sz="6" w:space="0" w:color="DDDDDD"/>
-              <w:bottom w:val="single" w:sz="6" w:space="0" w:color="DDDDDD"/>
-              <w:right w:val="single" w:sz="6" w:space="0" w:color="DDDDDD"/>
-            </w:tcBorders>
-            <w:tcMar>
-              <w:top w:w="120" w:type="dxa"/>
-              <w:left w:w="120" w:type="dxa"/>
-              <w:bottom w:w="120" w:type="dxa"/>
-              <w:right w:w="120" w:type="dxa"/>
-            </w:tcMar>
-            <w:vAlign w:val="center"/>
-            <w:hideMark/>
-          </w:tcPr>
-          <w:p>
-            <w:r>
-              <w:t>8cm</w:t>
-            </w:r>
-          </w:p>
-        </w:tc>
-        <w:tc>
-          <w:tcPr>
-            <w:tcW w:w="0" w:type="auto"/>
-            <w:tcBorders>
-              <w:top w:val="single" w:sz="6" w:space="0" w:color="DDDDDD"/>
-              <w:left w:val="single" w:sz="6" w:space="0" w:color="DDDDDD"/>
-              <w:bottom w:val="single" w:sz="6" w:space="0" w:color="DDDDDD"/>
-              <w:right w:val="single" w:sz="6" w:space="0" w:color="DDDDDD"/>
-            </w:tcBorders>
-            <w:tcMar>
-              <w:top w:w="120" w:type="dxa"/>
-              <w:left w:w="120" w:type="dxa"/>
-              <w:bottom w:w="120" w:type="dxa"/>
-              <w:right w:w="120" w:type="dxa"/>
-            </w:tcMar>
-            <w:vAlign w:val="center"/>
-            <w:hideMark/>
-          </w:tcPr>
-          <w:p>
-            <w:r>
-              <w:t>90%</w:t>
-            </w:r>
-          </w:p>
-        </w:tc>
-        <w:tc>
-          <w:tcPr>
-            <w:tcW w:w="0" w:type="auto"/>
-            <w:tcBorders>
-              <w:top w:val="single" w:sz="6" w:space="0" w:color="DDDDDD"/>
-              <w:left w:val="single" w:sz="6" w:space="0" w:color="DDDDDD"/>
-              <w:bottom w:val="single" w:sz="6" w:space="0" w:color="DDDDDD"/>
-              <w:right w:val="single" w:sz="6" w:space="0" w:color="DDDDDD"/>
-            </w:tcBorders>
-            <w:tcMar>
-              <w:top w:w="120" w:type="dxa"/>
-              <w:left w:w="120" w:type="dxa"/>
-              <w:bottom w:w="120" w:type="dxa"/>
-              <w:right w:w="120" w:type="dxa"/>
-            </w:tcMar>
-            <w:vAlign w:val="center"/>
-            <w:hideMark/>
-          </w:tcPr>
-          <w:p>
-            <w:r>
-              <w:t>5mm</w:t>
-            </w:r>
-          </w:p>
-        </w:tc>
-        <w:tc>
-          <w:tcPr>
-            <w:tcW w:w="0" w:type="auto"/>
-            <w:tcBorders>
-              <w:top w:val="single" w:sz="6" w:space="0" w:color="DDDDDD"/>
-              <w:left w:val="single" w:sz="6" w:space="0" w:color="DDDDDD"/>
-              <w:bottom w:val="single" w:sz="6" w:space="0" w:color="DDDDDD"/>
-              <w:right w:val="single" w:sz="6" w:space="0" w:color="DDDDDD"/>
-            </w:tcBorders>
-            <w:tcMar>
-              <w:top w:w="120" w:type="dxa"/>
-              <w:left w:w="120" w:type="dxa"/>
-              <w:bottom w:w="120" w:type="dxa"/>
-              <w:right w:w="120" w:type="dxa"/>
-            </w:tcMar>
-            <w:vAlign w:val="center"/>
-            <w:hideMark/>
-          </w:tcPr>
-          <w:p>
-            <w:r>
-              <w:t>10mm</w:t>
-            </w:r>
-          </w:p>
-        </w:tc>
-        <w:tc>
-          <w:tcPr>
-            <w:tcW w:w="0" w:type="auto"/>
-            <w:tcBorders>
-              <w:top w:val="single" w:sz="6" w:space="0" w:color="DDDDDD"/>
-              <w:left w:val="single" w:sz="6" w:space="0" w:color="DDDDDD"/>
-              <w:bottom w:val="single" w:sz="6" w:space="0" w:color="DDDDDD"/>
-              <w:right w:val="single" w:sz="6" w:space="0" w:color="DDDDDD"/>
-            </w:tcBorders>
-            <w:tcMar>
-              <w:top w:w="120" w:type="dxa"/>
-              <w:left w:w="120" w:type="dxa"/>
-              <w:bottom w:w="120" w:type="dxa"/>
-              <w:right w:w="120" w:type="dxa"/>
-            </w:tcMar>
-            <w:vAlign w:val="center"/>
-            <w:hideMark/>
-          </w:tcPr>
-          <w:p>
-            <w:r>
-              <w:t>Vegetative</w:t>
-            </w:r>
-          </w:p>
-        </w:tc>
-        <w:tc>
-          <w:tcPr>
-            <w:tcW w:w="0" w:type="auto"/>
-            <w:tcBorders>
-              <w:top w:val="single" w:sz="6" w:space="0" w:color="DDDDDD"/>
-              <w:left w:val="single" w:sz="6" w:space="0" w:color="DDDDDD"/>
-              <w:bottom w:val="single" w:sz="6" w:space="0" w:color="DDDDDD"/>
-              <w:right w:val="single" w:sz="6" w:space="0" w:color="DDDDDD"/>
-            </w:tcBorders>
-            <w:tcMar>
-              <w:top w:w="120" w:type="dxa"/>
-              <w:left w:w="120" w:type="dxa"/>
-              <w:bottom w:w="120" w:type="dxa"/>
-              <w:right w:w="120" w:type="dxa"/>
-            </w:tcMar>
-            <w:vAlign w:val="center"/>
-            <w:hideMark/>
-          </w:tcPr>
-          <w:p>
-            <w:r>
-              <w:t>0-5mm ✓</w:t>
-            </w:r>
-          </w:p>
-        </w:tc>
-      </w:tr>
-      <w:tr>
-        <w:tc>
-          <w:tcPr>
-            <w:tcW w:w="0" w:type="auto"/>
-            <w:tcBorders>
-              <w:top w:val="single" w:sz="6" w:space="0" w:color="DDDDDD"/>
-              <w:left w:val="single" w:sz="6" w:space="0" w:color="DDDDDD"/>
-              <w:bottom w:val="single" w:sz="6" w:space="0" w:color="DDDDDD"/>
-              <w:right w:val="single" w:sz="6" w:space="0" w:color="DDDDDD"/>
-            </w:tcBorders>
-            <w:tcMar>
-              <w:top w:w="120" w:type="dxa"/>
-              <w:left w:w="120" w:type="dxa"/>
-              <w:bottom w:w="120" w:type="dxa"/>
-              <w:right w:w="120" w:type="dxa"/>
-            </w:tcMar>
-            <w:vAlign w:val="center"/>
-            <w:hideMark/>
-          </w:tcPr>
-          <w:p>
-            <w:r>
-              <w:t>C</w:t>
-            </w:r>
-          </w:p>
-        </w:tc>
-        <w:tc>
-          <w:tcPr>
-            <w:tcW w:w="0" w:type="auto"/>
-            <w:tcBorders>
-              <w:top w:val="single" w:sz="6" w:space="0" w:color="DDDDDD"/>
-              <w:left w:val="single" w:sz="6" w:space="0" w:color="DDDDDD"/>
-              <w:bottom w:val="single" w:sz="6" w:space="0" w:color="DDDDDD"/>
-              <w:right w:val="single" w:sz="6" w:space="0" w:color="DDDDDD"/>
-            </w:tcBorders>
-            <w:tcMar>
-              <w:top w:w="120" w:type="dxa"/>
-              <w:left w:w="120" w:type="dxa"/>
-              <w:bottom w:w="120" w:type="dxa"/>
-              <w:right w:w="120" w:type="dxa"/>
-            </w:tcMar>
-            <w:vAlign w:val="center"/>
-            <w:hideMark/>
-          </w:tcPr>
-          <w:p>
-            <w:r>
-              <w:t>0cm</w:t>
-            </w:r>
-          </w:p>
-        </w:tc>
-        <w:tc>
-          <w:tcPr>
-            <w:tcW w:w="0" w:type="auto"/>
-            <w:tcBorders>
-              <w:top w:val="single" w:sz="6" w:space="0" w:color="DDDDDD"/>
-              <w:left w:val="single" w:sz="6" w:space="0" w:color="DDDDDD"/>
-              <w:bottom w:val="single" w:sz="6" w:space="0" w:color="DDDDDD"/>
-              <w:right w:val="single" w:sz="6" w:space="0" w:color="DDDDDD"/>
-            </w:tcBorders>
-            <w:tcMar>
-              <w:top w:w="120" w:type="dxa"/>
-              <w:left w:w="120" w:type="dxa"/>
-              <w:bottom w:w="120" w:type="dxa"/>
-              <w:right w:w="120" w:type="dxa"/>
-            </w:tcMar>
-            <w:vAlign w:val="center"/>
-            <w:hideMark/>
-          </w:tcPr>
-          <w:p>
-            <w:r>
-              <w:t>65%</w:t>
-            </w:r>
-          </w:p>
-        </w:tc>
-        <w:tc>
-          <w:tcPr>
-            <w:tcW w:w="0" w:type="auto"/>
-            <w:tcBorders>
-              <w:top w:val="single" w:sz="6" w:space="0" w:color="DDDDDD"/>
-              <w:left w:val="single" w:sz="6" w:space="0" w:color="DDDDDD"/>
-              <w:bottom w:val="single" w:sz="6" w:space="0" w:color="DDDDDD"/>
-              <w:right w:val="single" w:sz="6" w:space="0" w:color="DDDDDD"/>
-            </w:tcBorders>
-            <w:tcMar>
-              <w:top w:w="120" w:type="dxa"/>
-              <w:left w:w="120" w:type="dxa"/>
-              <w:bottom w:w="120" w:type="dxa"/>
-              <w:right w:w="120" w:type="dxa"/>
-            </w:tcMar>
-            <w:vAlign w:val="center"/>
-            <w:hideMark/>
-          </w:tcPr>
-          <w:p>
-            <w:r>
-              <w:t>8mm</w:t>
-            </w:r>
-          </w:p>
-        </w:tc>
-        <w:tc>
-          <w:tcPr>
-            <w:tcW w:w="0" w:type="auto"/>
-            <w:tcBorders>
-              <w:top w:val="single" w:sz="6" w:space="0" w:color="DDDDDD"/>
-              <w:left w:val="single" w:sz="6" w:space="0" w:color="DDDDDD"/>
-              <w:bottom w:val="single" w:sz="6" w:space="0" w:color="DDDDDD"/>
-              <w:right w:val="single" w:sz="6" w:space="0" w:color="DDDDDD"/>
-            </w:tcBorders>
-            <w:tcMar>
-              <w:top w:w="120" w:type="dxa"/>
-              <w:left w:w="120" w:type="dxa"/>
-              <w:bottom w:w="120" w:type="dxa"/>
-              <w:right w:w="120" w:type="dxa"/>
-            </w:tcMar>
-            <w:vAlign w:val="center"/>
-            <w:hideMark/>
-          </w:tcPr>
-          <w:p>
-            <w:r>
-              <w:t>0mm</w:t>
-            </w:r>
-          </w:p>
-        </w:tc>
-        <w:tc>
-          <w:tcPr>
-            <w:tcW w:w="0" w:type="auto"/>
-            <w:tcBorders>
-              <w:top w:val="single" w:sz="6" w:space="0" w:color="DDDDDD"/>
-              <w:left w:val="single" w:sz="6" w:space="0" w:color="DDDDDD"/>
-              <w:bottom w:val="single" w:sz="6" w:space="0" w:color="DDDDDD"/>
-              <w:right w:val="single" w:sz="6" w:space="0" w:color="DDDDDD"/>
-            </w:tcBorders>
-            <w:tcMar>
-              <w:top w:w="120" w:type="dxa"/>
-              <w:left w:w="120" w:type="dxa"/>
-              <w:bottom w:w="120" w:type="dxa"/>
-              <w:right w:w="120" w:type="dxa"/>
-            </w:tcMar>
-            <w:vAlign w:val="center"/>
-            <w:hideMark/>
-          </w:tcPr>
-          <w:p>
-            <w:r>
-              <w:t>Ripening</w:t>
-            </w:r>
-          </w:p>
-        </w:tc>
-        <w:tc>
-          <w:tcPr>
-            <w:tcW w:w="0" w:type="auto"/>
-            <w:tcBorders>
-              <w:top w:val="single" w:sz="6" w:space="0" w:color="DDDDDD"/>
-              <w:left w:val="single" w:sz="6" w:space="0" w:color="DDDDDD"/>
-              <w:bottom w:val="single" w:sz="6" w:space="0" w:color="DDDDDD"/>
-              <w:right w:val="single" w:sz="6" w:space="0" w:color="DDDDDD"/>
-            </w:tcBorders>
-            <w:tcMar>
-              <w:top w:w="120" w:type="dxa"/>
-              <w:left w:w="120" w:type="dxa"/>
-              <w:bottom w:w="120" w:type="dxa"/>
-              <w:right w:w="120" w:type="dxa"/>
-            </w:tcMar>
-            <w:vAlign w:val="center"/>
-            <w:hideMark/>
-          </w:tcPr>
-          <w:p>
-            <w:r>
-              <w:t>15-20mm ✓</w:t>
-            </w:r>
-          </w:p>
-        </w:tc>
-      </w:tr>
-    </w:tbl>
-    <w:p/>
-    <w:p>
-      <w:r>
-        <w:rPr>
-          <w:b/>
-          <w:bCs/>
-        </w:rPr>
-        <w:t>Assessment:</w:t>
-      </w:r>
-      <w:r>
-        <w:t> These calculations are reasonable and realistic for Sri Lankan conditions.</w:t>
-      </w:r>
-    </w:p>
-    <w:p>
-      <w:r>
-        <w:rPr>
-          <w:b/>
-          <w:bCs/>
-        </w:rPr>
-        <w:t>Q30 (System effectiveness rating):</w:t>
+        <w:t>Section 8: Expert Opinion &amp; System Feedback</w:t>
+      </w:r>
+    </w:p>
+    <w:p>
+      <w:r>
+        <w:rPr>
+          <w:b/>
+          <w:bCs/>
+        </w:rPr>
+        <w:t>Q</w:t>
+      </w:r>
+      <w:r>
+        <w:rPr>
+          <w:b/>
+          <w:bCs/>
+        </w:rPr>
+        <w:t>29</w:t>
+      </w:r>
+      <w:r>
+        <w:rPr>
+          <w:b/>
+          <w:bCs/>
+        </w:rPr>
+        <w:t xml:space="preserve"> (System effectiveness rating):</w:t>
       </w:r>
       <w:r>
         <w:t> </w:t>
@@ -5429,6 +3763,155 @@
     </w:lvl>
   </w:abstractNum>
   <w:abstractNum w:abstractNumId="16" w15:restartNumberingAfterBreak="0">
+    <w:nsid w:val="31930561"/>
+    <w:multiLevelType w:val="multilevel"/>
+    <w:tmpl w:val="134A4232"/>
+    <w:lvl w:ilvl="0">
+      <w:start w:val="1"/>
+      <w:numFmt w:val="bullet"/>
+      <w:lvlText w:val=""/>
+      <w:lvlJc w:val="left"/>
+      <w:pPr>
+        <w:tabs>
+          <w:tab w:val="num" w:pos="1440"/>
+        </w:tabs>
+        <w:ind w:left="1440" w:hanging="360"/>
+      </w:pPr>
+      <w:rPr>
+        <w:rFonts w:ascii="Symbol" w:hAnsi="Symbol" w:hint="default"/>
+        <w:sz w:val="20"/>
+      </w:rPr>
+    </w:lvl>
+    <w:lvl w:ilvl="1" w:tentative="1">
+      <w:start w:val="1"/>
+      <w:numFmt w:val="bullet"/>
+      <w:lvlText w:val=""/>
+      <w:lvlJc w:val="left"/>
+      <w:pPr>
+        <w:tabs>
+          <w:tab w:val="num" w:pos="2160"/>
+        </w:tabs>
+        <w:ind w:left="2160" w:hanging="360"/>
+      </w:pPr>
+      <w:rPr>
+        <w:rFonts w:ascii="Symbol" w:hAnsi="Symbol" w:hint="default"/>
+        <w:sz w:val="20"/>
+      </w:rPr>
+    </w:lvl>
+    <w:lvl w:ilvl="2" w:tentative="1">
+      <w:start w:val="1"/>
+      <w:numFmt w:val="bullet"/>
+      <w:lvlText w:val=""/>
+      <w:lvlJc w:val="left"/>
+      <w:pPr>
+        <w:tabs>
+          <w:tab w:val="num" w:pos="2880"/>
+        </w:tabs>
+        <w:ind w:left="2880" w:hanging="360"/>
+      </w:pPr>
+      <w:rPr>
+        <w:rFonts w:ascii="Symbol" w:hAnsi="Symbol" w:hint="default"/>
+        <w:sz w:val="20"/>
+      </w:rPr>
+    </w:lvl>
+    <w:lvl w:ilvl="3" w:tentative="1">
+      <w:start w:val="1"/>
+      <w:numFmt w:val="bullet"/>
+      <w:lvlText w:val=""/>
+      <w:lvlJc w:val="left"/>
+      <w:pPr>
+        <w:tabs>
+          <w:tab w:val="num" w:pos="3600"/>
+        </w:tabs>
+        <w:ind w:left="3600" w:hanging="360"/>
+      </w:pPr>
+      <w:rPr>
+        <w:rFonts w:ascii="Symbol" w:hAnsi="Symbol" w:hint="default"/>
+        <w:sz w:val="20"/>
+      </w:rPr>
+    </w:lvl>
+    <w:lvl w:ilvl="4" w:tentative="1">
+      <w:start w:val="1"/>
+      <w:numFmt w:val="bullet"/>
+      <w:lvlText w:val=""/>
+      <w:lvlJc w:val="left"/>
+      <w:pPr>
+        <w:tabs>
+          <w:tab w:val="num" w:pos="4320"/>
+        </w:tabs>
+        <w:ind w:left="4320" w:hanging="360"/>
+      </w:pPr>
+      <w:rPr>
+        <w:rFonts w:ascii="Symbol" w:hAnsi="Symbol" w:hint="default"/>
+        <w:sz w:val="20"/>
+      </w:rPr>
+    </w:lvl>
+    <w:lvl w:ilvl="5" w:tentative="1">
+      <w:start w:val="1"/>
+      <w:numFmt w:val="bullet"/>
+      <w:lvlText w:val=""/>
+      <w:lvlJc w:val="left"/>
+      <w:pPr>
+        <w:tabs>
+          <w:tab w:val="num" w:pos="5040"/>
+        </w:tabs>
+        <w:ind w:left="5040" w:hanging="360"/>
+      </w:pPr>
+      <w:rPr>
+        <w:rFonts w:ascii="Symbol" w:hAnsi="Symbol" w:hint="default"/>
+        <w:sz w:val="20"/>
+      </w:rPr>
+    </w:lvl>
+    <w:lvl w:ilvl="6" w:tentative="1">
+      <w:start w:val="1"/>
+      <w:numFmt w:val="bullet"/>
+      <w:lvlText w:val=""/>
+      <w:lvlJc w:val="left"/>
+      <w:pPr>
+        <w:tabs>
+          <w:tab w:val="num" w:pos="5760"/>
+        </w:tabs>
+        <w:ind w:left="5760" w:hanging="360"/>
+      </w:pPr>
+      <w:rPr>
+        <w:rFonts w:ascii="Symbol" w:hAnsi="Symbol" w:hint="default"/>
+        <w:sz w:val="20"/>
+      </w:rPr>
+    </w:lvl>
+    <w:lvl w:ilvl="7" w:tentative="1">
+      <w:start w:val="1"/>
+      <w:numFmt w:val="bullet"/>
+      <w:lvlText w:val=""/>
+      <w:lvlJc w:val="left"/>
+      <w:pPr>
+        <w:tabs>
+          <w:tab w:val="num" w:pos="6480"/>
+        </w:tabs>
+        <w:ind w:left="6480" w:hanging="360"/>
+      </w:pPr>
+      <w:rPr>
+        <w:rFonts w:ascii="Symbol" w:hAnsi="Symbol" w:hint="default"/>
+        <w:sz w:val="20"/>
+      </w:rPr>
+    </w:lvl>
+    <w:lvl w:ilvl="8" w:tentative="1">
+      <w:start w:val="1"/>
+      <w:numFmt w:val="bullet"/>
+      <w:lvlText w:val=""/>
+      <w:lvlJc w:val="left"/>
+      <w:pPr>
+        <w:tabs>
+          <w:tab w:val="num" w:pos="7200"/>
+        </w:tabs>
+        <w:ind w:left="7200" w:hanging="360"/>
+      </w:pPr>
+      <w:rPr>
+        <w:rFonts w:ascii="Symbol" w:hAnsi="Symbol" w:hint="default"/>
+        <w:sz w:val="20"/>
+      </w:rPr>
+    </w:lvl>
+  </w:abstractNum>
+  <w:abstractNum w:abstractNumId="17" w15:restartNumberingAfterBreak="0">
     <w:nsid w:val="371F4D87"/>
     <w:multiLevelType w:val="multilevel"/>
     <w:tmpl w:val="F710EA62"/>
@@ -5541,7 +4024,7 @@
       </w:pPr>
     </w:lvl>
   </w:abstractNum>
-  <w:abstractNum w:abstractNumId="17" w15:restartNumberingAfterBreak="0">
+  <w:abstractNum w:abstractNumId="18" w15:restartNumberingAfterBreak="0">
     <w:nsid w:val="38246EE2"/>
     <w:multiLevelType w:val="multilevel"/>
     <w:tmpl w:val="4B30C298"/>
@@ -5654,7 +4137,7 @@
       </w:pPr>
     </w:lvl>
   </w:abstractNum>
-  <w:abstractNum w:abstractNumId="18" w15:restartNumberingAfterBreak="0">
+  <w:abstractNum w:abstractNumId="19" w15:restartNumberingAfterBreak="0">
     <w:nsid w:val="46683BDD"/>
     <w:multiLevelType w:val="multilevel"/>
     <w:tmpl w:val="8C9E35CE"/>
@@ -5767,7 +4250,7 @@
       </w:pPr>
     </w:lvl>
   </w:abstractNum>
-  <w:abstractNum w:abstractNumId="19" w15:restartNumberingAfterBreak="0">
+  <w:abstractNum w:abstractNumId="20" w15:restartNumberingAfterBreak="0">
     <w:nsid w:val="46D64AED"/>
     <w:multiLevelType w:val="hybridMultilevel"/>
     <w:tmpl w:val="3FF05DEA"/>
@@ -5880,7 +4363,7 @@
       </w:rPr>
     </w:lvl>
   </w:abstractNum>
-  <w:abstractNum w:abstractNumId="20" w15:restartNumberingAfterBreak="0">
+  <w:abstractNum w:abstractNumId="21" w15:restartNumberingAfterBreak="0">
     <w:nsid w:val="480109A6"/>
     <w:multiLevelType w:val="multilevel"/>
     <w:tmpl w:val="A672DAC4"/>
@@ -5993,7 +4476,7 @@
       </w:pPr>
     </w:lvl>
   </w:abstractNum>
-  <w:abstractNum w:abstractNumId="21" w15:restartNumberingAfterBreak="0">
+  <w:abstractNum w:abstractNumId="22" w15:restartNumberingAfterBreak="0">
     <w:nsid w:val="48CA2D9A"/>
     <w:multiLevelType w:val="multilevel"/>
     <w:tmpl w:val="5CA468F0"/>
@@ -6106,7 +4589,7 @@
       </w:pPr>
     </w:lvl>
   </w:abstractNum>
-  <w:abstractNum w:abstractNumId="22" w15:restartNumberingAfterBreak="0">
+  <w:abstractNum w:abstractNumId="23" w15:restartNumberingAfterBreak="0">
     <w:nsid w:val="4DFF00F7"/>
     <w:multiLevelType w:val="multilevel"/>
     <w:tmpl w:val="7FCC4E66"/>
@@ -6223,7 +4706,7 @@
       </w:pPr>
     </w:lvl>
   </w:abstractNum>
-  <w:abstractNum w:abstractNumId="23" w15:restartNumberingAfterBreak="0">
+  <w:abstractNum w:abstractNumId="24" w15:restartNumberingAfterBreak="0">
     <w:nsid w:val="518772EC"/>
     <w:multiLevelType w:val="multilevel"/>
     <w:tmpl w:val="44CE0F0E"/>
@@ -6336,7 +4819,7 @@
       </w:pPr>
     </w:lvl>
   </w:abstractNum>
-  <w:abstractNum w:abstractNumId="24" w15:restartNumberingAfterBreak="0">
+  <w:abstractNum w:abstractNumId="25" w15:restartNumberingAfterBreak="0">
     <w:nsid w:val="54047806"/>
     <w:multiLevelType w:val="multilevel"/>
     <w:tmpl w:val="A920B604"/>
@@ -6449,7 +4932,7 @@
       </w:pPr>
     </w:lvl>
   </w:abstractNum>
-  <w:abstractNum w:abstractNumId="25" w15:restartNumberingAfterBreak="0">
+  <w:abstractNum w:abstractNumId="26" w15:restartNumberingAfterBreak="0">
     <w:nsid w:val="54811ACF"/>
     <w:multiLevelType w:val="multilevel"/>
     <w:tmpl w:val="3D2C495C"/>
@@ -6562,7 +5045,7 @@
       </w:pPr>
     </w:lvl>
   </w:abstractNum>
-  <w:abstractNum w:abstractNumId="26" w15:restartNumberingAfterBreak="0">
+  <w:abstractNum w:abstractNumId="27" w15:restartNumberingAfterBreak="0">
     <w:nsid w:val="566F35C7"/>
     <w:multiLevelType w:val="multilevel"/>
     <w:tmpl w:val="7D82720E"/>
@@ -6675,7 +5158,7 @@
       </w:pPr>
     </w:lvl>
   </w:abstractNum>
-  <w:abstractNum w:abstractNumId="27" w15:restartNumberingAfterBreak="0">
+  <w:abstractNum w:abstractNumId="28" w15:restartNumberingAfterBreak="0">
     <w:nsid w:val="58E05045"/>
     <w:multiLevelType w:val="multilevel"/>
     <w:tmpl w:val="406020FA"/>
@@ -6788,7 +5271,7 @@
       </w:pPr>
     </w:lvl>
   </w:abstractNum>
-  <w:abstractNum w:abstractNumId="28" w15:restartNumberingAfterBreak="0">
+  <w:abstractNum w:abstractNumId="29" w15:restartNumberingAfterBreak="0">
     <w:nsid w:val="5B3F5280"/>
     <w:multiLevelType w:val="multilevel"/>
     <w:tmpl w:val="7A323152"/>
@@ -6901,7 +5384,7 @@
       </w:pPr>
     </w:lvl>
   </w:abstractNum>
-  <w:abstractNum w:abstractNumId="29" w15:restartNumberingAfterBreak="0">
+  <w:abstractNum w:abstractNumId="30" w15:restartNumberingAfterBreak="0">
     <w:nsid w:val="5C184910"/>
     <w:multiLevelType w:val="multilevel"/>
     <w:tmpl w:val="7FCC4E66"/>
@@ -7050,7 +5533,7 @@
       </w:rPr>
     </w:lvl>
   </w:abstractNum>
-  <w:abstractNum w:abstractNumId="30" w15:restartNumberingAfterBreak="0">
+  <w:abstractNum w:abstractNumId="31" w15:restartNumberingAfterBreak="0">
     <w:nsid w:val="5F2607EA"/>
     <w:multiLevelType w:val="multilevel"/>
     <w:tmpl w:val="A5227854"/>
@@ -7163,7 +5646,7 @@
       </w:pPr>
     </w:lvl>
   </w:abstractNum>
-  <w:abstractNum w:abstractNumId="31" w15:restartNumberingAfterBreak="0">
+  <w:abstractNum w:abstractNumId="32" w15:restartNumberingAfterBreak="0">
     <w:nsid w:val="65857AB9"/>
     <w:multiLevelType w:val="multilevel"/>
     <w:tmpl w:val="D0C0115C"/>
@@ -7276,7 +5759,7 @@
       </w:pPr>
     </w:lvl>
   </w:abstractNum>
-  <w:abstractNum w:abstractNumId="32" w15:restartNumberingAfterBreak="0">
+  <w:abstractNum w:abstractNumId="33" w15:restartNumberingAfterBreak="0">
     <w:nsid w:val="67334EC9"/>
     <w:multiLevelType w:val="multilevel"/>
     <w:tmpl w:val="8EC2219E"/>
@@ -7389,7 +5872,7 @@
       </w:pPr>
     </w:lvl>
   </w:abstractNum>
-  <w:abstractNum w:abstractNumId="33" w15:restartNumberingAfterBreak="0">
+  <w:abstractNum w:abstractNumId="34" w15:restartNumberingAfterBreak="0">
     <w:nsid w:val="687B7EE3"/>
     <w:multiLevelType w:val="multilevel"/>
     <w:tmpl w:val="56D45ABA"/>
@@ -7506,7 +5989,7 @@
       </w:pPr>
     </w:lvl>
   </w:abstractNum>
-  <w:abstractNum w:abstractNumId="34" w15:restartNumberingAfterBreak="0">
+  <w:abstractNum w:abstractNumId="35" w15:restartNumberingAfterBreak="0">
     <w:nsid w:val="6E4F2BC0"/>
     <w:multiLevelType w:val="multilevel"/>
     <w:tmpl w:val="3E44490A"/>
@@ -7655,7 +6138,7 @@
       </w:rPr>
     </w:lvl>
   </w:abstractNum>
-  <w:abstractNum w:abstractNumId="35" w15:restartNumberingAfterBreak="0">
+  <w:abstractNum w:abstractNumId="36" w15:restartNumberingAfterBreak="0">
     <w:nsid w:val="71883FD9"/>
     <w:multiLevelType w:val="multilevel"/>
     <w:tmpl w:val="48823782"/>
@@ -7804,7 +6287,7 @@
       </w:rPr>
     </w:lvl>
   </w:abstractNum>
-  <w:abstractNum w:abstractNumId="36" w15:restartNumberingAfterBreak="0">
+  <w:abstractNum w:abstractNumId="37" w15:restartNumberingAfterBreak="0">
     <w:nsid w:val="737476F9"/>
     <w:multiLevelType w:val="multilevel"/>
     <w:tmpl w:val="0F8A7D72"/>
@@ -7953,7 +6436,7 @@
       </w:rPr>
     </w:lvl>
   </w:abstractNum>
-  <w:abstractNum w:abstractNumId="37" w15:restartNumberingAfterBreak="0">
+  <w:abstractNum w:abstractNumId="38" w15:restartNumberingAfterBreak="0">
     <w:nsid w:val="74275769"/>
     <w:multiLevelType w:val="multilevel"/>
     <w:tmpl w:val="2F6A8366"/>
@@ -8066,7 +6549,7 @@
       </w:pPr>
     </w:lvl>
   </w:abstractNum>
-  <w:abstractNum w:abstractNumId="38" w15:restartNumberingAfterBreak="0">
+  <w:abstractNum w:abstractNumId="39" w15:restartNumberingAfterBreak="0">
     <w:nsid w:val="754227C3"/>
     <w:multiLevelType w:val="multilevel"/>
     <w:tmpl w:val="3E00FCDA"/>
@@ -8179,7 +6662,7 @@
       </w:pPr>
     </w:lvl>
   </w:abstractNum>
-  <w:abstractNum w:abstractNumId="39" w15:restartNumberingAfterBreak="0">
+  <w:abstractNum w:abstractNumId="40" w15:restartNumberingAfterBreak="0">
     <w:nsid w:val="7E4743EE"/>
     <w:multiLevelType w:val="multilevel"/>
     <w:tmpl w:val="89029D58"/>
@@ -8329,13 +6812,13 @@
     </w:lvl>
   </w:abstractNum>
   <w:num w:numId="1" w16cid:durableId="304745820">
-    <w:abstractNumId w:val="20"/>
+    <w:abstractNumId w:val="21"/>
   </w:num>
   <w:num w:numId="2" w16cid:durableId="1865827512">
-    <w:abstractNumId w:val="38"/>
+    <w:abstractNumId w:val="39"/>
   </w:num>
   <w:num w:numId="3" w16cid:durableId="367729933">
-    <w:abstractNumId w:val="24"/>
+    <w:abstractNumId w:val="25"/>
   </w:num>
   <w:num w:numId="4" w16cid:durableId="93786539">
     <w:abstractNumId w:val="13"/>
@@ -8344,22 +6827,22 @@
     <w:abstractNumId w:val="15"/>
   </w:num>
   <w:num w:numId="6" w16cid:durableId="768234242">
-    <w:abstractNumId w:val="37"/>
+    <w:abstractNumId w:val="38"/>
   </w:num>
   <w:num w:numId="7" w16cid:durableId="1567569997">
-    <w:abstractNumId w:val="30"/>
+    <w:abstractNumId w:val="31"/>
   </w:num>
   <w:num w:numId="8" w16cid:durableId="1845778941">
     <w:abstractNumId w:val="10"/>
   </w:num>
   <w:num w:numId="9" w16cid:durableId="971518908">
-    <w:abstractNumId w:val="18"/>
+    <w:abstractNumId w:val="19"/>
   </w:num>
   <w:num w:numId="10" w16cid:durableId="745803538">
-    <w:abstractNumId w:val="27"/>
+    <w:abstractNumId w:val="28"/>
   </w:num>
   <w:num w:numId="11" w16cid:durableId="1667130054">
-    <w:abstractNumId w:val="17"/>
+    <w:abstractNumId w:val="18"/>
   </w:num>
   <w:num w:numId="12" w16cid:durableId="1404377431">
     <w:abstractNumId w:val="4"/>
@@ -8368,16 +6851,16 @@
     <w:abstractNumId w:val="1"/>
   </w:num>
   <w:num w:numId="14" w16cid:durableId="212430287">
-    <w:abstractNumId w:val="21"/>
+    <w:abstractNumId w:val="22"/>
   </w:num>
   <w:num w:numId="15" w16cid:durableId="345790991">
-    <w:abstractNumId w:val="33"/>
+    <w:abstractNumId w:val="34"/>
   </w:num>
   <w:num w:numId="16" w16cid:durableId="1854683628">
-    <w:abstractNumId w:val="23"/>
+    <w:abstractNumId w:val="24"/>
   </w:num>
   <w:num w:numId="17" w16cid:durableId="2041124838">
-    <w:abstractNumId w:val="22"/>
+    <w:abstractNumId w:val="23"/>
   </w:num>
   <w:num w:numId="18" w16cid:durableId="554707417">
     <w:abstractNumId w:val="3"/>
@@ -8386,25 +6869,25 @@
     <w:abstractNumId w:val="9"/>
   </w:num>
   <w:num w:numId="20" w16cid:durableId="639309332">
-    <w:abstractNumId w:val="31"/>
+    <w:abstractNumId w:val="32"/>
   </w:num>
   <w:num w:numId="21" w16cid:durableId="2061320164">
     <w:abstractNumId w:val="14"/>
   </w:num>
   <w:num w:numId="22" w16cid:durableId="1864316892">
-    <w:abstractNumId w:val="26"/>
+    <w:abstractNumId w:val="27"/>
   </w:num>
   <w:num w:numId="23" w16cid:durableId="518667945">
-    <w:abstractNumId w:val="16"/>
+    <w:abstractNumId w:val="17"/>
   </w:num>
   <w:num w:numId="24" w16cid:durableId="449668364">
     <w:abstractNumId w:val="5"/>
   </w:num>
   <w:num w:numId="25" w16cid:durableId="939799134">
-    <w:abstractNumId w:val="28"/>
+    <w:abstractNumId w:val="29"/>
   </w:num>
   <w:num w:numId="26" w16cid:durableId="1909462324">
-    <w:abstractNumId w:val="36"/>
+    <w:abstractNumId w:val="37"/>
   </w:num>
   <w:num w:numId="27" w16cid:durableId="1907758480">
     <w:abstractNumId w:val="8"/>
@@ -8413,19 +6896,19 @@
     <w:abstractNumId w:val="11"/>
   </w:num>
   <w:num w:numId="29" w16cid:durableId="436410095">
-    <w:abstractNumId w:val="29"/>
+    <w:abstractNumId w:val="30"/>
   </w:num>
   <w:num w:numId="30" w16cid:durableId="1397314743">
-    <w:abstractNumId w:val="25"/>
+    <w:abstractNumId w:val="26"/>
   </w:num>
   <w:num w:numId="31" w16cid:durableId="2116175118">
-    <w:abstractNumId w:val="32"/>
+    <w:abstractNumId w:val="33"/>
   </w:num>
   <w:num w:numId="32" w16cid:durableId="955134939">
     <w:abstractNumId w:val="2"/>
   </w:num>
   <w:num w:numId="33" w16cid:durableId="1069494930">
-    <w:abstractNumId w:val="19"/>
+    <w:abstractNumId w:val="20"/>
   </w:num>
   <w:num w:numId="34" w16cid:durableId="1376807491">
     <w:abstractNumId w:val="12"/>
@@ -8437,16 +6920,19 @@
     <w:abstractNumId w:val="0"/>
   </w:num>
   <w:num w:numId="37" w16cid:durableId="1649086898">
-    <w:abstractNumId w:val="35"/>
+    <w:abstractNumId w:val="36"/>
   </w:num>
   <w:num w:numId="38" w16cid:durableId="1791777427">
     <w:abstractNumId w:val="6"/>
   </w:num>
   <w:num w:numId="39" w16cid:durableId="1542472203">
-    <w:abstractNumId w:val="39"/>
+    <w:abstractNumId w:val="40"/>
   </w:num>
   <w:num w:numId="40" w16cid:durableId="704790420">
-    <w:abstractNumId w:val="34"/>
+    <w:abstractNumId w:val="35"/>
+  </w:num>
+  <w:num w:numId="41" w16cid:durableId="123037466">
+    <w:abstractNumId w:val="16"/>
   </w:num>
 </w:numbering>
 </file>
@@ -9059,7 +7545,6 @@
   <w:style w:type="character" w:default="1" w:styleId="DefaultParagraphFont">
     <w:name w:val="Default Paragraph Font"/>
     <w:uiPriority w:val="1"/>
-    <w:semiHidden/>
     <w:unhideWhenUsed/>
   </w:style>
   <w:style w:type="table" w:default="1" w:styleId="TableNormal">

</xml_diff>